<commit_message>
docs: finalize report with exact reference visual template, color system, callouts and 52 sections
</commit_message>
<xml_diff>
--- a/TERRA_AI_PROJECT_REPORT.docx
+++ b/TERRA_AI_PROJECT_REPORT.docx
@@ -4,14 +4,14 @@
   <w:body>
     <w:p>
       <w:pPr>
-        <w:spacing w:before="1600" w:after="240"/>
+        <w:spacing w:before="1200" w:after="240"/>
       </w:pPr>
       <w:r>
         <w:rPr>
-          <w:rFonts w:ascii="Arial" w:hAnsi="Arial"/>
+          <w:rFonts w:ascii="Times New Roman" w:hAnsi="Times New Roman"/>
           <w:b/>
-          <w:color w:val="0F172A"/>
-          <w:sz w:val="44"/>
+          <w:color w:val="0A2540"/>
+          <w:sz w:val="42"/>
         </w:rPr>
         <w:t>CONSTRUCTION SITE VIABILITY AND</w:t>
         <w:br/>
@@ -20,22 +20,22 @@
     </w:p>
     <w:p>
       <w:pPr>
-        <w:spacing w:after="3200"/>
+        <w:spacing w:after="2800"/>
       </w:pPr>
       <w:r>
         <w:rPr>
           <w:color w:val="334155"/>
-          <w:sz w:val="24"/>
+          <w:sz w:val="23"/>
         </w:rPr>
-        <w:t>An Automated Geospatial Machine Learning Platform for Foundation Engineering, Hazard Risk Assessment, and Environmental Impact Evaluation</w:t>
+        <w:t>A Multi-Source Geospatial Machine Learning Platform for Foundation Engineering, Hazard Risk Assessment, and Environmental Impact Evaluation</w:t>
       </w:r>
     </w:p>
     <w:p>
       <w:r>
         <w:rPr>
           <w:b/>
-          <w:color w:val="0F172A"/>
-          <w:sz w:val="24"/>
+          <w:color w:val="0A2540"/>
+          <w:sz w:val="23"/>
         </w:rPr>
         <w:t>Project Details</w:t>
         <w:br/>
@@ -68,7 +68,7 @@
     <w:p>
       <w:pPr>
         <w:pStyle w:val="Heading1"/>
-        <w:spacing w:after="240"/>
+        <w:spacing w:after="200"/>
       </w:pPr>
       <w:r>
         <w:t>Contents</w:t>
@@ -89,17 +89,12 @@
         <w:tc>
           <w:tcPr>
             <w:tcW w:type="dxa" w:w="3120"/>
-            <w:tcMar>
-              <w:top w:w="25" w:type="dxa"/>
-              <w:bottom w:w="25" w:type="dxa"/>
-              <w:left w:w="40" w:type="dxa"/>
-              <w:right w:w="40" w:type="dxa"/>
-            </w:tcMar>
           </w:tcPr>
           <w:p>
             <w:r>
               <w:rPr>
                 <w:b/>
+                <w:color w:val="0A2540"/>
               </w:rPr>
               <w:t>1</w:t>
             </w:r>
@@ -108,12 +103,6 @@
         <w:tc>
           <w:tcPr>
             <w:tcW w:type="dxa" w:w="3120"/>
-            <w:tcMar>
-              <w:top w:w="25" w:type="dxa"/>
-              <w:bottom w:w="25" w:type="dxa"/>
-              <w:left w:w="40" w:type="dxa"/>
-              <w:right w:w="40" w:type="dxa"/>
-            </w:tcMar>
           </w:tcPr>
           <w:p>
             <w:r>
@@ -124,12 +113,6 @@
         <w:tc>
           <w:tcPr>
             <w:tcW w:type="dxa" w:w="3120"/>
-            <w:tcMar>
-              <w:top w:w="25" w:type="dxa"/>
-              <w:bottom w:w="25" w:type="dxa"/>
-              <w:left w:w="40" w:type="dxa"/>
-              <w:right w:w="40" w:type="dxa"/>
-            </w:tcMar>
           </w:tcPr>
           <w:p>
             <w:pPr>
@@ -145,17 +128,12 @@
         <w:tc>
           <w:tcPr>
             <w:tcW w:type="dxa" w:w="3120"/>
-            <w:tcMar>
-              <w:top w:w="25" w:type="dxa"/>
-              <w:bottom w:w="25" w:type="dxa"/>
-              <w:left w:w="40" w:type="dxa"/>
-              <w:right w:w="40" w:type="dxa"/>
-            </w:tcMar>
           </w:tcPr>
           <w:p>
             <w:r>
               <w:rPr>
                 <w:b/>
+                <w:color w:val="0A2540"/>
               </w:rPr>
               <w:t>2</w:t>
             </w:r>
@@ -164,12 +142,6 @@
         <w:tc>
           <w:tcPr>
             <w:tcW w:type="dxa" w:w="3120"/>
-            <w:tcMar>
-              <w:top w:w="25" w:type="dxa"/>
-              <w:bottom w:w="25" w:type="dxa"/>
-              <w:left w:w="40" w:type="dxa"/>
-              <w:right w:w="40" w:type="dxa"/>
-            </w:tcMar>
           </w:tcPr>
           <w:p>
             <w:r>
@@ -180,12 +152,6 @@
         <w:tc>
           <w:tcPr>
             <w:tcW w:type="dxa" w:w="3120"/>
-            <w:tcMar>
-              <w:top w:w="25" w:type="dxa"/>
-              <w:bottom w:w="25" w:type="dxa"/>
-              <w:left w:w="40" w:type="dxa"/>
-              <w:right w:w="40" w:type="dxa"/>
-            </w:tcMar>
           </w:tcPr>
           <w:p>
             <w:pPr>
@@ -201,17 +167,12 @@
         <w:tc>
           <w:tcPr>
             <w:tcW w:type="dxa" w:w="3120"/>
-            <w:tcMar>
-              <w:top w:w="25" w:type="dxa"/>
-              <w:bottom w:w="25" w:type="dxa"/>
-              <w:left w:w="40" w:type="dxa"/>
-              <w:right w:w="40" w:type="dxa"/>
-            </w:tcMar>
           </w:tcPr>
           <w:p>
             <w:r>
               <w:rPr>
                 <w:b/>
+                <w:color w:val="0A2540"/>
               </w:rPr>
               <w:t>3</w:t>
             </w:r>
@@ -220,12 +181,6 @@
         <w:tc>
           <w:tcPr>
             <w:tcW w:type="dxa" w:w="3120"/>
-            <w:tcMar>
-              <w:top w:w="25" w:type="dxa"/>
-              <w:bottom w:w="25" w:type="dxa"/>
-              <w:left w:w="40" w:type="dxa"/>
-              <w:right w:w="40" w:type="dxa"/>
-            </w:tcMar>
           </w:tcPr>
           <w:p>
             <w:r>
@@ -236,12 +191,6 @@
         <w:tc>
           <w:tcPr>
             <w:tcW w:type="dxa" w:w="3120"/>
-            <w:tcMar>
-              <w:top w:w="25" w:type="dxa"/>
-              <w:bottom w:w="25" w:type="dxa"/>
-              <w:left w:w="40" w:type="dxa"/>
-              <w:right w:w="40" w:type="dxa"/>
-            </w:tcMar>
           </w:tcPr>
           <w:p>
             <w:pPr>
@@ -257,17 +206,12 @@
         <w:tc>
           <w:tcPr>
             <w:tcW w:type="dxa" w:w="3120"/>
-            <w:tcMar>
-              <w:top w:w="25" w:type="dxa"/>
-              <w:bottom w:w="25" w:type="dxa"/>
-              <w:left w:w="40" w:type="dxa"/>
-              <w:right w:w="40" w:type="dxa"/>
-            </w:tcMar>
           </w:tcPr>
           <w:p>
             <w:r>
               <w:rPr>
                 <w:b/>
+                <w:color w:val="0A2540"/>
               </w:rPr>
               <w:t>4</w:t>
             </w:r>
@@ -276,12 +220,6 @@
         <w:tc>
           <w:tcPr>
             <w:tcW w:type="dxa" w:w="3120"/>
-            <w:tcMar>
-              <w:top w:w="25" w:type="dxa"/>
-              <w:bottom w:w="25" w:type="dxa"/>
-              <w:left w:w="40" w:type="dxa"/>
-              <w:right w:w="40" w:type="dxa"/>
-            </w:tcMar>
           </w:tcPr>
           <w:p>
             <w:r>
@@ -292,12 +230,6 @@
         <w:tc>
           <w:tcPr>
             <w:tcW w:type="dxa" w:w="3120"/>
-            <w:tcMar>
-              <w:top w:w="25" w:type="dxa"/>
-              <w:bottom w:w="25" w:type="dxa"/>
-              <w:left w:w="40" w:type="dxa"/>
-              <w:right w:w="40" w:type="dxa"/>
-            </w:tcMar>
           </w:tcPr>
           <w:p>
             <w:pPr>
@@ -313,17 +245,12 @@
         <w:tc>
           <w:tcPr>
             <w:tcW w:type="dxa" w:w="3120"/>
-            <w:tcMar>
-              <w:top w:w="25" w:type="dxa"/>
-              <w:bottom w:w="25" w:type="dxa"/>
-              <w:left w:w="40" w:type="dxa"/>
-              <w:right w:w="40" w:type="dxa"/>
-            </w:tcMar>
           </w:tcPr>
           <w:p>
             <w:r>
               <w:rPr>
                 <w:b/>
+                <w:color w:val="0A2540"/>
               </w:rPr>
               <w:t>5</w:t>
             </w:r>
@@ -332,28 +259,16 @@
         <w:tc>
           <w:tcPr>
             <w:tcW w:type="dxa" w:w="3120"/>
-            <w:tcMar>
-              <w:top w:w="25" w:type="dxa"/>
-              <w:bottom w:w="25" w:type="dxa"/>
-              <w:left w:w="40" w:type="dxa"/>
-              <w:right w:w="40" w:type="dxa"/>
-            </w:tcMar>
           </w:tcPr>
           <w:p>
             <w:r>
-              <w:t>Problem Statement</w:t>
+              <w:t>Problem Statement &amp; Research Questions</w:t>
             </w:r>
           </w:p>
         </w:tc>
         <w:tc>
           <w:tcPr>
             <w:tcW w:type="dxa" w:w="3120"/>
-            <w:tcMar>
-              <w:top w:w="25" w:type="dxa"/>
-              <w:bottom w:w="25" w:type="dxa"/>
-              <w:left w:w="40" w:type="dxa"/>
-              <w:right w:w="40" w:type="dxa"/>
-            </w:tcMar>
           </w:tcPr>
           <w:p>
             <w:pPr>
@@ -369,17 +284,12 @@
         <w:tc>
           <w:tcPr>
             <w:tcW w:type="dxa" w:w="3120"/>
-            <w:tcMar>
-              <w:top w:w="25" w:type="dxa"/>
-              <w:bottom w:w="25" w:type="dxa"/>
-              <w:left w:w="40" w:type="dxa"/>
-              <w:right w:w="40" w:type="dxa"/>
-            </w:tcMar>
           </w:tcPr>
           <w:p>
             <w:r>
               <w:rPr>
                 <w:b/>
+                <w:color w:val="0A2540"/>
               </w:rPr>
               <w:t>6</w:t>
             </w:r>
@@ -388,28 +298,16 @@
         <w:tc>
           <w:tcPr>
             <w:tcW w:type="dxa" w:w="3120"/>
-            <w:tcMar>
-              <w:top w:w="25" w:type="dxa"/>
-              <w:bottom w:w="25" w:type="dxa"/>
-              <w:left w:w="40" w:type="dxa"/>
-              <w:right w:w="40" w:type="dxa"/>
-            </w:tcMar>
           </w:tcPr>
           <w:p>
             <w:r>
-              <w:t>Objectives</w:t>
+              <w:t>Project Objectives</w:t>
             </w:r>
           </w:p>
         </w:tc>
         <w:tc>
           <w:tcPr>
             <w:tcW w:type="dxa" w:w="3120"/>
-            <w:tcMar>
-              <w:top w:w="25" w:type="dxa"/>
-              <w:bottom w:w="25" w:type="dxa"/>
-              <w:left w:w="40" w:type="dxa"/>
-              <w:right w:w="40" w:type="dxa"/>
-            </w:tcMar>
           </w:tcPr>
           <w:p>
             <w:pPr>
@@ -425,17 +323,12 @@
         <w:tc>
           <w:tcPr>
             <w:tcW w:type="dxa" w:w="3120"/>
-            <w:tcMar>
-              <w:top w:w="25" w:type="dxa"/>
-              <w:bottom w:w="25" w:type="dxa"/>
-              <w:left w:w="40" w:type="dxa"/>
-              <w:right w:w="40" w:type="dxa"/>
-            </w:tcMar>
           </w:tcPr>
           <w:p>
             <w:r>
               <w:rPr>
                 <w:b/>
+                <w:color w:val="0A2540"/>
               </w:rPr>
               <w:t>7</w:t>
             </w:r>
@@ -444,12 +337,6 @@
         <w:tc>
           <w:tcPr>
             <w:tcW w:type="dxa" w:w="3120"/>
-            <w:tcMar>
-              <w:top w:w="25" w:type="dxa"/>
-              <w:bottom w:w="25" w:type="dxa"/>
-              <w:left w:w="40" w:type="dxa"/>
-              <w:right w:w="40" w:type="dxa"/>
-            </w:tcMar>
           </w:tcPr>
           <w:p>
             <w:r>
@@ -460,12 +347,6 @@
         <w:tc>
           <w:tcPr>
             <w:tcW w:type="dxa" w:w="3120"/>
-            <w:tcMar>
-              <w:top w:w="25" w:type="dxa"/>
-              <w:bottom w:w="25" w:type="dxa"/>
-              <w:left w:w="40" w:type="dxa"/>
-              <w:right w:w="40" w:type="dxa"/>
-            </w:tcMar>
           </w:tcPr>
           <w:p>
             <w:pPr>
@@ -481,17 +362,12 @@
         <w:tc>
           <w:tcPr>
             <w:tcW w:type="dxa" w:w="3120"/>
-            <w:tcMar>
-              <w:top w:w="25" w:type="dxa"/>
-              <w:bottom w:w="25" w:type="dxa"/>
-              <w:left w:w="40" w:type="dxa"/>
-              <w:right w:w="40" w:type="dxa"/>
-            </w:tcMar>
           </w:tcPr>
           <w:p>
             <w:r>
               <w:rPr>
                 <w:b/>
+                <w:color w:val="0A2540"/>
               </w:rPr>
               <w:t>8</w:t>
             </w:r>
@@ -500,28 +376,16 @@
         <w:tc>
           <w:tcPr>
             <w:tcW w:type="dxa" w:w="3120"/>
-            <w:tcMar>
-              <w:top w:w="25" w:type="dxa"/>
-              <w:bottom w:w="25" w:type="dxa"/>
-              <w:left w:w="40" w:type="dxa"/>
-              <w:right w:w="40" w:type="dxa"/>
-            </w:tcMar>
           </w:tcPr>
           <w:p>
             <w:r>
-              <w:t>Significance of the Project</w:t>
+              <w:t>Significance and Industrial Relevance</w:t>
             </w:r>
           </w:p>
         </w:tc>
         <w:tc>
           <w:tcPr>
             <w:tcW w:type="dxa" w:w="3120"/>
-            <w:tcMar>
-              <w:top w:w="25" w:type="dxa"/>
-              <w:bottom w:w="25" w:type="dxa"/>
-              <w:left w:w="40" w:type="dxa"/>
-              <w:right w:w="40" w:type="dxa"/>
-            </w:tcMar>
           </w:tcPr>
           <w:p>
             <w:pPr>
@@ -537,17 +401,12 @@
         <w:tc>
           <w:tcPr>
             <w:tcW w:type="dxa" w:w="3120"/>
-            <w:tcMar>
-              <w:top w:w="25" w:type="dxa"/>
-              <w:bottom w:w="25" w:type="dxa"/>
-              <w:left w:w="40" w:type="dxa"/>
-              <w:right w:w="40" w:type="dxa"/>
-            </w:tcMar>
           </w:tcPr>
           <w:p>
             <w:r>
               <w:rPr>
                 <w:b/>
+                <w:color w:val="0A2540"/>
               </w:rPr>
               <w:t>9</w:t>
             </w:r>
@@ -556,28 +415,16 @@
         <w:tc>
           <w:tcPr>
             <w:tcW w:type="dxa" w:w="3120"/>
-            <w:tcMar>
-              <w:top w:w="25" w:type="dxa"/>
-              <w:bottom w:w="25" w:type="dxa"/>
-              <w:left w:w="40" w:type="dxa"/>
-              <w:right w:w="40" w:type="dxa"/>
-            </w:tcMar>
           </w:tcPr>
           <w:p>
             <w:r>
-              <w:t>Existing System</w:t>
+              <w:t>Existing Site Screening System</w:t>
             </w:r>
           </w:p>
         </w:tc>
         <w:tc>
           <w:tcPr>
             <w:tcW w:type="dxa" w:w="3120"/>
-            <w:tcMar>
-              <w:top w:w="25" w:type="dxa"/>
-              <w:bottom w:w="25" w:type="dxa"/>
-              <w:left w:w="40" w:type="dxa"/>
-              <w:right w:w="40" w:type="dxa"/>
-            </w:tcMar>
           </w:tcPr>
           <w:p>
             <w:pPr>
@@ -593,17 +440,12 @@
         <w:tc>
           <w:tcPr>
             <w:tcW w:type="dxa" w:w="3120"/>
-            <w:tcMar>
-              <w:top w:w="25" w:type="dxa"/>
-              <w:bottom w:w="25" w:type="dxa"/>
-              <w:left w:w="40" w:type="dxa"/>
-              <w:right w:w="40" w:type="dxa"/>
-            </w:tcMar>
           </w:tcPr>
           <w:p>
             <w:r>
               <w:rPr>
                 <w:b/>
+                <w:color w:val="0A2540"/>
               </w:rPr>
               <w:t>10</w:t>
             </w:r>
@@ -612,12 +454,6 @@
         <w:tc>
           <w:tcPr>
             <w:tcW w:type="dxa" w:w="3120"/>
-            <w:tcMar>
-              <w:top w:w="25" w:type="dxa"/>
-              <w:bottom w:w="25" w:type="dxa"/>
-              <w:left w:w="40" w:type="dxa"/>
-              <w:right w:w="40" w:type="dxa"/>
-            </w:tcMar>
           </w:tcPr>
           <w:p>
             <w:r>
@@ -628,12 +464,6 @@
         <w:tc>
           <w:tcPr>
             <w:tcW w:type="dxa" w:w="3120"/>
-            <w:tcMar>
-              <w:top w:w="25" w:type="dxa"/>
-              <w:bottom w:w="25" w:type="dxa"/>
-              <w:left w:w="40" w:type="dxa"/>
-              <w:right w:w="40" w:type="dxa"/>
-            </w:tcMar>
           </w:tcPr>
           <w:p>
             <w:pPr>
@@ -649,17 +479,12 @@
         <w:tc>
           <w:tcPr>
             <w:tcW w:type="dxa" w:w="3120"/>
-            <w:tcMar>
-              <w:top w:w="25" w:type="dxa"/>
-              <w:bottom w:w="25" w:type="dxa"/>
-              <w:left w:w="40" w:type="dxa"/>
-              <w:right w:w="40" w:type="dxa"/>
-            </w:tcMar>
           </w:tcPr>
           <w:p>
             <w:r>
               <w:rPr>
                 <w:b/>
+                <w:color w:val="0A2540"/>
               </w:rPr>
               <w:t>11</w:t>
             </w:r>
@@ -668,28 +493,16 @@
         <w:tc>
           <w:tcPr>
             <w:tcW w:type="dxa" w:w="3120"/>
-            <w:tcMar>
-              <w:top w:w="25" w:type="dxa"/>
-              <w:bottom w:w="25" w:type="dxa"/>
-              <w:left w:w="40" w:type="dxa"/>
-              <w:right w:w="40" w:type="dxa"/>
-            </w:tcMar>
           </w:tcPr>
           <w:p>
             <w:r>
-              <w:t>Proposed System</w:t>
+              <w:t>Proposed the system System</w:t>
             </w:r>
           </w:p>
         </w:tc>
         <w:tc>
           <w:tcPr>
             <w:tcW w:type="dxa" w:w="3120"/>
-            <w:tcMar>
-              <w:top w:w="25" w:type="dxa"/>
-              <w:bottom w:w="25" w:type="dxa"/>
-              <w:left w:w="40" w:type="dxa"/>
-              <w:right w:w="40" w:type="dxa"/>
-            </w:tcMar>
           </w:tcPr>
           <w:p>
             <w:pPr>
@@ -705,17 +518,12 @@
         <w:tc>
           <w:tcPr>
             <w:tcW w:type="dxa" w:w="3120"/>
-            <w:tcMar>
-              <w:top w:w="25" w:type="dxa"/>
-              <w:bottom w:w="25" w:type="dxa"/>
-              <w:left w:w="40" w:type="dxa"/>
-              <w:right w:w="40" w:type="dxa"/>
-            </w:tcMar>
           </w:tcPr>
           <w:p>
             <w:r>
               <w:rPr>
                 <w:b/>
+                <w:color w:val="0A2540"/>
               </w:rPr>
               <w:t>12</w:t>
             </w:r>
@@ -724,28 +532,16 @@
         <w:tc>
           <w:tcPr>
             <w:tcW w:type="dxa" w:w="3120"/>
-            <w:tcMar>
-              <w:top w:w="25" w:type="dxa"/>
-              <w:bottom w:w="25" w:type="dxa"/>
-              <w:left w:w="40" w:type="dxa"/>
-              <w:right w:w="40" w:type="dxa"/>
-            </w:tcMar>
           </w:tcPr>
           <w:p>
             <w:r>
-              <w:t>System Architecture</w:t>
+              <w:t>System Architecture &amp; End-to-End Pipeline</w:t>
             </w:r>
           </w:p>
         </w:tc>
         <w:tc>
           <w:tcPr>
             <w:tcW w:type="dxa" w:w="3120"/>
-            <w:tcMar>
-              <w:top w:w="25" w:type="dxa"/>
-              <w:bottom w:w="25" w:type="dxa"/>
-              <w:left w:w="40" w:type="dxa"/>
-              <w:right w:w="40" w:type="dxa"/>
-            </w:tcMar>
           </w:tcPr>
           <w:p>
             <w:pPr>
@@ -761,17 +557,12 @@
         <w:tc>
           <w:tcPr>
             <w:tcW w:type="dxa" w:w="3120"/>
-            <w:tcMar>
-              <w:top w:w="25" w:type="dxa"/>
-              <w:bottom w:w="25" w:type="dxa"/>
-              <w:left w:w="40" w:type="dxa"/>
-              <w:right w:w="40" w:type="dxa"/>
-            </w:tcMar>
           </w:tcPr>
           <w:p>
             <w:r>
               <w:rPr>
                 <w:b/>
+                <w:color w:val="0A2540"/>
               </w:rPr>
               <w:t>13</w:t>
             </w:r>
@@ -780,28 +571,16 @@
         <w:tc>
           <w:tcPr>
             <w:tcW w:type="dxa" w:w="3120"/>
-            <w:tcMar>
-              <w:top w:w="25" w:type="dxa"/>
-              <w:bottom w:w="25" w:type="dxa"/>
-              <w:left w:w="40" w:type="dxa"/>
-              <w:right w:w="40" w:type="dxa"/>
-            </w:tcMar>
           </w:tcPr>
           <w:p>
             <w:r>
-              <w:t>System Modules</w:t>
+              <w:t>System Modules Breakdown</w:t>
             </w:r>
           </w:p>
         </w:tc>
         <w:tc>
           <w:tcPr>
             <w:tcW w:type="dxa" w:w="3120"/>
-            <w:tcMar>
-              <w:top w:w="25" w:type="dxa"/>
-              <w:bottom w:w="25" w:type="dxa"/>
-              <w:left w:w="40" w:type="dxa"/>
-              <w:right w:w="40" w:type="dxa"/>
-            </w:tcMar>
           </w:tcPr>
           <w:p>
             <w:pPr>
@@ -817,17 +596,12 @@
         <w:tc>
           <w:tcPr>
             <w:tcW w:type="dxa" w:w="3120"/>
-            <w:tcMar>
-              <w:top w:w="25" w:type="dxa"/>
-              <w:bottom w:w="25" w:type="dxa"/>
-              <w:left w:w="40" w:type="dxa"/>
-              <w:right w:w="40" w:type="dxa"/>
-            </w:tcMar>
           </w:tcPr>
           <w:p>
             <w:r>
               <w:rPr>
                 <w:b/>
+                <w:color w:val="0A2540"/>
               </w:rPr>
               <w:t>14</w:t>
             </w:r>
@@ -836,28 +610,16 @@
         <w:tc>
           <w:tcPr>
             <w:tcW w:type="dxa" w:w="3120"/>
-            <w:tcMar>
-              <w:top w:w="25" w:type="dxa"/>
-              <w:bottom w:w="25" w:type="dxa"/>
-              <w:left w:w="40" w:type="dxa"/>
-              <w:right w:w="40" w:type="dxa"/>
-            </w:tcMar>
           </w:tcPr>
           <w:p>
             <w:r>
-              <w:t>Geospatial Ingestion and Feature Engineering Module</w:t>
+              <w:t>Core Geospatial Data Ingestion Module</w:t>
             </w:r>
           </w:p>
         </w:tc>
         <w:tc>
           <w:tcPr>
             <w:tcW w:type="dxa" w:w="3120"/>
-            <w:tcMar>
-              <w:top w:w="25" w:type="dxa"/>
-              <w:bottom w:w="25" w:type="dxa"/>
-              <w:left w:w="40" w:type="dxa"/>
-              <w:right w:w="40" w:type="dxa"/>
-            </w:tcMar>
           </w:tcPr>
           <w:p>
             <w:pPr>
@@ -873,17 +635,12 @@
         <w:tc>
           <w:tcPr>
             <w:tcW w:type="dxa" w:w="3120"/>
-            <w:tcMar>
-              <w:top w:w="25" w:type="dxa"/>
-              <w:bottom w:w="25" w:type="dxa"/>
-              <w:left w:w="40" w:type="dxa"/>
-              <w:right w:w="40" w:type="dxa"/>
-            </w:tcMar>
           </w:tcPr>
           <w:p>
             <w:r>
               <w:rPr>
                 <w:b/>
+                <w:color w:val="0A2540"/>
               </w:rPr>
               <w:t>15</w:t>
             </w:r>
@@ -892,12 +649,6 @@
         <w:tc>
           <w:tcPr>
             <w:tcW w:type="dxa" w:w="3120"/>
-            <w:tcMar>
-              <w:top w:w="25" w:type="dxa"/>
-              <w:bottom w:w="25" w:type="dxa"/>
-              <w:left w:w="40" w:type="dxa"/>
-              <w:right w:w="40" w:type="dxa"/>
-            </w:tcMar>
           </w:tcPr>
           <w:p>
             <w:r>
@@ -908,12 +659,6 @@
         <w:tc>
           <w:tcPr>
             <w:tcW w:type="dxa" w:w="3120"/>
-            <w:tcMar>
-              <w:top w:w="25" w:type="dxa"/>
-              <w:bottom w:w="25" w:type="dxa"/>
-              <w:left w:w="40" w:type="dxa"/>
-              <w:right w:w="40" w:type="dxa"/>
-            </w:tcMar>
           </w:tcPr>
           <w:p>
             <w:pPr>
@@ -929,17 +674,12 @@
         <w:tc>
           <w:tcPr>
             <w:tcW w:type="dxa" w:w="3120"/>
-            <w:tcMar>
-              <w:top w:w="25" w:type="dxa"/>
-              <w:bottom w:w="25" w:type="dxa"/>
-              <w:left w:w="40" w:type="dxa"/>
-              <w:right w:w="40" w:type="dxa"/>
-            </w:tcMar>
           </w:tcPr>
           <w:p>
             <w:r>
               <w:rPr>
                 <w:b/>
+                <w:color w:val="0A2540"/>
               </w:rPr>
               <w:t>16</w:t>
             </w:r>
@@ -948,12 +688,6 @@
         <w:tc>
           <w:tcPr>
             <w:tcW w:type="dxa" w:w="3120"/>
-            <w:tcMar>
-              <w:top w:w="25" w:type="dxa"/>
-              <w:bottom w:w="25" w:type="dxa"/>
-              <w:left w:w="40" w:type="dxa"/>
-              <w:right w:w="40" w:type="dxa"/>
-            </w:tcMar>
           </w:tcPr>
           <w:p>
             <w:r>
@@ -964,12 +698,6 @@
         <w:tc>
           <w:tcPr>
             <w:tcW w:type="dxa" w:w="3120"/>
-            <w:tcMar>
-              <w:top w:w="25" w:type="dxa"/>
-              <w:bottom w:w="25" w:type="dxa"/>
-              <w:left w:w="40" w:type="dxa"/>
-              <w:right w:w="40" w:type="dxa"/>
-            </w:tcMar>
           </w:tcPr>
           <w:p>
             <w:pPr>
@@ -985,17 +713,12 @@
         <w:tc>
           <w:tcPr>
             <w:tcW w:type="dxa" w:w="3120"/>
-            <w:tcMar>
-              <w:top w:w="25" w:type="dxa"/>
-              <w:bottom w:w="25" w:type="dxa"/>
-              <w:left w:w="40" w:type="dxa"/>
-              <w:right w:w="40" w:type="dxa"/>
-            </w:tcMar>
           </w:tcPr>
           <w:p>
             <w:r>
               <w:rPr>
                 <w:b/>
+                <w:color w:val="0A2540"/>
               </w:rPr>
               <w:t>17</w:t>
             </w:r>
@@ -1004,28 +727,16 @@
         <w:tc>
           <w:tcPr>
             <w:tcW w:type="dxa" w:w="3120"/>
-            <w:tcMar>
-              <w:top w:w="25" w:type="dxa"/>
-              <w:bottom w:w="25" w:type="dxa"/>
-              <w:left w:w="40" w:type="dxa"/>
-              <w:right w:w="40" w:type="dxa"/>
-            </w:tcMar>
           </w:tcPr>
           <w:p>
             <w:r>
-              <w:t>3D Visual and Hazard Physical Simulation Module</w:t>
+              <w:t>3D Visual &amp; Hazard Physical Simulation Module</w:t>
             </w:r>
           </w:p>
         </w:tc>
         <w:tc>
           <w:tcPr>
             <w:tcW w:type="dxa" w:w="3120"/>
-            <w:tcMar>
-              <w:top w:w="25" w:type="dxa"/>
-              <w:bottom w:w="25" w:type="dxa"/>
-              <w:left w:w="40" w:type="dxa"/>
-              <w:right w:w="40" w:type="dxa"/>
-            </w:tcMar>
           </w:tcPr>
           <w:p>
             <w:pPr>
@@ -1041,17 +752,12 @@
         <w:tc>
           <w:tcPr>
             <w:tcW w:type="dxa" w:w="3120"/>
-            <w:tcMar>
-              <w:top w:w="25" w:type="dxa"/>
-              <w:bottom w:w="25" w:type="dxa"/>
-              <w:left w:w="40" w:type="dxa"/>
-              <w:right w:w="40" w:type="dxa"/>
-            </w:tcMar>
           </w:tcPr>
           <w:p>
             <w:r>
               <w:rPr>
                 <w:b/>
+                <w:color w:val="0A2540"/>
               </w:rPr>
               <w:t>18</w:t>
             </w:r>
@@ -1060,28 +766,16 @@
         <w:tc>
           <w:tcPr>
             <w:tcW w:type="dxa" w:w="3120"/>
-            <w:tcMar>
-              <w:top w:w="25" w:type="dxa"/>
-              <w:bottom w:w="25" w:type="dxa"/>
-              <w:left w:w="40" w:type="dxa"/>
-              <w:right w:w="40" w:type="dxa"/>
-            </w:tcMar>
           </w:tcPr>
           <w:p>
             <w:r>
-              <w:t>Technology Stack</w:t>
+              <w:t>Technology Stack Overview</w:t>
             </w:r>
           </w:p>
         </w:tc>
         <w:tc>
           <w:tcPr>
             <w:tcW w:type="dxa" w:w="3120"/>
-            <w:tcMar>
-              <w:top w:w="25" w:type="dxa"/>
-              <w:bottom w:w="25" w:type="dxa"/>
-              <w:left w:w="40" w:type="dxa"/>
-              <w:right w:w="40" w:type="dxa"/>
-            </w:tcMar>
           </w:tcPr>
           <w:p>
             <w:pPr>
@@ -1097,17 +791,12 @@
         <w:tc>
           <w:tcPr>
             <w:tcW w:type="dxa" w:w="3120"/>
-            <w:tcMar>
-              <w:top w:w="25" w:type="dxa"/>
-              <w:bottom w:w="25" w:type="dxa"/>
-              <w:left w:w="40" w:type="dxa"/>
-              <w:right w:w="40" w:type="dxa"/>
-            </w:tcMar>
           </w:tcPr>
           <w:p>
             <w:r>
               <w:rPr>
                 <w:b/>
+                <w:color w:val="0A2540"/>
               </w:rPr>
               <w:t>19</w:t>
             </w:r>
@@ -1116,28 +805,16 @@
         <w:tc>
           <w:tcPr>
             <w:tcW w:type="dxa" w:w="3120"/>
-            <w:tcMar>
-              <w:top w:w="25" w:type="dxa"/>
-              <w:bottom w:w="25" w:type="dxa"/>
-              <w:left w:w="40" w:type="dxa"/>
-              <w:right w:w="40" w:type="dxa"/>
-            </w:tcMar>
           </w:tcPr>
           <w:p>
             <w:r>
-              <w:t>Frontend Technologies</w:t>
+              <w:t>Frontend Technologies &amp; Visual System</w:t>
             </w:r>
           </w:p>
         </w:tc>
         <w:tc>
           <w:tcPr>
             <w:tcW w:type="dxa" w:w="3120"/>
-            <w:tcMar>
-              <w:top w:w="25" w:type="dxa"/>
-              <w:bottom w:w="25" w:type="dxa"/>
-              <w:left w:w="40" w:type="dxa"/>
-              <w:right w:w="40" w:type="dxa"/>
-            </w:tcMar>
           </w:tcPr>
           <w:p>
             <w:pPr>
@@ -1153,17 +830,12 @@
         <w:tc>
           <w:tcPr>
             <w:tcW w:type="dxa" w:w="3120"/>
-            <w:tcMar>
-              <w:top w:w="25" w:type="dxa"/>
-              <w:bottom w:w="25" w:type="dxa"/>
-              <w:left w:w="40" w:type="dxa"/>
-              <w:right w:w="40" w:type="dxa"/>
-            </w:tcMar>
           </w:tcPr>
           <w:p>
             <w:r>
               <w:rPr>
                 <w:b/>
+                <w:color w:val="0A2540"/>
               </w:rPr>
               <w:t>20</w:t>
             </w:r>
@@ -1172,28 +844,16 @@
         <w:tc>
           <w:tcPr>
             <w:tcW w:type="dxa" w:w="3120"/>
-            <w:tcMar>
-              <w:top w:w="25" w:type="dxa"/>
-              <w:bottom w:w="25" w:type="dxa"/>
-              <w:left w:w="40" w:type="dxa"/>
-              <w:right w:w="40" w:type="dxa"/>
-            </w:tcMar>
           </w:tcPr>
           <w:p>
             <w:r>
-              <w:t>Backend Technologies</w:t>
+              <w:t>Backend Technologies &amp; ML Services</w:t>
             </w:r>
           </w:p>
         </w:tc>
         <w:tc>
           <w:tcPr>
             <w:tcW w:type="dxa" w:w="3120"/>
-            <w:tcMar>
-              <w:top w:w="25" w:type="dxa"/>
-              <w:bottom w:w="25" w:type="dxa"/>
-              <w:left w:w="40" w:type="dxa"/>
-              <w:right w:w="40" w:type="dxa"/>
-            </w:tcMar>
           </w:tcPr>
           <w:p>
             <w:pPr>
@@ -1209,17 +869,12 @@
         <w:tc>
           <w:tcPr>
             <w:tcW w:type="dxa" w:w="3120"/>
-            <w:tcMar>
-              <w:top w:w="25" w:type="dxa"/>
-              <w:bottom w:w="25" w:type="dxa"/>
-              <w:left w:w="40" w:type="dxa"/>
-              <w:right w:w="40" w:type="dxa"/>
-            </w:tcMar>
           </w:tcPr>
           <w:p>
             <w:r>
               <w:rPr>
                 <w:b/>
+                <w:color w:val="0A2540"/>
               </w:rPr>
               <w:t>21</w:t>
             </w:r>
@@ -1228,28 +883,16 @@
         <w:tc>
           <w:tcPr>
             <w:tcW w:type="dxa" w:w="3120"/>
-            <w:tcMar>
-              <w:top w:w="25" w:type="dxa"/>
-              <w:bottom w:w="25" w:type="dxa"/>
-              <w:left w:w="40" w:type="dxa"/>
-              <w:right w:w="40" w:type="dxa"/>
-            </w:tcMar>
           </w:tcPr>
           <w:p>
             <w:r>
-              <w:t>Database Design</w:t>
+              <w:t>Database &amp; Feature Store Design</w:t>
             </w:r>
           </w:p>
         </w:tc>
         <w:tc>
           <w:tcPr>
             <w:tcW w:type="dxa" w:w="3120"/>
-            <w:tcMar>
-              <w:top w:w="25" w:type="dxa"/>
-              <w:bottom w:w="25" w:type="dxa"/>
-              <w:left w:w="40" w:type="dxa"/>
-              <w:right w:w="40" w:type="dxa"/>
-            </w:tcMar>
           </w:tcPr>
           <w:p>
             <w:pPr>
@@ -1265,17 +908,12 @@
         <w:tc>
           <w:tcPr>
             <w:tcW w:type="dxa" w:w="3120"/>
-            <w:tcMar>
-              <w:top w:w="25" w:type="dxa"/>
-              <w:bottom w:w="25" w:type="dxa"/>
-              <w:left w:w="40" w:type="dxa"/>
-              <w:right w:w="40" w:type="dxa"/>
-            </w:tcMar>
           </w:tcPr>
           <w:p>
             <w:r>
               <w:rPr>
                 <w:b/>
+                <w:color w:val="0A2540"/>
               </w:rPr>
               <w:t>22</w:t>
             </w:r>
@@ -1284,28 +922,16 @@
         <w:tc>
           <w:tcPr>
             <w:tcW w:type="dxa" w:w="3120"/>
-            <w:tcMar>
-              <w:top w:w="25" w:type="dxa"/>
-              <w:bottom w:w="25" w:type="dxa"/>
-              <w:left w:w="40" w:type="dxa"/>
-              <w:right w:w="40" w:type="dxa"/>
-            </w:tcMar>
           </w:tcPr>
           <w:p>
             <w:r>
-              <w:t>Detailed Database Schema</w:t>
+              <w:t>Detailed Database Schema &amp; Metadata Dictionary</w:t>
             </w:r>
           </w:p>
         </w:tc>
         <w:tc>
           <w:tcPr>
             <w:tcW w:type="dxa" w:w="3120"/>
-            <w:tcMar>
-              <w:top w:w="25" w:type="dxa"/>
-              <w:bottom w:w="25" w:type="dxa"/>
-              <w:left w:w="40" w:type="dxa"/>
-              <w:right w:w="40" w:type="dxa"/>
-            </w:tcMar>
           </w:tcPr>
           <w:p>
             <w:pPr>
@@ -1321,17 +947,12 @@
         <w:tc>
           <w:tcPr>
             <w:tcW w:type="dxa" w:w="3120"/>
-            <w:tcMar>
-              <w:top w:w="25" w:type="dxa"/>
-              <w:bottom w:w="25" w:type="dxa"/>
-              <w:left w:w="40" w:type="dxa"/>
-              <w:right w:w="40" w:type="dxa"/>
-            </w:tcMar>
           </w:tcPr>
           <w:p>
             <w:r>
               <w:rPr>
                 <w:b/>
+                <w:color w:val="0A2540"/>
               </w:rPr>
               <w:t>23</w:t>
             </w:r>
@@ -1340,28 +961,16 @@
         <w:tc>
           <w:tcPr>
             <w:tcW w:type="dxa" w:w="3120"/>
-            <w:tcMar>
-              <w:top w:w="25" w:type="dxa"/>
-              <w:bottom w:w="25" w:type="dxa"/>
-              <w:left w:w="40" w:type="dxa"/>
-              <w:right w:w="40" w:type="dxa"/>
-            </w:tcMar>
           </w:tcPr>
           <w:p>
             <w:r>
-              <w:t>Database and Data Flow</w:t>
+              <w:t>Data Flow &amp; Geospatial ETL Pipeline</w:t>
             </w:r>
           </w:p>
         </w:tc>
         <w:tc>
           <w:tcPr>
             <w:tcW w:type="dxa" w:w="3120"/>
-            <w:tcMar>
-              <w:top w:w="25" w:type="dxa"/>
-              <w:bottom w:w="25" w:type="dxa"/>
-              <w:left w:w="40" w:type="dxa"/>
-              <w:right w:w="40" w:type="dxa"/>
-            </w:tcMar>
           </w:tcPr>
           <w:p>
             <w:pPr>
@@ -1377,17 +986,12 @@
         <w:tc>
           <w:tcPr>
             <w:tcW w:type="dxa" w:w="3120"/>
-            <w:tcMar>
-              <w:top w:w="25" w:type="dxa"/>
-              <w:bottom w:w="25" w:type="dxa"/>
-              <w:left w:w="40" w:type="dxa"/>
-              <w:right w:w="40" w:type="dxa"/>
-            </w:tcMar>
           </w:tcPr>
           <w:p>
             <w:r>
               <w:rPr>
                 <w:b/>
+                <w:color w:val="0A2540"/>
               </w:rPr>
               <w:t>24</w:t>
             </w:r>
@@ -1396,28 +1000,16 @@
         <w:tc>
           <w:tcPr>
             <w:tcW w:type="dxa" w:w="3120"/>
-            <w:tcMar>
-              <w:top w:w="25" w:type="dxa"/>
-              <w:bottom w:w="25" w:type="dxa"/>
-              <w:left w:w="40" w:type="dxa"/>
-              <w:right w:w="40" w:type="dxa"/>
-            </w:tcMar>
           </w:tcPr>
           <w:p>
             <w:r>
-              <w:t>API Endpoint Reference</w:t>
+              <w:t>RESTful API Endpoint Reference</w:t>
             </w:r>
           </w:p>
         </w:tc>
         <w:tc>
           <w:tcPr>
             <w:tcW w:type="dxa" w:w="3120"/>
-            <w:tcMar>
-              <w:top w:w="25" w:type="dxa"/>
-              <w:bottom w:w="25" w:type="dxa"/>
-              <w:left w:w="40" w:type="dxa"/>
-              <w:right w:w="40" w:type="dxa"/>
-            </w:tcMar>
           </w:tcPr>
           <w:p>
             <w:pPr>
@@ -1433,17 +1025,12 @@
         <w:tc>
           <w:tcPr>
             <w:tcW w:type="dxa" w:w="3120"/>
-            <w:tcMar>
-              <w:top w:w="25" w:type="dxa"/>
-              <w:bottom w:w="25" w:type="dxa"/>
-              <w:left w:w="40" w:type="dxa"/>
-              <w:right w:w="40" w:type="dxa"/>
-            </w:tcMar>
           </w:tcPr>
           <w:p>
             <w:r>
               <w:rPr>
                 <w:b/>
+                <w:color w:val="0A2540"/>
               </w:rPr>
               <w:t>25</w:t>
             </w:r>
@@ -1452,28 +1039,16 @@
         <w:tc>
           <w:tcPr>
             <w:tcW w:type="dxa" w:w="3120"/>
-            <w:tcMar>
-              <w:top w:w="25" w:type="dxa"/>
-              <w:bottom w:w="25" w:type="dxa"/>
-              <w:left w:w="40" w:type="dxa"/>
-              <w:right w:w="40" w:type="dxa"/>
-            </w:tcMar>
           </w:tcPr>
           <w:p>
             <w:r>
-              <w:t>Indian Engineering Standards Compliance</w:t>
+              <w:t>Indian Engineering Standards Compliance (IS Codes)</w:t>
             </w:r>
           </w:p>
         </w:tc>
         <w:tc>
           <w:tcPr>
             <w:tcW w:type="dxa" w:w="3120"/>
-            <w:tcMar>
-              <w:top w:w="25" w:type="dxa"/>
-              <w:bottom w:w="25" w:type="dxa"/>
-              <w:left w:w="40" w:type="dxa"/>
-              <w:right w:w="40" w:type="dxa"/>
-            </w:tcMar>
           </w:tcPr>
           <w:p>
             <w:pPr>
@@ -1489,17 +1064,12 @@
         <w:tc>
           <w:tcPr>
             <w:tcW w:type="dxa" w:w="3120"/>
-            <w:tcMar>
-              <w:top w:w="25" w:type="dxa"/>
-              <w:bottom w:w="25" w:type="dxa"/>
-              <w:left w:w="40" w:type="dxa"/>
-              <w:right w:w="40" w:type="dxa"/>
-            </w:tcMar>
           </w:tcPr>
           <w:p>
             <w:r>
               <w:rPr>
                 <w:b/>
+                <w:color w:val="0A2540"/>
               </w:rPr>
               <w:t>26</w:t>
             </w:r>
@@ -1508,28 +1078,16 @@
         <w:tc>
           <w:tcPr>
             <w:tcW w:type="dxa" w:w="3120"/>
-            <w:tcMar>
-              <w:top w:w="25" w:type="dxa"/>
-              <w:bottom w:w="25" w:type="dxa"/>
-              <w:left w:w="40" w:type="dxa"/>
-              <w:right w:w="40" w:type="dxa"/>
-            </w:tcMar>
           </w:tcPr>
           <w:p>
             <w:r>
-              <w:t>Mathematical Consistency and Normalization Logic</w:t>
+              <w:t>Mathematical Consistency &amp; Normalization Logic</w:t>
             </w:r>
           </w:p>
         </w:tc>
         <w:tc>
           <w:tcPr>
             <w:tcW w:type="dxa" w:w="3120"/>
-            <w:tcMar>
-              <w:top w:w="25" w:type="dxa"/>
-              <w:bottom w:w="25" w:type="dxa"/>
-              <w:left w:w="40" w:type="dxa"/>
-              <w:right w:w="40" w:type="dxa"/>
-            </w:tcMar>
           </w:tcPr>
           <w:p>
             <w:pPr>
@@ -1545,17 +1103,12 @@
         <w:tc>
           <w:tcPr>
             <w:tcW w:type="dxa" w:w="3120"/>
-            <w:tcMar>
-              <w:top w:w="25" w:type="dxa"/>
-              <w:bottom w:w="25" w:type="dxa"/>
-              <w:left w:w="40" w:type="dxa"/>
-              <w:right w:w="40" w:type="dxa"/>
-            </w:tcMar>
           </w:tcPr>
           <w:p>
             <w:r>
               <w:rPr>
                 <w:b/>
+                <w:color w:val="0A2540"/>
               </w:rPr>
               <w:t>27</w:t>
             </w:r>
@@ -1564,28 +1117,16 @@
         <w:tc>
           <w:tcPr>
             <w:tcW w:type="dxa" w:w="3120"/>
-            <w:tcMar>
-              <w:top w:w="25" w:type="dxa"/>
-              <w:bottom w:w="25" w:type="dxa"/>
-              <w:left w:w="40" w:type="dxa"/>
-              <w:right w:w="40" w:type="dxa"/>
-            </w:tcMar>
           </w:tcPr>
           <w:p>
             <w:r>
-              <w:t>Authentication and Security</w:t>
+              <w:t>Authentication, Security &amp; Rate Limiting</w:t>
             </w:r>
           </w:p>
         </w:tc>
         <w:tc>
           <w:tcPr>
             <w:tcW w:type="dxa" w:w="3120"/>
-            <w:tcMar>
-              <w:top w:w="25" w:type="dxa"/>
-              <w:bottom w:w="25" w:type="dxa"/>
-              <w:left w:w="40" w:type="dxa"/>
-              <w:right w:w="40" w:type="dxa"/>
-            </w:tcMar>
           </w:tcPr>
           <w:p>
             <w:pPr>
@@ -1601,17 +1142,12 @@
         <w:tc>
           <w:tcPr>
             <w:tcW w:type="dxa" w:w="3120"/>
-            <w:tcMar>
-              <w:top w:w="25" w:type="dxa"/>
-              <w:bottom w:w="25" w:type="dxa"/>
-              <w:left w:w="40" w:type="dxa"/>
-              <w:right w:w="40" w:type="dxa"/>
-            </w:tcMar>
           </w:tcPr>
           <w:p>
             <w:r>
               <w:rPr>
                 <w:b/>
+                <w:color w:val="0A2540"/>
               </w:rPr>
               <w:t>28</w:t>
             </w:r>
@@ -1620,28 +1156,16 @@
         <w:tc>
           <w:tcPr>
             <w:tcW w:type="dxa" w:w="3120"/>
-            <w:tcMar>
-              <w:top w:w="25" w:type="dxa"/>
-              <w:bottom w:w="25" w:type="dxa"/>
-              <w:left w:w="40" w:type="dxa"/>
-              <w:right w:w="40" w:type="dxa"/>
-            </w:tcMar>
           </w:tcPr>
           <w:p>
             <w:r>
-              <w:t>Functional Requirements</w:t>
+              <w:t>Functional Requirements Specification</w:t>
             </w:r>
           </w:p>
         </w:tc>
         <w:tc>
           <w:tcPr>
             <w:tcW w:type="dxa" w:w="3120"/>
-            <w:tcMar>
-              <w:top w:w="25" w:type="dxa"/>
-              <w:bottom w:w="25" w:type="dxa"/>
-              <w:left w:w="40" w:type="dxa"/>
-              <w:right w:w="40" w:type="dxa"/>
-            </w:tcMar>
           </w:tcPr>
           <w:p>
             <w:pPr>
@@ -1657,17 +1181,12 @@
         <w:tc>
           <w:tcPr>
             <w:tcW w:type="dxa" w:w="3120"/>
-            <w:tcMar>
-              <w:top w:w="25" w:type="dxa"/>
-              <w:bottom w:w="25" w:type="dxa"/>
-              <w:left w:w="40" w:type="dxa"/>
-              <w:right w:w="40" w:type="dxa"/>
-            </w:tcMar>
           </w:tcPr>
           <w:p>
             <w:r>
               <w:rPr>
                 <w:b/>
+                <w:color w:val="0A2540"/>
               </w:rPr>
               <w:t>29</w:t>
             </w:r>
@@ -1676,28 +1195,16 @@
         <w:tc>
           <w:tcPr>
             <w:tcW w:type="dxa" w:w="3120"/>
-            <w:tcMar>
-              <w:top w:w="25" w:type="dxa"/>
-              <w:bottom w:w="25" w:type="dxa"/>
-              <w:left w:w="40" w:type="dxa"/>
-              <w:right w:w="40" w:type="dxa"/>
-            </w:tcMar>
           </w:tcPr>
           <w:p>
             <w:r>
-              <w:t>Non-Functional Requirements</w:t>
+              <w:t>Non-Functional Requirements Specification</w:t>
             </w:r>
           </w:p>
         </w:tc>
         <w:tc>
           <w:tcPr>
             <w:tcW w:type="dxa" w:w="3120"/>
-            <w:tcMar>
-              <w:top w:w="25" w:type="dxa"/>
-              <w:bottom w:w="25" w:type="dxa"/>
-              <w:left w:w="40" w:type="dxa"/>
-              <w:right w:w="40" w:type="dxa"/>
-            </w:tcMar>
           </w:tcPr>
           <w:p>
             <w:pPr>
@@ -1713,17 +1220,12 @@
         <w:tc>
           <w:tcPr>
             <w:tcW w:type="dxa" w:w="3120"/>
-            <w:tcMar>
-              <w:top w:w="25" w:type="dxa"/>
-              <w:bottom w:w="25" w:type="dxa"/>
-              <w:left w:w="40" w:type="dxa"/>
-              <w:right w:w="40" w:type="dxa"/>
-            </w:tcMar>
           </w:tcPr>
           <w:p>
             <w:r>
               <w:rPr>
                 <w:b/>
+                <w:color w:val="0A2540"/>
               </w:rPr>
               <w:t>30</w:t>
             </w:r>
@@ -1732,12 +1234,6 @@
         <w:tc>
           <w:tcPr>
             <w:tcW w:type="dxa" w:w="3120"/>
-            <w:tcMar>
-              <w:top w:w="25" w:type="dxa"/>
-              <w:bottom w:w="25" w:type="dxa"/>
-              <w:left w:w="40" w:type="dxa"/>
-              <w:right w:w="40" w:type="dxa"/>
-            </w:tcMar>
           </w:tcPr>
           <w:p>
             <w:r>
@@ -1748,12 +1244,6 @@
         <w:tc>
           <w:tcPr>
             <w:tcW w:type="dxa" w:w="3120"/>
-            <w:tcMar>
-              <w:top w:w="25" w:type="dxa"/>
-              <w:bottom w:w="25" w:type="dxa"/>
-              <w:left w:w="40" w:type="dxa"/>
-              <w:right w:w="40" w:type="dxa"/>
-            </w:tcMar>
           </w:tcPr>
           <w:p>
             <w:pPr>
@@ -1769,17 +1259,12 @@
         <w:tc>
           <w:tcPr>
             <w:tcW w:type="dxa" w:w="3120"/>
-            <w:tcMar>
-              <w:top w:w="25" w:type="dxa"/>
-              <w:bottom w:w="25" w:type="dxa"/>
-              <w:left w:w="40" w:type="dxa"/>
-              <w:right w:w="40" w:type="dxa"/>
-            </w:tcMar>
           </w:tcPr>
           <w:p>
             <w:r>
               <w:rPr>
                 <w:b/>
+                <w:color w:val="0A2540"/>
               </w:rPr>
               <w:t>31</w:t>
             </w:r>
@@ -1788,28 +1273,16 @@
         <w:tc>
           <w:tcPr>
             <w:tcW w:type="dxa" w:w="3120"/>
-            <w:tcMar>
-              <w:top w:w="25" w:type="dxa"/>
-              <w:bottom w:w="25" w:type="dxa"/>
-              <w:left w:w="40" w:type="dxa"/>
-              <w:right w:w="40" w:type="dxa"/>
-            </w:tcMar>
           </w:tcPr>
           <w:p>
             <w:r>
-              <w:t>Software Requirements</w:t>
+              <w:t>Software &amp; Dependency Requirements</w:t>
             </w:r>
           </w:p>
         </w:tc>
         <w:tc>
           <w:tcPr>
             <w:tcW w:type="dxa" w:w="3120"/>
-            <w:tcMar>
-              <w:top w:w="25" w:type="dxa"/>
-              <w:bottom w:w="25" w:type="dxa"/>
-              <w:left w:w="40" w:type="dxa"/>
-              <w:right w:w="40" w:type="dxa"/>
-            </w:tcMar>
           </w:tcPr>
           <w:p>
             <w:pPr>
@@ -1825,17 +1298,12 @@
         <w:tc>
           <w:tcPr>
             <w:tcW w:type="dxa" w:w="3120"/>
-            <w:tcMar>
-              <w:top w:w="25" w:type="dxa"/>
-              <w:bottom w:w="25" w:type="dxa"/>
-              <w:left w:w="40" w:type="dxa"/>
-              <w:right w:w="40" w:type="dxa"/>
-            </w:tcMar>
           </w:tcPr>
           <w:p>
             <w:r>
               <w:rPr>
                 <w:b/>
+                <w:color w:val="0A2540"/>
               </w:rPr>
               <w:t>32</w:t>
             </w:r>
@@ -1844,12 +1312,6 @@
         <w:tc>
           <w:tcPr>
             <w:tcW w:type="dxa" w:w="3120"/>
-            <w:tcMar>
-              <w:top w:w="25" w:type="dxa"/>
-              <w:bottom w:w="25" w:type="dxa"/>
-              <w:left w:w="40" w:type="dxa"/>
-              <w:right w:w="40" w:type="dxa"/>
-            </w:tcMar>
           </w:tcPr>
           <w:p>
             <w:r>
@@ -1860,12 +1322,6 @@
         <w:tc>
           <w:tcPr>
             <w:tcW w:type="dxa" w:w="3120"/>
-            <w:tcMar>
-              <w:top w:w="25" w:type="dxa"/>
-              <w:bottom w:w="25" w:type="dxa"/>
-              <w:left w:w="40" w:type="dxa"/>
-              <w:right w:w="40" w:type="dxa"/>
-            </w:tcMar>
           </w:tcPr>
           <w:p>
             <w:pPr>
@@ -1881,17 +1337,12 @@
         <w:tc>
           <w:tcPr>
             <w:tcW w:type="dxa" w:w="3120"/>
-            <w:tcMar>
-              <w:top w:w="25" w:type="dxa"/>
-              <w:bottom w:w="25" w:type="dxa"/>
-              <w:left w:w="40" w:type="dxa"/>
-              <w:right w:w="40" w:type="dxa"/>
-            </w:tcMar>
           </w:tcPr>
           <w:p>
             <w:r>
               <w:rPr>
                 <w:b/>
+                <w:color w:val="0A2540"/>
               </w:rPr>
               <w:t>33</w:t>
             </w:r>
@@ -1900,28 +1351,16 @@
         <w:tc>
           <w:tcPr>
             <w:tcW w:type="dxa" w:w="3120"/>
-            <w:tcMar>
-              <w:top w:w="25" w:type="dxa"/>
-              <w:bottom w:w="25" w:type="dxa"/>
-              <w:left w:w="40" w:type="dxa"/>
-              <w:right w:w="40" w:type="dxa"/>
-            </w:tcMar>
           </w:tcPr>
           <w:p>
             <w:r>
-              <w:t>Implementation</w:t>
+              <w:t>Implementation &amp; Development Approach</w:t>
             </w:r>
           </w:p>
         </w:tc>
         <w:tc>
           <w:tcPr>
             <w:tcW w:type="dxa" w:w="3120"/>
-            <w:tcMar>
-              <w:top w:w="25" w:type="dxa"/>
-              <w:bottom w:w="25" w:type="dxa"/>
-              <w:left w:w="40" w:type="dxa"/>
-              <w:right w:w="40" w:type="dxa"/>
-            </w:tcMar>
           </w:tcPr>
           <w:p>
             <w:pPr>
@@ -1937,17 +1376,12 @@
         <w:tc>
           <w:tcPr>
             <w:tcW w:type="dxa" w:w="3120"/>
-            <w:tcMar>
-              <w:top w:w="25" w:type="dxa"/>
-              <w:bottom w:w="25" w:type="dxa"/>
-              <w:left w:w="40" w:type="dxa"/>
-              <w:right w:w="40" w:type="dxa"/>
-            </w:tcMar>
           </w:tcPr>
           <w:p>
             <w:r>
               <w:rPr>
                 <w:b/>
+                <w:color w:val="0A2540"/>
               </w:rPr>
               <w:t>34</w:t>
             </w:r>
@@ -1956,28 +1390,16 @@
         <w:tc>
           <w:tcPr>
             <w:tcW w:type="dxa" w:w="3120"/>
-            <w:tcMar>
-              <w:top w:w="25" w:type="dxa"/>
-              <w:bottom w:w="25" w:type="dxa"/>
-              <w:left w:w="40" w:type="dxa"/>
-              <w:right w:w="40" w:type="dxa"/>
-            </w:tcMar>
           </w:tcPr>
           <w:p>
             <w:r>
-              <w:t>User Interface and Results</w:t>
+              <w:t>User Interface, Dashboard &amp; Visual Results</w:t>
             </w:r>
           </w:p>
         </w:tc>
         <w:tc>
           <w:tcPr>
             <w:tcW w:type="dxa" w:w="3120"/>
-            <w:tcMar>
-              <w:top w:w="25" w:type="dxa"/>
-              <w:bottom w:w="25" w:type="dxa"/>
-              <w:left w:w="40" w:type="dxa"/>
-              <w:right w:w="40" w:type="dxa"/>
-            </w:tcMar>
           </w:tcPr>
           <w:p>
             <w:pPr>
@@ -1993,17 +1415,12 @@
         <w:tc>
           <w:tcPr>
             <w:tcW w:type="dxa" w:w="3120"/>
-            <w:tcMar>
-              <w:top w:w="25" w:type="dxa"/>
-              <w:bottom w:w="25" w:type="dxa"/>
-              <w:left w:w="40" w:type="dxa"/>
-              <w:right w:w="40" w:type="dxa"/>
-            </w:tcMar>
           </w:tcPr>
           <w:p>
             <w:r>
               <w:rPr>
                 <w:b/>
+                <w:color w:val="0A2540"/>
               </w:rPr>
               <w:t>35</w:t>
             </w:r>
@@ -2012,28 +1429,16 @@
         <w:tc>
           <w:tcPr>
             <w:tcW w:type="dxa" w:w="3120"/>
-            <w:tcMar>
-              <w:top w:w="25" w:type="dxa"/>
-              <w:bottom w:w="25" w:type="dxa"/>
-              <w:left w:w="40" w:type="dxa"/>
-              <w:right w:w="40" w:type="dxa"/>
-            </w:tcMar>
           </w:tcPr>
           <w:p>
             <w:r>
-              <w:t>Patrol Results and Reporting</w:t>
+              <w:t>EIA Evaluation Results &amp; Reporting</w:t>
             </w:r>
           </w:p>
         </w:tc>
         <w:tc>
           <w:tcPr>
             <w:tcW w:type="dxa" w:w="3120"/>
-            <w:tcMar>
-              <w:top w:w="25" w:type="dxa"/>
-              <w:bottom w:w="25" w:type="dxa"/>
-              <w:left w:w="40" w:type="dxa"/>
-              <w:right w:w="40" w:type="dxa"/>
-            </w:tcMar>
           </w:tcPr>
           <w:p>
             <w:pPr>
@@ -2049,17 +1454,12 @@
         <w:tc>
           <w:tcPr>
             <w:tcW w:type="dxa" w:w="3120"/>
-            <w:tcMar>
-              <w:top w:w="25" w:type="dxa"/>
-              <w:bottom w:w="25" w:type="dxa"/>
-              <w:left w:w="40" w:type="dxa"/>
-              <w:right w:w="40" w:type="dxa"/>
-            </w:tcMar>
           </w:tcPr>
           <w:p>
             <w:r>
               <w:rPr>
                 <w:b/>
+                <w:color w:val="0A2540"/>
               </w:rPr>
               <w:t>36</w:t>
             </w:r>
@@ -2068,28 +1468,16 @@
         <w:tc>
           <w:tcPr>
             <w:tcW w:type="dxa" w:w="3120"/>
-            <w:tcMar>
-              <w:top w:w="25" w:type="dxa"/>
-              <w:bottom w:w="25" w:type="dxa"/>
-              <w:left w:w="40" w:type="dxa"/>
-              <w:right w:w="40" w:type="dxa"/>
-            </w:tcMar>
           </w:tcPr>
           <w:p>
             <w:r>
-              <w:t>Web Application Flow — Login and Session Handling</w:t>
+              <w:t>Web Application Flow — Map Geocoding &amp; Input Handling</w:t>
             </w:r>
           </w:p>
         </w:tc>
         <w:tc>
           <w:tcPr>
             <w:tcW w:type="dxa" w:w="3120"/>
-            <w:tcMar>
-              <w:top w:w="25" w:type="dxa"/>
-              <w:bottom w:w="25" w:type="dxa"/>
-              <w:left w:w="40" w:type="dxa"/>
-              <w:right w:w="40" w:type="dxa"/>
-            </w:tcMar>
           </w:tcPr>
           <w:p>
             <w:pPr>
@@ -2105,17 +1493,12 @@
         <w:tc>
           <w:tcPr>
             <w:tcW w:type="dxa" w:w="3120"/>
-            <w:tcMar>
-              <w:top w:w="25" w:type="dxa"/>
-              <w:bottom w:w="25" w:type="dxa"/>
-              <w:left w:w="40" w:type="dxa"/>
-              <w:right w:w="40" w:type="dxa"/>
-            </w:tcMar>
           </w:tcPr>
           <w:p>
             <w:r>
               <w:rPr>
                 <w:b/>
+                <w:color w:val="0A2540"/>
               </w:rPr>
               <w:t>37</w:t>
             </w:r>
@@ -2124,28 +1507,16 @@
         <w:tc>
           <w:tcPr>
             <w:tcW w:type="dxa" w:w="3120"/>
-            <w:tcMar>
-              <w:top w:w="25" w:type="dxa"/>
-              <w:bottom w:w="25" w:type="dxa"/>
-              <w:left w:w="40" w:type="dxa"/>
-              <w:right w:w="40" w:type="dxa"/>
-            </w:tcMar>
           </w:tcPr>
           <w:p>
             <w:r>
-              <w:t>Web Application Flow — Dashboard, Reports and Analysis</w:t>
+              <w:t>Web Application Flow — Analysis, Reports &amp; PDF Dossier</w:t>
             </w:r>
           </w:p>
         </w:tc>
         <w:tc>
           <w:tcPr>
             <w:tcW w:type="dxa" w:w="3120"/>
-            <w:tcMar>
-              <w:top w:w="25" w:type="dxa"/>
-              <w:bottom w:w="25" w:type="dxa"/>
-              <w:left w:w="40" w:type="dxa"/>
-              <w:right w:w="40" w:type="dxa"/>
-            </w:tcMar>
           </w:tcPr>
           <w:p>
             <w:pPr>
@@ -2161,17 +1532,12 @@
         <w:tc>
           <w:tcPr>
             <w:tcW w:type="dxa" w:w="3120"/>
-            <w:tcMar>
-              <w:top w:w="25" w:type="dxa"/>
-              <w:bottom w:w="25" w:type="dxa"/>
-              <w:left w:w="40" w:type="dxa"/>
-              <w:right w:w="40" w:type="dxa"/>
-            </w:tcMar>
           </w:tcPr>
           <w:p>
             <w:r>
               <w:rPr>
                 <w:b/>
+                <w:color w:val="0A2540"/>
               </w:rPr>
               <w:t>38</w:t>
             </w:r>
@@ -2180,28 +1546,16 @@
         <w:tc>
           <w:tcPr>
             <w:tcW w:type="dxa" w:w="3120"/>
-            <w:tcMar>
-              <w:top w:w="25" w:type="dxa"/>
-              <w:bottom w:w="25" w:type="dxa"/>
-              <w:left w:w="40" w:type="dxa"/>
-              <w:right w:w="40" w:type="dxa"/>
-            </w:tcMar>
           </w:tcPr>
           <w:p>
             <w:r>
-              <w:t>3D Simulation Flow — Hazard Stress Testing</w:t>
+              <w:t>3D Simulation Flow — Interactive Physical Hazard Testing</w:t>
             </w:r>
           </w:p>
         </w:tc>
         <w:tc>
           <w:tcPr>
             <w:tcW w:type="dxa" w:w="3120"/>
-            <w:tcMar>
-              <w:top w:w="25" w:type="dxa"/>
-              <w:bottom w:w="25" w:type="dxa"/>
-              <w:left w:w="40" w:type="dxa"/>
-              <w:right w:w="40" w:type="dxa"/>
-            </w:tcMar>
           </w:tcPr>
           <w:p>
             <w:pPr>
@@ -2217,17 +1571,12 @@
         <w:tc>
           <w:tcPr>
             <w:tcW w:type="dxa" w:w="3120"/>
-            <w:tcMar>
-              <w:top w:w="25" w:type="dxa"/>
-              <w:bottom w:w="25" w:type="dxa"/>
-              <w:left w:w="40" w:type="dxa"/>
-              <w:right w:w="40" w:type="dxa"/>
-            </w:tcMar>
           </w:tcPr>
           <w:p>
             <w:r>
               <w:rPr>
                 <w:b/>
+                <w:color w:val="0A2540"/>
               </w:rPr>
               <w:t>39</w:t>
             </w:r>
@@ -2236,28 +1585,16 @@
         <w:tc>
           <w:tcPr>
             <w:tcW w:type="dxa" w:w="3120"/>
-            <w:tcMar>
-              <w:top w:w="25" w:type="dxa"/>
-              <w:bottom w:w="25" w:type="dxa"/>
-              <w:left w:w="40" w:type="dxa"/>
-              <w:right w:w="40" w:type="dxa"/>
-            </w:tcMar>
           </w:tcPr>
           <w:p>
             <w:r>
-              <w:t>Verification and Validation Flow — Case Studies</w:t>
+              <w:t>Verification &amp; Validation Case Studies</w:t>
             </w:r>
           </w:p>
         </w:tc>
         <w:tc>
           <w:tcPr>
             <w:tcW w:type="dxa" w:w="3120"/>
-            <w:tcMar>
-              <w:top w:w="25" w:type="dxa"/>
-              <w:bottom w:w="25" w:type="dxa"/>
-              <w:left w:w="40" w:type="dxa"/>
-              <w:right w:w="40" w:type="dxa"/>
-            </w:tcMar>
           </w:tcPr>
           <w:p>
             <w:pPr>
@@ -2273,17 +1610,12 @@
         <w:tc>
           <w:tcPr>
             <w:tcW w:type="dxa" w:w="3120"/>
-            <w:tcMar>
-              <w:top w:w="25" w:type="dxa"/>
-              <w:bottom w:w="25" w:type="dxa"/>
-              <w:left w:w="40" w:type="dxa"/>
-              <w:right w:w="40" w:type="dxa"/>
-            </w:tcMar>
           </w:tcPr>
           <w:p>
             <w:r>
               <w:rPr>
                 <w:b/>
+                <w:color w:val="0A2540"/>
               </w:rPr>
               <w:t>40</w:t>
             </w:r>
@@ -2292,28 +1624,16 @@
         <w:tc>
           <w:tcPr>
             <w:tcW w:type="dxa" w:w="3120"/>
-            <w:tcMar>
-              <w:top w:w="25" w:type="dxa"/>
-              <w:bottom w:w="25" w:type="dxa"/>
-              <w:left w:w="40" w:type="dxa"/>
-              <w:right w:w="40" w:type="dxa"/>
-            </w:tcMar>
           </w:tcPr>
           <w:p>
             <w:r>
-              <w:t>Testing and Test Cases</w:t>
+              <w:t>Testing &amp; Verification Test Suite</w:t>
             </w:r>
           </w:p>
         </w:tc>
         <w:tc>
           <w:tcPr>
             <w:tcW w:type="dxa" w:w="3120"/>
-            <w:tcMar>
-              <w:top w:w="25" w:type="dxa"/>
-              <w:bottom w:w="25" w:type="dxa"/>
-              <w:left w:w="40" w:type="dxa"/>
-              <w:right w:w="40" w:type="dxa"/>
-            </w:tcMar>
           </w:tcPr>
           <w:p>
             <w:pPr>
@@ -2329,17 +1649,12 @@
         <w:tc>
           <w:tcPr>
             <w:tcW w:type="dxa" w:w="3120"/>
-            <w:tcMar>
-              <w:top w:w="25" w:type="dxa"/>
-              <w:bottom w:w="25" w:type="dxa"/>
-              <w:left w:w="40" w:type="dxa"/>
-              <w:right w:w="40" w:type="dxa"/>
-            </w:tcMar>
           </w:tcPr>
           <w:p>
             <w:r>
               <w:rPr>
                 <w:b/>
+                <w:color w:val="0A2540"/>
               </w:rPr>
               <w:t>41</w:t>
             </w:r>
@@ -2348,28 +1663,16 @@
         <w:tc>
           <w:tcPr>
             <w:tcW w:type="dxa" w:w="3120"/>
-            <w:tcMar>
-              <w:top w:w="25" w:type="dxa"/>
-              <w:bottom w:w="25" w:type="dxa"/>
-              <w:left w:w="40" w:type="dxa"/>
-              <w:right w:w="40" w:type="dxa"/>
-            </w:tcMar>
           </w:tcPr>
           <w:p>
             <w:r>
-              <w:t>Detailed Results</w:t>
+              <w:t>Detailed Experimental Results &amp; Metrics</w:t>
             </w:r>
           </w:p>
         </w:tc>
         <w:tc>
           <w:tcPr>
             <w:tcW w:type="dxa" w:w="3120"/>
-            <w:tcMar>
-              <w:top w:w="25" w:type="dxa"/>
-              <w:bottom w:w="25" w:type="dxa"/>
-              <w:left w:w="40" w:type="dxa"/>
-              <w:right w:w="40" w:type="dxa"/>
-            </w:tcMar>
           </w:tcPr>
           <w:p>
             <w:pPr>
@@ -2385,17 +1688,12 @@
         <w:tc>
           <w:tcPr>
             <w:tcW w:type="dxa" w:w="3120"/>
-            <w:tcMar>
-              <w:top w:w="25" w:type="dxa"/>
-              <w:bottom w:w="25" w:type="dxa"/>
-              <w:left w:w="40" w:type="dxa"/>
-              <w:right w:w="40" w:type="dxa"/>
-            </w:tcMar>
           </w:tcPr>
           <w:p>
             <w:r>
               <w:rPr>
                 <w:b/>
+                <w:color w:val="0A2540"/>
               </w:rPr>
               <w:t>42</w:t>
             </w:r>
@@ -2404,28 +1702,16 @@
         <w:tc>
           <w:tcPr>
             <w:tcW w:type="dxa" w:w="3120"/>
-            <w:tcMar>
-              <w:top w:w="25" w:type="dxa"/>
-              <w:bottom w:w="25" w:type="dxa"/>
-              <w:left w:w="40" w:type="dxa"/>
-              <w:right w:w="40" w:type="dxa"/>
-            </w:tcMar>
           </w:tcPr>
           <w:p>
             <w:r>
-              <w:t>Result Analysis</w:t>
+              <w:t>Result Analysis &amp; SHAP Feature Attribution Insights</w:t>
             </w:r>
           </w:p>
         </w:tc>
         <w:tc>
           <w:tcPr>
             <w:tcW w:type="dxa" w:w="3120"/>
-            <w:tcMar>
-              <w:top w:w="25" w:type="dxa"/>
-              <w:bottom w:w="25" w:type="dxa"/>
-              <w:left w:w="40" w:type="dxa"/>
-              <w:right w:w="40" w:type="dxa"/>
-            </w:tcMar>
           </w:tcPr>
           <w:p>
             <w:pPr>
@@ -2441,17 +1727,12 @@
         <w:tc>
           <w:tcPr>
             <w:tcW w:type="dxa" w:w="3120"/>
-            <w:tcMar>
-              <w:top w:w="25" w:type="dxa"/>
-              <w:bottom w:w="25" w:type="dxa"/>
-              <w:left w:w="40" w:type="dxa"/>
-              <w:right w:w="40" w:type="dxa"/>
-            </w:tcMar>
           </w:tcPr>
           <w:p>
             <w:r>
               <w:rPr>
                 <w:b/>
+                <w:color w:val="0A2540"/>
               </w:rPr>
               <w:t>43</w:t>
             </w:r>
@@ -2460,12 +1741,6 @@
         <w:tc>
           <w:tcPr>
             <w:tcW w:type="dxa" w:w="3120"/>
-            <w:tcMar>
-              <w:top w:w="25" w:type="dxa"/>
-              <w:bottom w:w="25" w:type="dxa"/>
-              <w:left w:w="40" w:type="dxa"/>
-              <w:right w:w="40" w:type="dxa"/>
-            </w:tcMar>
           </w:tcPr>
           <w:p>
             <w:r>
@@ -2476,12 +1751,6 @@
         <w:tc>
           <w:tcPr>
             <w:tcW w:type="dxa" w:w="3120"/>
-            <w:tcMar>
-              <w:top w:w="25" w:type="dxa"/>
-              <w:bottom w:w="25" w:type="dxa"/>
-              <w:left w:w="40" w:type="dxa"/>
-              <w:right w:w="40" w:type="dxa"/>
-            </w:tcMar>
           </w:tcPr>
           <w:p>
             <w:pPr>
@@ -2497,17 +1766,12 @@
         <w:tc>
           <w:tcPr>
             <w:tcW w:type="dxa" w:w="3120"/>
-            <w:tcMar>
-              <w:top w:w="25" w:type="dxa"/>
-              <w:bottom w:w="25" w:type="dxa"/>
-              <w:left w:w="40" w:type="dxa"/>
-              <w:right w:w="40" w:type="dxa"/>
-            </w:tcMar>
           </w:tcPr>
           <w:p>
             <w:r>
               <w:rPr>
                 <w:b/>
+                <w:color w:val="0A2540"/>
               </w:rPr>
               <w:t>44</w:t>
             </w:r>
@@ -2516,28 +1780,16 @@
         <w:tc>
           <w:tcPr>
             <w:tcW w:type="dxa" w:w="3120"/>
-            <w:tcMar>
-              <w:top w:w="25" w:type="dxa"/>
-              <w:bottom w:w="25" w:type="dxa"/>
-              <w:left w:w="40" w:type="dxa"/>
-              <w:right w:w="40" w:type="dxa"/>
-            </w:tcMar>
           </w:tcPr>
           <w:p>
             <w:r>
-              <w:t>Development Methodology and Timeline</w:t>
+              <w:t>Development Methodology, Hackathon Journey &amp; Timeline</w:t>
             </w:r>
           </w:p>
         </w:tc>
         <w:tc>
           <w:tcPr>
             <w:tcW w:type="dxa" w:w="3120"/>
-            <w:tcMar>
-              <w:top w:w="25" w:type="dxa"/>
-              <w:bottom w:w="25" w:type="dxa"/>
-              <w:left w:w="40" w:type="dxa"/>
-              <w:right w:w="40" w:type="dxa"/>
-            </w:tcMar>
           </w:tcPr>
           <w:p>
             <w:pPr>
@@ -2553,17 +1805,12 @@
         <w:tc>
           <w:tcPr>
             <w:tcW w:type="dxa" w:w="3120"/>
-            <w:tcMar>
-              <w:top w:w="25" w:type="dxa"/>
-              <w:bottom w:w="25" w:type="dxa"/>
-              <w:left w:w="40" w:type="dxa"/>
-              <w:right w:w="40" w:type="dxa"/>
-            </w:tcMar>
           </w:tcPr>
           <w:p>
             <w:r>
               <w:rPr>
                 <w:b/>
+                <w:color w:val="0A2540"/>
               </w:rPr>
               <w:t>45</w:t>
             </w:r>
@@ -2572,28 +1819,16 @@
         <w:tc>
           <w:tcPr>
             <w:tcW w:type="dxa" w:w="3120"/>
-            <w:tcMar>
-              <w:top w:w="25" w:type="dxa"/>
-              <w:bottom w:w="25" w:type="dxa"/>
-              <w:left w:w="40" w:type="dxa"/>
-              <w:right w:w="40" w:type="dxa"/>
-            </w:tcMar>
           </w:tcPr>
           <w:p>
             <w:r>
-              <w:t>Risk Analysis and Mitigation</w:t>
+              <w:t>Risk Analysis and Mitigation Strategy</w:t>
             </w:r>
           </w:p>
         </w:tc>
         <w:tc>
           <w:tcPr>
             <w:tcW w:type="dxa" w:w="3120"/>
-            <w:tcMar>
-              <w:top w:w="25" w:type="dxa"/>
-              <w:bottom w:w="25" w:type="dxa"/>
-              <w:left w:w="40" w:type="dxa"/>
-              <w:right w:w="40" w:type="dxa"/>
-            </w:tcMar>
           </w:tcPr>
           <w:p>
             <w:pPr>
@@ -2609,17 +1844,12 @@
         <w:tc>
           <w:tcPr>
             <w:tcW w:type="dxa" w:w="3120"/>
-            <w:tcMar>
-              <w:top w:w="25" w:type="dxa"/>
-              <w:bottom w:w="25" w:type="dxa"/>
-              <w:left w:w="40" w:type="dxa"/>
-              <w:right w:w="40" w:type="dxa"/>
-            </w:tcMar>
           </w:tcPr>
           <w:p>
             <w:r>
               <w:rPr>
                 <w:b/>
+                <w:color w:val="0A2540"/>
               </w:rPr>
               <w:t>46</w:t>
             </w:r>
@@ -2628,28 +1858,16 @@
         <w:tc>
           <w:tcPr>
             <w:tcW w:type="dxa" w:w="3120"/>
-            <w:tcMar>
-              <w:top w:w="25" w:type="dxa"/>
-              <w:bottom w:w="25" w:type="dxa"/>
-              <w:left w:w="40" w:type="dxa"/>
-              <w:right w:w="40" w:type="dxa"/>
-            </w:tcMar>
           </w:tcPr>
           <w:p>
             <w:r>
-              <w:t>References</w:t>
+              <w:t>References &amp; Statutory Standards</w:t>
             </w:r>
           </w:p>
         </w:tc>
         <w:tc>
           <w:tcPr>
             <w:tcW w:type="dxa" w:w="3120"/>
-            <w:tcMar>
-              <w:top w:w="25" w:type="dxa"/>
-              <w:bottom w:w="25" w:type="dxa"/>
-              <w:left w:w="40" w:type="dxa"/>
-              <w:right w:w="40" w:type="dxa"/>
-            </w:tcMar>
           </w:tcPr>
           <w:p>
             <w:pPr>
@@ -2665,17 +1883,12 @@
         <w:tc>
           <w:tcPr>
             <w:tcW w:type="dxa" w:w="3120"/>
-            <w:tcMar>
-              <w:top w:w="25" w:type="dxa"/>
-              <w:bottom w:w="25" w:type="dxa"/>
-              <w:left w:w="40" w:type="dxa"/>
-              <w:right w:w="40" w:type="dxa"/>
-            </w:tcMar>
           </w:tcPr>
           <w:p>
             <w:r>
               <w:rPr>
                 <w:b/>
+                <w:color w:val="0A2540"/>
               </w:rPr>
               <w:t>47</w:t>
             </w:r>
@@ -2684,12 +1897,6 @@
         <w:tc>
           <w:tcPr>
             <w:tcW w:type="dxa" w:w="3120"/>
-            <w:tcMar>
-              <w:top w:w="25" w:type="dxa"/>
-              <w:bottom w:w="25" w:type="dxa"/>
-              <w:left w:w="40" w:type="dxa"/>
-              <w:right w:w="40" w:type="dxa"/>
-            </w:tcMar>
           </w:tcPr>
           <w:p>
             <w:r>
@@ -2700,12 +1907,6 @@
         <w:tc>
           <w:tcPr>
             <w:tcW w:type="dxa" w:w="3120"/>
-            <w:tcMar>
-              <w:top w:w="25" w:type="dxa"/>
-              <w:bottom w:w="25" w:type="dxa"/>
-              <w:left w:w="40" w:type="dxa"/>
-              <w:right w:w="40" w:type="dxa"/>
-            </w:tcMar>
           </w:tcPr>
           <w:p>
             <w:pPr>
@@ -2721,17 +1922,12 @@
         <w:tc>
           <w:tcPr>
             <w:tcW w:type="dxa" w:w="3120"/>
-            <w:tcMar>
-              <w:top w:w="25" w:type="dxa"/>
-              <w:bottom w:w="25" w:type="dxa"/>
-              <w:left w:w="40" w:type="dxa"/>
-              <w:right w:w="40" w:type="dxa"/>
-            </w:tcMar>
           </w:tcPr>
           <w:p>
             <w:r>
               <w:rPr>
                 <w:b/>
+                <w:color w:val="0A2540"/>
               </w:rPr>
               <w:t>48</w:t>
             </w:r>
@@ -2740,12 +1936,6 @@
         <w:tc>
           <w:tcPr>
             <w:tcW w:type="dxa" w:w="3120"/>
-            <w:tcMar>
-              <w:top w:w="25" w:type="dxa"/>
-              <w:bottom w:w="25" w:type="dxa"/>
-              <w:left w:w="40" w:type="dxa"/>
-              <w:right w:w="40" w:type="dxa"/>
-            </w:tcMar>
           </w:tcPr>
           <w:p>
             <w:r>
@@ -2756,12 +1946,6 @@
         <w:tc>
           <w:tcPr>
             <w:tcW w:type="dxa" w:w="3120"/>
-            <w:tcMar>
-              <w:top w:w="25" w:type="dxa"/>
-              <w:bottom w:w="25" w:type="dxa"/>
-              <w:left w:w="40" w:type="dxa"/>
-              <w:right w:w="40" w:type="dxa"/>
-            </w:tcMar>
           </w:tcPr>
           <w:p>
             <w:pPr>
@@ -2777,17 +1961,12 @@
         <w:tc>
           <w:tcPr>
             <w:tcW w:type="dxa" w:w="3120"/>
-            <w:tcMar>
-              <w:top w:w="25" w:type="dxa"/>
-              <w:bottom w:w="25" w:type="dxa"/>
-              <w:left w:w="40" w:type="dxa"/>
-              <w:right w:w="40" w:type="dxa"/>
-            </w:tcMar>
           </w:tcPr>
           <w:p>
             <w:r>
               <w:rPr>
                 <w:b/>
+                <w:color w:val="0A2540"/>
               </w:rPr>
               <w:t>49</w:t>
             </w:r>
@@ -2796,12 +1975,6 @@
         <w:tc>
           <w:tcPr>
             <w:tcW w:type="dxa" w:w="3120"/>
-            <w:tcMar>
-              <w:top w:w="25" w:type="dxa"/>
-              <w:bottom w:w="25" w:type="dxa"/>
-              <w:left w:w="40" w:type="dxa"/>
-              <w:right w:w="40" w:type="dxa"/>
-            </w:tcMar>
           </w:tcPr>
           <w:p>
             <w:r>
@@ -2812,12 +1985,6 @@
         <w:tc>
           <w:tcPr>
             <w:tcW w:type="dxa" w:w="3120"/>
-            <w:tcMar>
-              <w:top w:w="25" w:type="dxa"/>
-              <w:bottom w:w="25" w:type="dxa"/>
-              <w:left w:w="40" w:type="dxa"/>
-              <w:right w:w="40" w:type="dxa"/>
-            </w:tcMar>
           </w:tcPr>
           <w:p>
             <w:pPr>
@@ -2833,17 +2000,12 @@
         <w:tc>
           <w:tcPr>
             <w:tcW w:type="dxa" w:w="3120"/>
-            <w:tcMar>
-              <w:top w:w="25" w:type="dxa"/>
-              <w:bottom w:w="25" w:type="dxa"/>
-              <w:left w:w="40" w:type="dxa"/>
-              <w:right w:w="40" w:type="dxa"/>
-            </w:tcMar>
           </w:tcPr>
           <w:p>
             <w:r>
               <w:rPr>
                 <w:b/>
+                <w:color w:val="0A2540"/>
               </w:rPr>
               <w:t>50</w:t>
             </w:r>
@@ -2852,12 +2014,6 @@
         <w:tc>
           <w:tcPr>
             <w:tcW w:type="dxa" w:w="3120"/>
-            <w:tcMar>
-              <w:top w:w="25" w:type="dxa"/>
-              <w:bottom w:w="25" w:type="dxa"/>
-              <w:left w:w="40" w:type="dxa"/>
-              <w:right w:w="40" w:type="dxa"/>
-            </w:tcMar>
           </w:tcPr>
           <w:p>
             <w:r>
@@ -2868,12 +2024,6 @@
         <w:tc>
           <w:tcPr>
             <w:tcW w:type="dxa" w:w="3120"/>
-            <w:tcMar>
-              <w:top w:w="25" w:type="dxa"/>
-              <w:bottom w:w="25" w:type="dxa"/>
-              <w:left w:w="40" w:type="dxa"/>
-              <w:right w:w="40" w:type="dxa"/>
-            </w:tcMar>
           </w:tcPr>
           <w:p>
             <w:pPr>
@@ -2889,17 +2039,12 @@
         <w:tc>
           <w:tcPr>
             <w:tcW w:type="dxa" w:w="3120"/>
-            <w:tcMar>
-              <w:top w:w="25" w:type="dxa"/>
-              <w:bottom w:w="25" w:type="dxa"/>
-              <w:left w:w="40" w:type="dxa"/>
-              <w:right w:w="40" w:type="dxa"/>
-            </w:tcMar>
           </w:tcPr>
           <w:p>
             <w:r>
               <w:rPr>
                 <w:b/>
+                <w:color w:val="0A2540"/>
               </w:rPr>
               <w:t>51</w:t>
             </w:r>
@@ -2908,12 +2053,6 @@
         <w:tc>
           <w:tcPr>
             <w:tcW w:type="dxa" w:w="3120"/>
-            <w:tcMar>
-              <w:top w:w="25" w:type="dxa"/>
-              <w:bottom w:w="25" w:type="dxa"/>
-              <w:left w:w="40" w:type="dxa"/>
-              <w:right w:w="40" w:type="dxa"/>
-            </w:tcMar>
           </w:tcPr>
           <w:p>
             <w:r>
@@ -2924,12 +2063,6 @@
         <w:tc>
           <w:tcPr>
             <w:tcW w:type="dxa" w:w="3120"/>
-            <w:tcMar>
-              <w:top w:w="25" w:type="dxa"/>
-              <w:bottom w:w="25" w:type="dxa"/>
-              <w:left w:w="40" w:type="dxa"/>
-              <w:right w:w="40" w:type="dxa"/>
-            </w:tcMar>
           </w:tcPr>
           <w:p>
             <w:pPr>
@@ -2945,17 +2078,12 @@
         <w:tc>
           <w:tcPr>
             <w:tcW w:type="dxa" w:w="3120"/>
-            <w:tcMar>
-              <w:top w:w="25" w:type="dxa"/>
-              <w:bottom w:w="25" w:type="dxa"/>
-              <w:left w:w="40" w:type="dxa"/>
-              <w:right w:w="40" w:type="dxa"/>
-            </w:tcMar>
           </w:tcPr>
           <w:p>
             <w:r>
               <w:rPr>
                 <w:b/>
+                <w:color w:val="0A2540"/>
               </w:rPr>
               <w:t>52</w:t>
             </w:r>
@@ -2964,12 +2092,6 @@
         <w:tc>
           <w:tcPr>
             <w:tcW w:type="dxa" w:w="3120"/>
-            <w:tcMar>
-              <w:top w:w="25" w:type="dxa"/>
-              <w:bottom w:w="25" w:type="dxa"/>
-              <w:left w:w="40" w:type="dxa"/>
-              <w:right w:w="40" w:type="dxa"/>
-            </w:tcMar>
           </w:tcPr>
           <w:p>
             <w:r>
@@ -2980,12 +2102,6 @@
         <w:tc>
           <w:tcPr>
             <w:tcW w:type="dxa" w:w="3120"/>
-            <w:tcMar>
-              <w:top w:w="25" w:type="dxa"/>
-              <w:bottom w:w="25" w:type="dxa"/>
-              <w:left w:w="40" w:type="dxa"/>
-              <w:right w:w="40" w:type="dxa"/>
-            </w:tcMar>
           </w:tcPr>
           <w:p>
             <w:pPr>
@@ -3006,7 +2122,7 @@
     <w:p>
       <w:pPr>
         <w:pStyle w:val="Heading1"/>
-        <w:spacing w:before="1600" w:after="480"/>
+        <w:spacing w:before="1200" w:after="400"/>
         <w:jc w:val="center"/>
       </w:pPr>
       <w:r>
@@ -3018,16 +2134,16 @@
         <w:spacing w:line="288" w:lineRule="auto"/>
       </w:pPr>
       <w:r>
-        <w:t>We express our sincere gratitude to our esteemed institution, Kamaraj College of Engineering and Technology, and the Department of Computer Science and Engineering for providing the computational resources, laboratory facilities, and supportive academic environment to carry out this project successfully.</w:t>
+        <w:t>We express our sincere gratitude to our esteemed institution, Kamaraj College of Engineering and Technology, and the Department of Computer Science and Engineering for providing the computational resources, laboratory facilities, and supportive academic environment to execute this project successfully.</w:t>
         <w:br/>
         <w:br/>
-        <w:t>We extend our heartfelt thanks to our faculty guides, mentors, and academic reviewers for their valuable technical guidance, constructive critique, and continuous encouragement throughout the design, mathematical formulation, and implementation of the Construction Site Viability and Lifespan Prediction System.</w:t>
+        <w:t>We extend our heartfelt thanks to our faculty guides, mentors, and academic reviewers for their constructive feedback, technical insights, and continuous encouragement throughout the design, mathematical formulation, and implementation of the Construction Site Viability and Lifespan Prediction System.</w:t>
         <w:br/>
         <w:br/>
         <w:t>We also acknowledge the organizers of TANCAM's Hackathon (TNWISE 2026)—Tamil Nadu Centre of Excellence for Advanced Manufacturing, Dassault Systèmes, TIDCO, and Kumaraguru College of Technology—for recognizing our project with the Special Mention Award.</w:t>
         <w:br/>
         <w:br/>
-        <w:t>Finally, we express our gratitude to our family members and friends for their enduring support.</w:t>
+        <w:t>Finally, we express our deep appreciation to our families and friends for their enduring support.</w:t>
       </w:r>
     </w:p>
     <w:p>
@@ -3038,547 +2154,597 @@
     <w:p>
       <w:pPr>
         <w:pStyle w:val="Heading1"/>
-        <w:spacing w:before="280" w:after="120"/>
+        <w:spacing w:before="280" w:after="100"/>
       </w:pPr>
       <w:r>
+        <w:rPr>
+          <w:rFonts w:ascii="Times New Roman" w:hAnsi="Times New Roman"/>
+          <w:color w:val="0A2540"/>
+        </w:rPr>
         <w:t>1 Abstract</w:t>
       </w:r>
     </w:p>
     <w:p>
       <w:pPr>
-        <w:spacing w:after="120" w:line="276" w:lineRule="auto"/>
+        <w:spacing w:after="100" w:line="276" w:lineRule="auto"/>
       </w:pPr>
       <w:r>
         <w:rPr>
           <w:b/>
-          <w:color w:val="0F172A"/>
-          <w:sz w:val="23"/>
+          <w:color w:val="1E3A8A"/>
+          <w:sz w:val="22"/>
         </w:rPr>
         <w:t>1.1 Overview</w:t>
         <w:br/>
       </w:r>
       <w:r>
-        <w:t>The Construction Site Viability and Lifespan Prediction System is an autonomous, cloud-based geotechnical and environmental decision support platform developed to modernize preliminary site evaluation, structural hazard mitigation, and statutory Environmental Impact Assessment (EIA) across India. In conventional civil engineering practice, preliminary site feasibility assessment is an inherently manual, fragmented, and time-intensive process. It relies on physical site reconnaissance, offline geological maps, scattered municipal records, and localized exploratory boreholes. Such traditional approaches introduce substantial delays—frequently taking three to six weeks—and fail to provide unified multi-criteria spatial risk visibility prior to land acquisition and capital deployment.</w:t>
+        <w:t>The the system platform is an autonomous, cloud-based geotechnical and environmental decision support system engineered to revolutionize preliminary construction site selection, environmental impact assessment (EIA), and structural risk mitigation across India. Conventional civil engineering preliminary site selection is an inherently fragmented, time-intensive, and error-prone process. It frequently relies on scattered government maps, isolated soil sampling boreholes, offline climate historical averages, and subjective consultant assessments. These traditional approaches introduce substantial delays—often taking several weeks to months—and fail to capture complex, multi-domain interactions such as high water table saturation, cyclic seismic vulnerability, soil corrosivity, and statutory eco-sensitive buffer restrictions prior to capital investment.</w:t>
       </w:r>
     </w:p>
     <w:p>
       <w:pPr>
-        <w:spacing w:after="120" w:line="276" w:lineRule="auto"/>
+        <w:spacing w:after="100" w:line="276" w:lineRule="auto"/>
       </w:pPr>
       <w:r>
-        <w:t>The proposed system introduces an automated computational architecture that ingests multi-source satellite earth observation data, runs a high-precision Stacking Ensemble Machine Learning model (Random Forest, XGBoost, and Extra Trees feeding a Ridge Meta-Regressor), and delivers instant feasibility scoring (R² = 0.9123, MAE = ±1.99 points), structural lifespan projections, and foundation recommendations strictly compliant with Indian Standards (IS 1904:1986/2021, IS 1893:2016, IS 2911:2010, and IS 13920:2016).</w:t>
+        <w:t>the system resolves this foundational bottleneck by establishing an automated, multimodal data ingestion and machine learning evaluation pipeline. By inputting any geographic coordinates or selecting a location on an interactive GIS map within India, the system queries global and national satellite earth observation databases—including ISRIC SoilGrids for 3D soil mechanics, NASA POWER for 30-day meteorological indices, OpenStreetMap for drainage and waterways, BMTPC Vulnerability Atlas for hazard classifications, and GBIF/MoEFCC databases for protected wildlife sanctuaries. The platform integrates a Stacking Ensemble Machine Learning model (Random Forest, XGBoost, and Extra Trees feeding a Ridge Meta-Regressor) yielding verified feasibility scores (R² = 0.9123, MAE = ±1.99 points), structural lifespan projections, and preliminary foundation recommendations strictly compliant with Indian Standards (IS 1904:1986/2021, IS 1893:2016, IS 2911:2010, and IS 13920:2016).</w:t>
       </w:r>
     </w:p>
     <w:p>
       <w:pPr>
-        <w:spacing w:after="120" w:line="276" w:lineRule="auto"/>
+        <w:spacing w:after="100" w:line="276" w:lineRule="auto"/>
       </w:pPr>
       <w:r>
         <w:rPr>
           <w:b/>
-          <w:color w:val="0F172A"/>
-          <w:sz w:val="23"/>
+          <w:color w:val="1E3A8A"/>
+          <w:sz w:val="22"/>
         </w:rPr>
-        <w:t>1.2 Purpose</w:t>
+        <w:t>1.2 Purpose &amp; Motivation</w:t>
         <w:br/>
       </w:r>
       <w:r>
-        <w:t>The primary purpose of the project is to provide structural engineers, real estate developers, urban planning authorities, and environmental auditors with an instantaneous Stage-0/1 preliminary screening tool. By integrating 64 engineered environmental, geotechnical, meteorological, and hazard features with five standard academic EIA methodologies and interactive 3D WebGL physical simulations, the platform enables rapid, mathematically verified, and disaster-resilient construction planning.</w:t>
+        <w:t>The primary purpose of the system is to provide civil engineers, urban planners, government regulatory authorities, infrastructure developers, and academic researchers with an instant, scientifically rigorous Stage-0/1 preliminary screening tool. Furthermore, the platform implements all five academic Environmental Impact Assessment (EIA) methodologies—Statutory Weighted Checklist, Leopold 2D Interaction Matrix, Sorensen Cause-Condition-Effect Network, McHarg Multi-Criteria Spatial Overlay, and Predictive AI Modeling—accompanied by real-time Three.js 3D structural hazard reaction simulations and automated, publication-ready PDF engineering dossiers.</w:t>
       </w:r>
     </w:p>
     <w:p>
       <w:pPr>
         <w:pStyle w:val="Heading1"/>
-        <w:spacing w:before="280" w:after="120"/>
+        <w:spacing w:before="280" w:after="100"/>
       </w:pPr>
       <w:r>
+        <w:rPr>
+          <w:rFonts w:ascii="Times New Roman" w:hAnsi="Times New Roman"/>
+          <w:color w:val="0A2540"/>
+        </w:rPr>
         <w:t>2 Abstract — Extended Discussion</w:t>
       </w:r>
     </w:p>
     <w:p>
       <w:pPr>
-        <w:spacing w:after="120" w:line="276" w:lineRule="auto"/>
+        <w:spacing w:after="100" w:line="276" w:lineRule="auto"/>
       </w:pPr>
       <w:r>
         <w:rPr>
           <w:b/>
-          <w:color w:val="0F172A"/>
-          <w:sz w:val="23"/>
+          <w:color w:val="1E3A8A"/>
+          <w:sz w:val="22"/>
         </w:rPr>
         <w:t>2.1 Problem and Solution</w:t>
         <w:br/>
       </w:r>
       <w:r>
-        <w:t>Geotechnical failures, foundation differential settlement, water table inundation, and cyclic seismic degradation constitute major causes of post-construction structural distress and multimillion-rupee losses in Indian infrastructure projects. Conducting exploratory borehole drilling at the initial shortlisting stage is economically unfeasible across large geographic regions.</w:t>
+        <w:t>In major infrastructure and residential development projects, geotechnical site failures represent one of the most catastrophic financial and structural risks. Post-construction differential foundation settlement, slope failures, seismic resonance damage, and unexpected groundwater inundation frequently trace back to inadequate preliminary screening. In conventional workflows, preliminary stage assessments either rely on oversimplified assumptions or incur substantial financial overheads from manual exploratory boreholes prior to basic feasibility verification.</w:t>
       </w:r>
     </w:p>
     <w:p>
       <w:pPr>
-        <w:spacing w:after="120" w:line="276" w:lineRule="auto"/>
+        <w:spacing w:after="100" w:line="276" w:lineRule="auto"/>
       </w:pPr>
       <w:r>
-        <w:t>The proposed solution provides a complete software-driven alternative for Stage-0/1 site screening. Users select target coordinates anywhere in India via an interactive GIS map. The backend asynchronously queries global and national satellite databases (ISRIC SoilGrids, NASA POWER Climatology, OpenStreetMap, BMTPC Vulnerability Atlas, and GBIF Protected Areas), executes machine learning inference, applies statutory civil engineering rules, and computes five standard EIA methodologies (Checklist, Leopold Matrix, Sorensen Network, McHarg Spatial Overlay, and Predictive AI) in under 3 seconds.</w:t>
+        <w:t>the system delivers a scalable, automated computational solution. The system orchestrates 64 distinct geospatial and geotechnical features across four interconnected domains: Geotechnical Soil Mechanics, Climate &amp; Meteorological Stress, Natural Hazards &amp; Inundation, and Ecological &amp; Wildlife Sensitivity. The predictive core evaluates load-bearing capacity against building structural categories (Houses, Apartments, Hospitals, Schools, Bridges, Industrial Warehouses, and Malls) and dynamic storey heights, generating transparent, mathematically derived risk indexes.</w:t>
       </w:r>
     </w:p>
     <w:p>
       <w:pPr>
-        <w:spacing w:after="120" w:line="276" w:lineRule="auto"/>
+        <w:spacing w:after="100" w:line="276" w:lineRule="auto"/>
       </w:pPr>
       <w:r>
         <w:rPr>
           <w:b/>
-          <w:color w:val="0F172A"/>
-          <w:sz w:val="23"/>
+          <w:color w:val="1E3A8A"/>
+          <w:sz w:val="22"/>
         </w:rPr>
-        <w:t>2.2 Expected Impact</w:t>
+        <w:t>2.2 Expected Impact &amp; Societal Value</w:t>
         <w:br/>
       </w:r>
       <w:r>
-        <w:t>The system drastically reduces preliminary site evaluation timelines from weeks to seconds while cutting exploratory screening costs by over 80%. It establishes complete decision traceability, minimizes human subjectivity, and ensures strict compliance with Bureau of Indian Standards and MoEFCC environmental clearance regulations. The project was awarded the Special Mention Award at the state-level TANCAM TNWISE 2026 Hackathon for excellence in technological innovation and societal impact.</w:t>
+        <w:t>By digitizing and automating Stage-0/1 site screening, the system reduces preliminary evaluation timelines from 3–4 weeks down to under 3 seconds while reducing preliminary surveying expenditures by over 80%. It prevents unviable developments in hazard-prone floodplains, coastal inundation zones, and protected wildlife corridors. The system was recognized with the Special Mention Award at the state-level TANCAM TNWISE 2026 Hackathon for its contribution to sustainable smart infrastructure and environmental preservation in Tamil Nadu and across India.</w:t>
       </w:r>
     </w:p>
     <w:p>
       <w:pPr>
         <w:pStyle w:val="Heading1"/>
-        <w:spacing w:before="280" w:after="120"/>
+        <w:spacing w:before="280" w:after="100"/>
       </w:pPr>
       <w:r>
+        <w:rPr>
+          <w:rFonts w:ascii="Times New Roman" w:hAnsi="Times New Roman"/>
+          <w:color w:val="0A2540"/>
+        </w:rPr>
         <w:t>3 Introduction</w:t>
       </w:r>
     </w:p>
     <w:p>
       <w:pPr>
-        <w:spacing w:after="120" w:line="276" w:lineRule="auto"/>
+        <w:spacing w:after="100" w:line="276" w:lineRule="auto"/>
       </w:pPr>
       <w:r>
-        <w:t>Construction site selection forms the foundational basis of civil engineering and architectural planning. The physical durability, economic viability, and safety of any civil structure depend directly on the interaction between superstructure gravity and dynamic loads and the supporting subsoil strata, regional hydrology, seismic exposure, and prevailing climatic conditions.</w:t>
+        <w:t>Construction site selection is the foundational phase of all civil engineering and architectural projects. The physical longevity, structural stability, economic viability, and environmental legality of any building depend directly on the interaction between superstructure gravity/dynamic loads and the underlying subsoil and regional climate.</w:t>
       </w:r>
     </w:p>
     <w:p>
       <w:pPr>
-        <w:spacing w:after="120" w:line="276" w:lineRule="auto"/>
+        <w:spacing w:after="100" w:line="276" w:lineRule="auto"/>
       </w:pPr>
       <w:r>
-        <w:t>Rapid urbanization across India has intensified development in geotechnically complex areas, including coastal floodplains, expansive black cotton soil zones, and high-seismic Himalayan belts. Simultaneously, statutory environmental regulations—such as the Ministry of Environment, Forest and Climate Change (MoEFCC) EIA Notification 2006—mandate rigorous buffer compliance around national parks and eco-sensitive zones.</w:t>
-      </w:r>
-    </w:p>
-    <w:p>
-      <w:pPr>
-        <w:spacing w:after="120" w:line="276" w:lineRule="auto"/>
-      </w:pPr>
-      <w:r>
-        <w:t>The Construction Site Viability and Lifespan Prediction System addresses these multidisciplinary challenges by unifying satellite remote sensing, machine learning regression, Indian Standards compliance algorithms, and WebGL 3D hazard simulations into a single, accessible web platform.</w:t>
+        <w:t>Historically, civil engineering relied on localized field surveys and historical municipal registers. However, with accelerating urbanization, climate change-induced extreme weather events, and stringent statutory environmental clearance mandates (such as the MoEFCC EIA Notification 2006), traditional manual site evaluation methods have proven inadequate. the system addresses this modern challenge by deploying an intelligent, end-to-end Geospatial Artificial Intelligence (GeoAI) platform. The system operates autonomously: users interact with a modern web dashboard or programmatic REST API, selecting coordinates anywhere across India to trigger an automated cascade of spatial data retrieval, ML inference, multi-criteria EIA calculations, and 3D physical hazard simulations.</w:t>
       </w:r>
     </w:p>
     <w:p>
       <w:pPr>
         <w:pStyle w:val="Heading1"/>
-        <w:spacing w:before="280" w:after="120"/>
+        <w:spacing w:before="280" w:after="100"/>
       </w:pPr>
       <w:r>
+        <w:rPr>
+          <w:rFonts w:ascii="Times New Roman" w:hAnsi="Times New Roman"/>
+          <w:color w:val="0A2540"/>
+        </w:rPr>
         <w:t>4 Background and Motivation</w:t>
       </w:r>
     </w:p>
     <w:p>
       <w:pPr>
-        <w:spacing w:after="120" w:line="276" w:lineRule="auto"/>
+        <w:spacing w:after="100" w:line="276" w:lineRule="auto"/>
       </w:pPr>
       <w:r>
         <w:rPr>
           <w:b/>
-          <w:color w:val="0F172A"/>
-          <w:sz w:val="23"/>
+          <w:color w:val="1E3A8A"/>
+          <w:sz w:val="22"/>
         </w:rPr>
-        <w:t>4.1 Need for Digital Geotechnical Screening</w:t>
+        <w:t>4.1 Need for Automated Geotechnical Screening</w:t>
         <w:br/>
       </w:r>
       <w:r>
-        <w:t>Preliminary site investigation traditionally involves physical site visits, manual sampling, and laboratory analysis. While physical borehole investigation is mandatory for final detailed design (Stage-2), utilizing manual methods during initial site shortlisting (Stage-0/1) introduces severe bottlenecks. A digital screening system allows engineers to screen hundreds of square kilometers rapidly, identifying high-risk zones before committing financial resources.</w:t>
+        <w:t>Traditional geotechnical exploration begins with borehole drilling, Standard Penetration Tests (SPT), and laboratory soil mechanics analysis. While physical borehole investigations remain essential for final structural execution (Stage-2 detailed design), conducting physical boreholes across multiple candidate sites during preliminary shortlisting (Stage-0/1) is cost-prohibitive and time-consuming. An automated screening tool allows developers to screen hundreds of square kilometers instantly.</w:t>
       </w:r>
     </w:p>
     <w:p>
       <w:pPr>
-        <w:spacing w:after="120" w:line="276" w:lineRule="auto"/>
+        <w:spacing w:after="100" w:line="276" w:lineRule="auto"/>
       </w:pPr>
       <w:r>
         <w:rPr>
           <w:b/>
-          <w:color w:val="0F172A"/>
-          <w:sz w:val="23"/>
+          <w:color w:val="1E3A8A"/>
+          <w:sz w:val="22"/>
         </w:rPr>
-        <w:t>4.2 Motivation for Satellite Earth Observation</w:t>
+        <w:t>4.2 Remote Geospatial Sensing &amp; Earth Observation</w:t>
         <w:br/>
       </w:r>
       <w:r>
-        <w:t>Modern satellite constellations and global earth observation projects (such as ISRIC SoilGrids and NASA POWER) provide calibrated, high-resolution geospatial datasets covering soil texture, mineral composition, precipitation, and thermal stress. Transforming these raw data layers into actionable civil engineering parameters democratizes access to sophisticated spatial intelligence.</w:t>
+        <w:t>Over the past decade, satellite remote sensing, digital elevation models (DEM), and global soil grid databases have achieved sub-kilometer spatial resolutions. Platforms such as ISRIC World Soil Information, NASA POWER Ag-Climatology, and OpenStreetMap provide multi-spectral, calibrated earth observation data. However, converting raw geospatial raster arrays into actionable structural engineering insights requires domain-specific feature engineering, spatial indexing, and machine learning calibration.</w:t>
       </w:r>
     </w:p>
     <w:p>
       <w:pPr>
-        <w:spacing w:after="120" w:line="276" w:lineRule="auto"/>
+        <w:spacing w:after="100" w:line="276" w:lineRule="auto"/>
       </w:pPr>
       <w:r>
         <w:rPr>
           <w:b/>
-          <w:color w:val="0F172A"/>
-          <w:sz w:val="23"/>
+          <w:color w:val="1E3A8A"/>
+          <w:sz w:val="22"/>
         </w:rPr>
-        <w:t>4.3 Digital Record Keeping and Auditability</w:t>
+        <w:t>4.3 Digital Record Keeping &amp; Decision Traceability</w:t>
         <w:br/>
       </w:r>
       <w:r>
-        <w:t>Municipal planning bodies, financial underwriters, and environmental clearance authorities require verifiable, mathematically sound documentation. The proposed platform replaces subjective qualitative notes with reproducible digital audit logs, automated ReportLab PDF engineering dossiers, and explainable AI feature attribution.</w:t>
+        <w:t>Municipal authorities, banking institutions, and insurance underwriters require transparent, auditable records justifying site selection decisions. the system replaces handwritten notes and disconnected spreadsheets with a unified digital repository, automated PDF generation, and SHAP-based feature importance explainability.</w:t>
       </w:r>
     </w:p>
     <w:p>
       <w:pPr>
         <w:pStyle w:val="Heading1"/>
-        <w:spacing w:before="280" w:after="120"/>
+        <w:spacing w:before="280" w:after="100"/>
       </w:pPr>
       <w:r>
-        <w:t>5 Problem Statement</w:t>
+        <w:rPr>
+          <w:rFonts w:ascii="Times New Roman" w:hAnsi="Times New Roman"/>
+          <w:color w:val="0A2540"/>
+        </w:rPr>
+        <w:t>5 Problem Statement &amp; Research Questions</w:t>
       </w:r>
     </w:p>
     <w:p>
       <w:pPr>
-        <w:spacing w:after="120" w:line="276" w:lineRule="auto"/>
+        <w:spacing w:after="100" w:line="276" w:lineRule="auto"/>
       </w:pPr>
       <w:r>
-        <w:t>Core Problem:</w:t>
+        <w:t>Core Problem Statement:</w:t>
         <w:br/>
-        <w:t>How can multi-source satellite geospatial observations, geotechnical subsoil mechanics, meteorological stress indices, and natural disaster hazard data be autonomously harvested, synthesized, and evaluated to provide instantaneous, mathematically rigorous, and statutory-compliant construction site viability predictions, structural lifespan forecasts, and Environmental Impact Assessments?</w:t>
+        <w:t>How can multi-source satellite geospatial observations, geotechnical parameters, and environmental hazard indices be autonomously harvested, synthesized, and evaluated to provide instantaneous, mathematically rigorous, and statutory-compliant construction site feasibility assessments and Environmental Impact Evaluations?</w:t>
       </w:r>
     </w:p>
     <w:p>
       <w:pPr>
-        <w:spacing w:after="120" w:line="276" w:lineRule="auto"/>
+        <w:spacing w:after="100" w:line="276" w:lineRule="auto"/>
       </w:pPr>
       <w:r>
-        <w:t>The proposed solution implements a cloud-based web application featuring asynchronous geospatial ETL dispatchers, a Stacking Ensemble Regressor, a 5-method EIA calculation core, a Three.js 3D physical hazard simulation engine, and an automated ReportLab PDF compiler.</w:t>
+        <w:t>Key Research &amp; Engineering Questions:</w:t>
+        <w:br/>
+        <w:t>1. How can heterogeneous spatial APIs (ISRIC, NASA POWER, OSM, BMTPC) be integrated into a unified sub-3-second ETL pipeline with robust caching and offline fallback mechanisms?</w:t>
+        <w:br/>
+        <w:t>2. What machine learning ensemble architecture maximizes prediction precision (R² &gt; 0.90) for construction feasibility and lifespan estimation across diverse Indian soil topographies?</w:t>
+        <w:br/>
+        <w:t>3. How can the 5 academic EIA methodologies (Checklist, Leopold Matrix, Sorensen Network, McHarg Overlay, Predictive AI) be mathematically normalized to eliminate arbitrary scoring and guarantee strict alignment with Indian Standards (IS 1904, IS 1893, IS 13920)?</w:t>
+        <w:br/>
+        <w:t>4. How can complex geotechnical hazards (pore pressure rise, cyclic seismic shear, differential settlement) be visualized through real-time 3D WebGL simulations for non-technical stakeholders?</w:t>
       </w:r>
     </w:p>
     <w:p>
       <w:pPr>
         <w:pStyle w:val="Heading1"/>
-        <w:spacing w:before="280" w:after="120"/>
+        <w:spacing w:before="280" w:after="100"/>
       </w:pPr>
       <w:r>
-        <w:t>6 Objectives</w:t>
+        <w:rPr>
+          <w:rFonts w:ascii="Times New Roman" w:hAnsi="Times New Roman"/>
+          <w:color w:val="0A2540"/>
+        </w:rPr>
+        <w:t>6 Project Objectives</w:t>
       </w:r>
     </w:p>
     <w:p>
       <w:pPr>
-        <w:spacing w:after="120" w:line="276" w:lineRule="auto"/>
+        <w:spacing w:after="100" w:line="276" w:lineRule="auto"/>
       </w:pPr>
       <w:r>
-        <w:t>The major objectives of the project are:</w:t>
+        <w:t>The primary engineering objectives of the the system project are:</w:t>
         <w:br/>
-        <w:t>1. To develop an automated geospatial data ingestion pipeline interfacing with ISRIC SoilGrids, NASA POWER, OpenStreetMap, BMTPC Atlas, and GBIF databases.</w:t>
+        <w:t>1. To develop an autonomous geospatial ETL pipeline ingesting live soil, climate, hazard, and biodiversity data across India.</w:t>
         <w:br/>
-        <w:t>2. To train, optimize, and deploy a Stacking Ensemble Machine Learning model (Random Forest, XGBoost, Extra Trees, Ridge Meta-Regressor) achieving R² ≥ 0.91 and MAE ≤ 2.0 points.</w:t>
+        <w:t>2. To train, validate, and deploy a Stacking Machine Learning Regressor (Random Forest, XGBoost, Extra Trees, Ridge Meta-Regressor) achieving R² ≥ 0.91 and MAE ≤ 2.0 points.</w:t>
         <w:br/>
-        <w:t>3. To engineer a rule-based expert foundation recommendation engine aligned with Indian Standards IS 1904:1986/2021 and IS 2911:2010.</w:t>
+        <w:t>3. To implement a Computer Vision CNN model for automated soil classification from field excavation photographs.</w:t>
         <w:br/>
-        <w:t>4. To implement all five standard academic Environmental Impact Assessment (EIA) methodologies with complete mathematical transparency and explicit normalization formulas.</w:t>
+        <w:t>4. To engineer all 5 academic Environmental Impact Assessment (EIA) methodologies with complete mathematical transparency and explicit normalization formulas.</w:t>
         <w:br/>
-        <w:t>5. To build an interactive 3D WebGL structural simulation using Three.js to model real-time building reactions to flooding, earthquake ground motion, and soil settlement.</w:t>
+        <w:t>5. To build an interactive 3D WebGL Physical Hazard Simulation Engine using Three.js to model real-time structural reactions to flooding, seismic vibrations, and soil settlement.</w:t>
         <w:br/>
-        <w:t>6. To design a publication-ready ReportLab PDF generator compiling comprehensive engineering dossiers.</w:t>
+        <w:t>6. To design an automated ReportLab PDF engine compiling publication-ready engineering dossiers compliant with Indian Standards.</w:t>
         <w:br/>
-        <w:t>7. To deploy the system as a secure, rate-limited RESTful web service on cloud infrastructure.</w:t>
+        <w:t>7. To provide secure, rate-limited RESTful APIs and deploy the platform on a production cloud environment (Render / Gunicorn).</w:t>
       </w:r>
     </w:p>
     <w:p>
       <w:pPr>
         <w:pStyle w:val="Heading1"/>
-        <w:spacing w:before="280" w:after="120"/>
+        <w:spacing w:before="280" w:after="100"/>
       </w:pPr>
       <w:r>
+        <w:rPr>
+          <w:rFonts w:ascii="Times New Roman" w:hAnsi="Times New Roman"/>
+          <w:color w:val="0A2540"/>
+        </w:rPr>
         <w:t>7 Scope of the Project</w:t>
       </w:r>
     </w:p>
     <w:p>
       <w:pPr>
-        <w:spacing w:after="120" w:line="276" w:lineRule="auto"/>
+        <w:spacing w:after="100" w:line="276" w:lineRule="auto"/>
       </w:pPr>
       <w:r>
-        <w:t>The scope of the project covers preliminary Stage-0 and Stage-1 construction site viability screening and environmental impact evaluation across the entire territory of the Republic of India. The system supports eight structural building categories: Houses, Apartments, Hospitals, Schools, Factories, Warehouses, Bridges, and Commercial Malls.</w:t>
+        <w:t>The scope of the system encompasses preliminary Stage-0 and Stage-1 construction site feasibility screening across the entire geographic territory of the Republic of India. The platform analyzes building categories ranging from residential houses to high-rise commercial structures and municipal bridges.</w:t>
       </w:r>
     </w:p>
     <w:p>
       <w:pPr>
-        <w:spacing w:after="120" w:line="276" w:lineRule="auto"/>
+        <w:spacing w:after="100" w:line="276" w:lineRule="auto"/>
       </w:pPr>
       <w:r>
         <w:rPr>
           <w:b/>
-          <w:color w:val="0F172A"/>
-          <w:sz w:val="23"/>
+          <w:color w:val="1E3A8A"/>
+          <w:sz w:val="22"/>
         </w:rPr>
-        <w:t>7.1 Target Users</w:t>
+        <w:t>7.1 Target Users and Stakeholders</w:t>
         <w:br/>
       </w:r>
       <w:r>
-        <w:t>• Civil &amp; Structural Engineers: Preliminary foundation type selection and bearing capacity assessment.</w:t>
+        <w:t>• Civil &amp; Structural Engineers: Rapid shortlisting of foundation configurations and preliminary safe bearing capacity estimates.</w:t>
         <w:br/>
-        <w:t>• Real Estate &amp; Infrastructure Developers: Land valuation, risk screening, and portfolio comparison.</w:t>
+        <w:t>• Real Estate &amp; Infrastructure Developers: Cost-benefit analysis and hazard screening prior to land acquisition.</w:t>
         <w:br/>
         <w:t>• Environmental Consultants &amp; EIA Auditors: Automated generation of statutory Leopold matrices, Sorensen networks, and MoEFCC buffer audits.</w:t>
         <w:br/>
-        <w:t>• Urban Local Bodies &amp; Municipalities: Zoning compliance, hazard mitigation, and development master planning.</w:t>
+        <w:t>• Municipal Planners &amp; Government Regulators: Zoning compliance, disaster vulnerability mapping, and urban expansion planning.</w:t>
         <w:br/>
-        <w:t>• Financial Institutions &amp; Actuarial Insurers: Climate resilience assessment and asset durability rating.</w:t>
+        <w:t>• Financial Institutions &amp; Insurers: Actuarial climate risk assessment and structural asset durability rating.</w:t>
       </w:r>
     </w:p>
     <w:p>
       <w:pPr>
         <w:pStyle w:val="Heading1"/>
-        <w:spacing w:before="280" w:after="120"/>
+        <w:spacing w:before="280" w:after="100"/>
       </w:pPr>
       <w:r>
-        <w:t>8 Significance of the Project</w:t>
+        <w:rPr>
+          <w:rFonts w:ascii="Times New Roman" w:hAnsi="Times New Roman"/>
+          <w:color w:val="0A2540"/>
+        </w:rPr>
+        <w:t>8 Significance and Industrial Relevance</w:t>
       </w:r>
     </w:p>
     <w:p>
       <w:pPr>
-        <w:spacing w:after="120" w:line="276" w:lineRule="auto"/>
+        <w:spacing w:after="100" w:line="276" w:lineRule="auto"/>
       </w:pPr>
       <w:r>
-        <w:t>The project bridges the gap between modern geospatial artificial intelligence and traditional civil engineering practice. By identifying critical structural failure modes—such as high liquefaction vulnerability, expansive clay shrink-swell, acidic soil corrosivity, and coastal waterlogging—at Stage-0, the system prevents severe structural failures, project delays, legal disputes, and economic losses.</w:t>
+        <w:t>The industrial significance of the system lies in transforming a traditionally manual, high-latency consulting workflow into an instantaneous, objective, and data-driven software service. By identifying critical failure modes—such as expansive black cotton soil shrink-swell, coastal floodwater inundation, high seismic acceleration, or eco-sensitive sanctuary encroachment—at Stage-0, the platform prevents multimillion-rupee project abandonments, litigation, and structural disasters.</w:t>
       </w:r>
     </w:p>
     <w:p>
       <w:pPr>
         <w:pStyle w:val="Heading1"/>
-        <w:spacing w:before="280" w:after="120"/>
+        <w:spacing w:before="280" w:after="100"/>
       </w:pPr>
       <w:r>
-        <w:t>9 Existing System</w:t>
+        <w:rPr>
+          <w:rFonts w:ascii="Times New Roman" w:hAnsi="Times New Roman"/>
+          <w:color w:val="0A2540"/>
+        </w:rPr>
+        <w:t>9 Existing Site Screening System</w:t>
       </w:r>
     </w:p>
     <w:p>
       <w:pPr>
-        <w:spacing w:after="120" w:line="276" w:lineRule="auto"/>
+        <w:spacing w:after="100" w:line="276" w:lineRule="auto"/>
       </w:pPr>
       <w:r>
-        <w:t>In the traditional site selection workflow:</w:t>
+        <w:t>In the conventional approach:</w:t>
         <w:br/>
-        <w:t>1. Land buyers and civil engineers manually inspect candidate plots.</w:t>
+        <w:t>1. Developers hire field surveyors to conduct manual site visits and boundary measurements.</w:t>
         <w:br/>
-        <w:t>2. Geotechnical testing agencies are contracted to drill trial boreholes and test soil samples in laboratories (taking 2–4 weeks).</w:t>
+        <w:t>2. Geotechnical consultants drill physical trial pits and boreholes, sending core samples for lab testing (2–4 weeks).</w:t>
         <w:br/>
-        <w:t>3. Environmental compliance is manually researched through regional gazettes, forest boundary maps, and seismic zone atlases.</w:t>
+        <w:t>3. Environmental consultants manually search regional town planning maps, seismic zoning charts, and forest reserve gazettes.</w:t>
         <w:br/>
-        <w:t>4. Results are compiled into subjective narrative reports without explicit mathematical normalization.</w:t>
+        <w:t>4. Reports are compiled manually in word processors with subjective qualitative scoring.</w:t>
       </w:r>
     </w:p>
     <w:p>
       <w:pPr>
         <w:pStyle w:val="Heading1"/>
-        <w:spacing w:before="280" w:after="120"/>
+        <w:spacing w:before="280" w:after="100"/>
       </w:pPr>
       <w:r>
+        <w:rPr>
+          <w:rFonts w:ascii="Times New Roman" w:hAnsi="Times New Roman"/>
+          <w:color w:val="0A2540"/>
+        </w:rPr>
         <w:t>10 Limitations of the Existing System</w:t>
       </w:r>
     </w:p>
     <w:p>
       <w:pPr>
-        <w:spacing w:after="120" w:line="276" w:lineRule="auto"/>
+        <w:spacing w:after="100" w:line="276" w:lineRule="auto"/>
       </w:pPr>
       <w:r>
-        <w:t>The major limitations of the existing workflow include:</w:t>
+        <w:t>• High Financial Cost: Exploratory drilling for multiple candidate plots incurs massive preliminary capital expenditure.</w:t>
         <w:br/>
-        <w:t>• High Financial Overhead: Exploratory borehole drilling across multiple short-listed sites is cost-prohibitive.</w:t>
+        <w:t>• Significant Time Latency: Turnaround times typically range between 20 to 45 business days.</w:t>
         <w:br/>
-        <w:t>• Long Turnaround Times: Data collection and lab analysis require several weeks to months.</w:t>
+        <w:t>• Fragmented Data Silos: Soil, seismic, climate, and biodiversity records are maintained by disparate agencies without unified spatial intersection.</w:t>
         <w:br/>
-        <w:t>• Fragmented Data Silos: Soil, climate, seismic, and ecological datasets are maintained in separate offline registries.</w:t>
+        <w:t>• Lack of Mathematical Normalization: Qualitative EIA reports frequently lack reproducible numerical formulas.</w:t>
         <w:br/>
-        <w:t>• Subjective EIA Scoring: Traditional environmental impact matrices often lack transparent numerical normalization.</w:t>
-        <w:br/>
-        <w:t>• Lack of Interactive Visual Simulations: Non-technical clients and investors cannot visualize how physical hazards affect structural integrity.</w:t>
+        <w:t>• Zero Interactive Simulation: Clients and non-technical stakeholders cannot visualize how physical hazards impact the building.</w:t>
       </w:r>
     </w:p>
     <w:p>
       <w:pPr>
         <w:pStyle w:val="Heading1"/>
-        <w:spacing w:before="280" w:after="120"/>
+        <w:spacing w:before="280" w:after="100"/>
       </w:pPr>
       <w:r>
-        <w:t>11 Proposed System</w:t>
+        <w:rPr>
+          <w:rFonts w:ascii="Times New Roman" w:hAnsi="Times New Roman"/>
+          <w:color w:val="0A2540"/>
+        </w:rPr>
+        <w:t>11 Proposed the system System</w:t>
       </w:r>
     </w:p>
     <w:p>
       <w:pPr>
-        <w:spacing w:after="120" w:line="276" w:lineRule="auto"/>
+        <w:spacing w:after="100" w:line="276" w:lineRule="auto"/>
       </w:pPr>
       <w:r>
-        <w:t>The proposed Construction Site Viability and Lifespan Prediction System provides an integrated digital workflow:</w:t>
-        <w:br/>
-        <w:t>1. The user inputs geographic coordinates or selects a point on an interactive Leaflet GIS map.</w:t>
-        <w:br/>
-        <w:t>2. The backend dispatches parallel asynchronous queries to satellite APIs, extracting 64 spatial features across soil mechanics, climate stress, hazard vulnerability, and ecology.</w:t>
-        <w:br/>
-        <w:t>3. The Stacking Ensemble Regressor predicts overall site feasibility (0–100) and expected structural lifespan (years).</w:t>
-        <w:br/>
-        <w:t>4. The system executes all five academic EIA methodologies (Checklist, Leopold Matrix, Sorensen Network, McHarg Overlay, Predictive AI) using strict mathematical formulas.</w:t>
-        <w:br/>
-        <w:t>5. The 3D WebGL engine renders real-time structural responses to flood depth, seismic oscillation, and soil settlement.</w:t>
-        <w:br/>
-        <w:t>6. The user can download an official, formatted ReportLab PDF dossier with one click.</w:t>
+        <w:t>The proposed the system platform integrates satellite remote sensing, machine learning predictive modeling, statutory Indian Standards rules engines, academic EIA matrices, and WebGL physics simulation into a cohesive, web-based platform. Users select coordinates via an interactive map, and the system executes real-time data ingestion, algorithmic inference, multi-criteria spatial overlay, and 3D simulation rendering in under 3 seconds.</w:t>
       </w:r>
     </w:p>
     <w:p>
       <w:pPr>
         <w:pStyle w:val="Heading1"/>
-        <w:spacing w:before="280" w:after="120"/>
+        <w:spacing w:before="280" w:after="100"/>
       </w:pPr>
       <w:r>
-        <w:t>12 System Architecture</w:t>
+        <w:rPr>
+          <w:rFonts w:ascii="Times New Roman" w:hAnsi="Times New Roman"/>
+          <w:color w:val="0A2540"/>
+        </w:rPr>
+        <w:t>12 System Architecture &amp; End-to-End Pipeline</w:t>
       </w:r>
     </w:p>
     <w:p>
       <w:pPr>
-        <w:spacing w:after="120" w:line="276" w:lineRule="auto"/>
+        <w:spacing w:after="100" w:line="276" w:lineRule="auto"/>
       </w:pPr>
       <w:r>
-        <w:t>The system follows a multi-tier microservices-oriented architecture:</w:t>
+        <w:t>The the system system architecture follows a decoupled, modular microservices-oriented design:</w:t>
         <w:br/>
-        <w:t>• Client Presentation Tier: Single Page Application (SPA) utilizing HTML5, Vanilla CSS3 design system, JavaScript ES6+, Leaflet GIS, and Three.js WebGL canvas.</w:t>
+        <w:t>1. Client Layer: Single Page Application (SPA) built with HTML5, CSS3 Glassmorphism design system, Vanilla JavaScript ES6+, Leaflet GIS, and Three.js WebGL.</w:t>
         <w:br/>
-        <w:t>• Application &amp; Gateway Tier: Flask WSGI application managed by Gunicorn, providing RESTful endpoints, JWT authentication, and Flask-Limiter security controls.</w:t>
+        <w:t>2. API &amp; Gateway Layer: Flask WSGI application managed by Gunicorn, featuring JWT authentication, CORS middleware, and Flask-Limiter IP throttling.</w:t>
         <w:br/>
-        <w:t>• Geospatial Ingestion &amp; ETL Tier: Asynchronous connectors querying ISRIC SoilGrids, NASA POWER Climatology, OpenStreetMap Overpass, BMTPC Atlas, and GBIF.</w:t>
+        <w:t>3. Ingestion &amp; ETL Layer: Spatial query dispatchers connecting to ISRIC SoilGrids REST APIs, NASA POWER Climatology, OpenStreetMap Overpass API, BMTPC Vulnerability Dataset, and GBIF Protected Areas.</w:t>
         <w:br/>
-        <w:t>• Machine Learning Inference Tier: Stacking Ensemble Regressor, Fast TreeSHAP explainer, and PyTorch MobileNetV2 Soil Image Classifier.</w:t>
+        <w:t>4. AI/ML Inference Layer: Stacking Ensemble Regressor, Fast TreeSHAP explainer, and PyTorch MobileNetV2 Soil Image Classifier.</w:t>
         <w:br/>
-        <w:t>• Academic EIA Calculation Core: Rule engines and mathematical solvers for Checklist, Leopold, Sorensen, and McHarg models.</w:t>
+        <w:t>5. EIA Evaluation Engine: Mathematical calculation core executing Checklist, Leopold Matrix, Sorensen Network, McHarg Overlay, and Predictive AI models.</w:t>
         <w:br/>
-        <w:t>• Document Generation Engine: ReportLab PDF compiler formatting data into publication-ready engineering dossiers.</w:t>
+        <w:t>6. Presentation &amp; Document Engine: Three.js 3D structural reaction canvas and ReportLab publication-grade PDF compiler.</w:t>
       </w:r>
     </w:p>
     <w:p>
       <w:pPr>
         <w:pStyle w:val="Heading1"/>
-        <w:spacing w:before="280" w:after="120"/>
+        <w:spacing w:before="280" w:after="100"/>
       </w:pPr>
       <w:r>
-        <w:t>13 System Modules</w:t>
+        <w:rPr>
+          <w:rFonts w:ascii="Times New Roman" w:hAnsi="Times New Roman"/>
+          <w:color w:val="0A2540"/>
+        </w:rPr>
+        <w:t>13 System Modules Breakdown</w:t>
       </w:r>
     </w:p>
     <w:p>
       <w:pPr>
-        <w:spacing w:after="120" w:line="276" w:lineRule="auto"/>
+        <w:spacing w:after="100" w:line="276" w:lineRule="auto"/>
       </w:pPr>
       <w:r>
-        <w:t>The system is divided into five core functional modules:</w:t>
+        <w:t>The platform is organized into five primary functional modules:</w:t>
         <w:br/>
-        <w:t>• Module 1: Geospatial Ingestion and Feature Engineering Module</w:t>
+        <w:t>• Module 1: Geospatial Ingestion &amp; Feature Engineering Module</w:t>
         <w:br/>
-        <w:t>• Module 2: Stacking Ensemble Machine Learning Prediction Engine</w:t>
+        <w:t>• Module 2: Stacking Ensemble ML Prediction Engine</w:t>
         <w:br/>
-        <w:t>• Module 3: Academic EIA Multi-Method Evaluation Core</w:t>
+        <w:t>• Module 3: Multi-Method Academic EIA Evaluation Core</w:t>
         <w:br/>
         <w:t>• Module 4: 3D WebGL Physical Hazard Simulation Canvas</w:t>
         <w:br/>
-        <w:t>• Module 5: Automated PDF Report Generation and RESTful API Service</w:t>
+        <w:t>• Module 5: ReportLab PDF Compilation &amp; REST API Service</w:t>
       </w:r>
     </w:p>
     <w:p>
       <w:pPr>
         <w:pStyle w:val="Heading1"/>
-        <w:spacing w:before="280" w:after="120"/>
+        <w:spacing w:before="280" w:after="100"/>
       </w:pPr>
       <w:r>
-        <w:t>14 Geospatial Ingestion and Feature Engineering Module</w:t>
+        <w:rPr>
+          <w:rFonts w:ascii="Times New Roman" w:hAnsi="Times New Roman"/>
+          <w:color w:val="0A2540"/>
+        </w:rPr>
+        <w:t>14 Core Geospatial Data Ingestion Module</w:t>
       </w:r>
     </w:p>
     <w:p>
       <w:pPr>
-        <w:spacing w:after="120" w:line="276" w:lineRule="auto"/>
+        <w:spacing w:after="100" w:line="276" w:lineRule="auto"/>
       </w:pPr>
       <w:r>
-        <w:t>This module ingests and processes live spatial earth observation data:</w:t>
+        <w:t>The ingestion module executes asynchronous parallel spatial queries:</w:t>
         <w:br/>
-        <w:t>• Soil Subsoil Mechanics (ISRIC SoilGrids): Extracts bulk density (bdod), clay, sand, silt fractions, and pH across 0–30 cm depths. Calculates Terzaghi safe bearing capacity (kN/m²), shrink-swell potential, permeability, and soil corrosivity.</w:t>
+        <w:t>• ISRIC SoilGrids: Extracts bulk density (bdod), clay fraction, sand fraction, silt fraction, and pH across 0–30 cm depths to calculate Terzaghi safe bearing capacity (kN/m²), shrink-swell potential, and permeability.</w:t>
         <w:br/>
-        <w:t>• Meteorological Stress (NASA POWER Climatology): Retrieves 30-day precipitation indices, max wind speeds (km/h), relative humidity (%), extreme temperature fluctuations, and frost day frequencies.</w:t>
+        <w:t>• NASA POWER Climatology: Retrieves 30-day precipitation indices, max wind speeds (km/h), relative humidity (%), extreme temperature variations, and frost day frequencies.</w:t>
         <w:br/>
-        <w:t>• Waterways &amp; Hydrology (OpenStreetMap Overpass API): Computes geodesic distances to rivers, lakes, reservoirs, and coastlines.</w:t>
+        <w:t>• OpenStreetMap Overpass API: Computes exact geodesic distance to nearest rivers, lakes, coastlines, and floodplains.</w:t>
         <w:br/>
-        <w:t>• Geo-Hazard Atlas (BMTPC): Spatial KDTree mapping against historical building failure records, landslide hazard zones, and seismic acceleration maps.</w:t>
+        <w:t>• BMTPC Vulnerability Atlas: Spatial KDTree mapping against historical failure points, landslide hazard zones, and seismic acceleration maps.</w:t>
         <w:br/>
-        <w:t>• Ecological Sensitivity (GBIF &amp; MoEFCC): Measures proximity to national parks, wildlife sanctuaries, and elephant corridors, auditing 10 km Eco-Sensitive Zone (ESZ) buffers.</w:t>
+        <w:t>• GBIF &amp; MoEFCC Protected Area Database: Computes distance to nearest national parks, wildlife sanctuaries, and elephant corridors, verifying 10 km Eco-Sensitive Zone (ESZ) buffers.</w:t>
       </w:r>
     </w:p>
     <w:p>
       <w:pPr>
         <w:pStyle w:val="Heading1"/>
-        <w:spacing w:before="280" w:after="120"/>
+        <w:spacing w:before="280" w:after="100"/>
       </w:pPr>
       <w:r>
+        <w:rPr>
+          <w:rFonts w:ascii="Times New Roman" w:hAnsi="Times New Roman"/>
+          <w:color w:val="0A2540"/>
+        </w:rPr>
         <w:t>15 Machine Learning Prediction Engine</w:t>
       </w:r>
     </w:p>
     <w:p>
       <w:pPr>
-        <w:spacing w:after="120" w:line="276" w:lineRule="auto"/>
+        <w:spacing w:after="100" w:line="276" w:lineRule="auto"/>
       </w:pPr>
       <w:r>
         <w:t>The predictive core employs a Stacking Regressor architecture:</w:t>
         <w:br/>
         <w:t>• Base Estimators:</w:t>
         <w:br/>
-        <w:t xml:space="preserve">  - Random Forest Regressor (300 estimators, max depth = 16)</w:t>
+        <w:t xml:space="preserve">  1. Random Forest Regressor (300 estimators, max depth = 16)</w:t>
         <w:br/>
-        <w:t xml:space="preserve">  - XGBoost Regressor (250 estimators, learning rate = 0.05, subsample = 0.8)</w:t>
+        <w:t xml:space="preserve">  2. XGBoost Regressor (n_estimators = 250, learning_rate = 0.05, subsample = 0.8)</w:t>
         <w:br/>
-        <w:t xml:space="preserve">  - Extra Trees Regressor (200 estimators, min samples split = 4)</w:t>
+        <w:t xml:space="preserve">  3. Extra Trees Regressor (200 estimators, min_samples_split = 4)</w:t>
         <w:br/>
         <w:t>• Meta-Regressor: Ridge Regression with L2 regularization (alpha = 1.0)</w:t>
         <w:br/>
-        <w:t>• Performance Metrics: Achieves R² = 0.9123, MAE = ±1.99 points, and RMSE = 2.45 on 5-fold stratified cross-validation across 10,000+ pan-India geo-points.</w:t>
+        <w:t>• Performance: Achieves R² = 0.9123, MAE = ±1.99 points, and RMSE = 2.45 on 5-fold stratified cross-validation across 10,000+ pan-India geo-points.</w:t>
         <w:br/>
-        <w:t>• Foundation Recommendation: Maps effective bearing capacity and structural load weights to Isolated Footings, Strip Footings, Raft Foundations, or Deep Piles per IS 1904:1986.</w:t>
+        <w:t>• Foundation Recommendation Engine: Maps effective bearing capacity (accounting for building structural weight multipliers) to isolated footings, strip footings, raft foundations, or deep pile foundations per IS 1904:1986.</w:t>
       </w:r>
     </w:p>
     <w:p>
       <w:pPr>
         <w:pStyle w:val="Heading1"/>
-        <w:spacing w:before="280" w:after="120"/>
+        <w:spacing w:before="280" w:after="100"/>
       </w:pPr>
       <w:r>
+        <w:rPr>
+          <w:rFonts w:ascii="Times New Roman" w:hAnsi="Times New Roman"/>
+          <w:color w:val="0A2540"/>
+        </w:rPr>
         <w:t>16 Academic EIA 5-Method Evaluation Module</w:t>
       </w:r>
     </w:p>
     <w:p>
       <w:pPr>
-        <w:spacing w:after="120" w:line="276" w:lineRule="auto"/>
+        <w:spacing w:after="100" w:line="276" w:lineRule="auto"/>
       </w:pPr>
       <w:r>
-        <w:t>The platform implements all five standard Environmental Impact Assessment methodologies:</w:t>
+        <w:t>the system implements all five standard EIA methodologies with complete mathematical transparency:</w:t>
         <w:br/>
-        <w:t>1. Checklist Method: Weighted statutory compliance audit across 5 parameters:</w:t>
+        <w:t>1. Checklist Method: Evaluates 5 statutory parameters weighted per Indian Standards:</w:t>
         <w:br/>
         <w:t xml:space="preserve">   - Soil Bearing Capacity (25%)</w:t>
         <w:br/>
         <w:t xml:space="preserve">   - Seismic Hazard Audit (20%)</w:t>
         <w:br/>
-        <w:t xml:space="preserve">   - Flood &amp; Inundation Risk (20%)</w:t>
+        <w:t xml:space="preserve">   - Flood Exposure (20%)</w:t>
         <w:br/>
-        <w:t xml:space="preserve">   - MoEFCC Eco-Sensitive Buffer (20%)</w:t>
+        <w:t xml:space="preserve">   - Eco-Sensitive Buffer (20%)</w:t>
         <w:br/>
         <w:t xml:space="preserve">   - Soil Corrosivity / pH (15%)</w:t>
         <w:br/>
-        <w:t xml:space="preserve">   Compliance = Sum(Passed Parameter Weights), yielding explicit percentages (e.g. 60.0% for 3/5 PASS).</w:t>
+        <w:t xml:space="preserve">   Weighted Compliance = Sum of passed weights (e.g. 60.0% for 3/5 PASS).</w:t>
         <w:br/>
-        <w:t>2. Leopold Interaction Matrix: Evaluates a 5x5 interaction matrix between project actions and environmental receptors. Magnitude (M) is scored on [-10..+10] and Importance (I) on [1..10].</w:t>
+        <w:t>2. Leopold Interaction Matrix: Evaluates a 5x5 interaction grid between construction activities (excavation, substructure, superstructure, paving, occupancy) and environmental receptors (soil, hydrology, dynamic safety, runoff, ecology). Magnitude (M) is scored on [-10..+10] and Importance (I) on [1..10].</w:t>
         <w:br/>
         <w:t xml:space="preserve">   Normalized Leopold Index = 100 * (1 - (|Net Adverse Impact| / 190)).</w:t>
         <w:br/>
-        <w:t>3. Sorensen Network Method: Maps cause-condition-effect causal chains (e.g. Rainfall -&gt; Pore Pressure -&gt; Foundation Instability) with IS 1893:2016 engineered mitigations.</w:t>
+        <w:t>3. Sorensen Network Method: Maps cause-condition-effect causal pathways (e.g. Precipitation -&gt; Pore Pressure -&gt; Foundation Instability) with IS 1893:2016 engineered mitigations.</w:t>
         <w:br/>
-        <w:t>4. McHarg Spatial Overlay: Multi-criteria linear combination:</w:t>
+        <w:t>4. McHarg Spatial Overlay Model: Multi-criteria linear combination:</w:t>
         <w:br/>
         <w:t xml:space="preserve">   Composite Score = (0.35 * Soil) + (0.25 * Climate) + (0.25 * Hazard) + (0.15 * Eco).</w:t>
         <w:br/>
@@ -3590,20 +2756,24 @@
     <w:p>
       <w:pPr>
         <w:pStyle w:val="Heading1"/>
-        <w:spacing w:before="280" w:after="120"/>
+        <w:spacing w:before="280" w:after="100"/>
       </w:pPr>
       <w:r>
-        <w:t>17 3D Visual and Hazard Physical Simulation Module</w:t>
+        <w:rPr>
+          <w:rFonts w:ascii="Times New Roman" w:hAnsi="Times New Roman"/>
+          <w:color w:val="0A2540"/>
+        </w:rPr>
+        <w:t>17 3D Visual &amp; Hazard Physical Simulation Module</w:t>
       </w:r>
     </w:p>
     <w:p>
       <w:pPr>
-        <w:spacing w:after="120" w:line="276" w:lineRule="auto"/>
+        <w:spacing w:after="100" w:line="276" w:lineRule="auto"/>
       </w:pPr>
       <w:r>
         <w:t>Built on Three.js and WebGL, this module renders a 3D structural building model subjected to real-time physical environmental hazards:</w:t>
         <w:br/>
-        <w:t>• Flood Inundation Simulation: Dynamic rising water plane displaying inundation depth in meters and substructure immersion.</w:t>
+        <w:t>• Flood Inundation Simulation: Dynamic rising water plane with sub-surface transparency and wave agitation, displaying inundation depth in meters.</w:t>
         <w:br/>
         <w:t>• Earthquake Dynamic Oscillation: Harmonic lateral sinusoidal displacement of building storeys with damping decay curves per IS 1893:2016.</w:t>
         <w:br/>
@@ -3615,65 +2785,73 @@
     <w:p>
       <w:pPr>
         <w:pStyle w:val="Heading1"/>
-        <w:spacing w:before="280" w:after="120"/>
+        <w:spacing w:before="280" w:after="100"/>
       </w:pPr>
       <w:r>
-        <w:t>18 Technology Stack</w:t>
+        <w:rPr>
+          <w:rFonts w:ascii="Times New Roman" w:hAnsi="Times New Roman"/>
+          <w:color w:val="0A2540"/>
+        </w:rPr>
+        <w:t>18 Technology Stack Overview</w:t>
       </w:r>
     </w:p>
     <w:p>
       <w:pPr>
-        <w:spacing w:after="120" w:line="276" w:lineRule="auto"/>
+        <w:spacing w:after="100" w:line="276" w:lineRule="auto"/>
       </w:pPr>
       <w:r>
-        <w:t>The software stack combines modern open-source web technologies and Python machine learning libraries:</w:t>
+        <w:t>The software stack combines modern open-source web technologies and high-performance Python machine learning libraries:</w:t>
         <w:br/>
-        <w:t>• Frontend: HTML5, Vanilla CSS3 (Custom Design System), JavaScript (ES6+), Leaflet GIS, Three.js WebGL.</w:t>
+        <w:t>• Frontend: HTML5, Vanilla CSS3 (Custom Design Tokens), JavaScript (ES6+), Leaflet GIS, Three.js WebGL.</w:t>
         <w:br/>
         <w:t>• Backend: Python 3.11, Flask WSGI Framework, Gunicorn Server, Werkzeug, PyJWT, Flask-Limiter, ReportLab PDF Engine.</w:t>
         <w:br/>
         <w:t>• Machine Learning: Scikit-Learn, XGBoost, SHAP, NumPy, Pandas, SciPy, PyTorch.</w:t>
         <w:br/>
-        <w:t>• Geospatial Data Sources: Leaflet.js, OpenStreetMap, ISRIC SoilGrids, NASA POWER, BMTPC Atlas.</w:t>
+        <w:t>• Geospatial &amp; Mapping: Leaflet.js, OpenStreetMap, CartoDB, Esri Satellite Tiles, Haversine Spatial Geodesics.</w:t>
         <w:br/>
-        <w:t>• Cloud Deployment: Render Cloud Infrastructure, Gunicorn WSGI container.</w:t>
+        <w:t>• Deployment: Render Cloud Infrastructure, Git Version Control, Gunicorn WSGI container.</w:t>
       </w:r>
     </w:p>
     <w:p>
       <w:pPr>
         <w:pStyle w:val="Heading1"/>
-        <w:spacing w:before="280" w:after="120"/>
+        <w:spacing w:before="280" w:after="100"/>
       </w:pPr>
       <w:r>
-        <w:t>19 Frontend Technologies</w:t>
+        <w:rPr>
+          <w:rFonts w:ascii="Times New Roman" w:hAnsi="Times New Roman"/>
+          <w:color w:val="0A2540"/>
+        </w:rPr>
+        <w:t>19 Frontend Technologies &amp; Visual System</w:t>
       </w:r>
     </w:p>
     <w:p>
       <w:pPr>
-        <w:spacing w:after="120" w:line="276" w:lineRule="auto"/>
+        <w:spacing w:after="100" w:line="276" w:lineRule="auto"/>
       </w:pPr>
       <w:r>
         <w:rPr>
           <w:b/>
-          <w:color w:val="0F172A"/>
-          <w:sz w:val="23"/>
+          <w:color w:val="1E3A8A"/>
+          <w:sz w:val="22"/>
         </w:rPr>
-        <w:t>19.1 HTML5 and Vanilla CSS Design System</w:t>
+        <w:t>19.1 HTML5 &amp; Vanilla CSS Modular Design System</w:t>
         <w:br/>
       </w:r>
       <w:r>
-        <w:t>Built without bulky third-party CSS frameworks to guarantee ultra-fast load times (&lt;100ms) and maximum aesthetic control. Utilizes a curated dark-mode palette featuring deep midnight slate (#0A0F1D), cyan accent gradients (#06B6D4 to #3B82F6), glassmorphism cards, and smooth CSS transitions.</w:t>
+        <w:t>Designed without bulky third-party CSS frameworks to guarantee ultra-fast load times (&lt;100ms) and maximum aesthetic control. Utilizes a curated dark-mode palette featuring deep midnight slate (#0A0F1D), cyan accent gradients (#06B6D4 to #3B82F6), glassmorphism cards, and smooth CSS cubic-bezier transitions.</w:t>
       </w:r>
     </w:p>
     <w:p>
       <w:pPr>
-        <w:spacing w:after="120" w:line="276" w:lineRule="auto"/>
+        <w:spacing w:after="100" w:line="276" w:lineRule="auto"/>
       </w:pPr>
       <w:r>
         <w:rPr>
           <w:b/>
-          <w:color w:val="0F172A"/>
-          <w:sz w:val="23"/>
+          <w:color w:val="1E3A8A"/>
+          <w:sz w:val="22"/>
         </w:rPr>
         <w:t>19.2 JavaScript ES6+ Reactive Client Engine</w:t>
         <w:br/>
@@ -3684,15 +2862,15 @@
     </w:p>
     <w:p>
       <w:pPr>
-        <w:spacing w:after="120" w:line="276" w:lineRule="auto"/>
+        <w:spacing w:after="100" w:line="276" w:lineRule="auto"/>
       </w:pPr>
       <w:r>
         <w:rPr>
           <w:b/>
-          <w:color w:val="0F172A"/>
-          <w:sz w:val="23"/>
+          <w:color w:val="1E3A8A"/>
+          <w:sz w:val="22"/>
         </w:rPr>
-        <w:t>19.3 Leaflet GIS and Satellite Tile Layers</w:t>
+        <w:t>19.3 Leaflet GIS &amp; Satellite Tile Layers</w:t>
         <w:br/>
       </w:r>
       <w:r>
@@ -3701,13 +2879,13 @@
     </w:p>
     <w:p>
       <w:pPr>
-        <w:spacing w:after="120" w:line="276" w:lineRule="auto"/>
+        <w:spacing w:after="100" w:line="276" w:lineRule="auto"/>
       </w:pPr>
       <w:r>
         <w:rPr>
           <w:b/>
-          <w:color w:val="0F172A"/>
-          <w:sz w:val="23"/>
+          <w:color w:val="1E3A8A"/>
+          <w:sz w:val="22"/>
         </w:rPr>
         <w:t>19.4 Three.js WebGL 3D Simulation Engine</w:t>
         <w:br/>
@@ -3719,23 +2897,27 @@
     <w:p>
       <w:pPr>
         <w:pStyle w:val="Heading1"/>
-        <w:spacing w:before="280" w:after="120"/>
+        <w:spacing w:before="280" w:after="100"/>
       </w:pPr>
       <w:r>
-        <w:t>20 Backend Technologies</w:t>
+        <w:rPr>
+          <w:rFonts w:ascii="Times New Roman" w:hAnsi="Times New Roman"/>
+          <w:color w:val="0A2540"/>
+        </w:rPr>
+        <w:t>20 Backend Technologies &amp; ML Services</w:t>
       </w:r>
     </w:p>
     <w:p>
       <w:pPr>
-        <w:spacing w:after="120" w:line="276" w:lineRule="auto"/>
+        <w:spacing w:after="100" w:line="276" w:lineRule="auto"/>
       </w:pPr>
       <w:r>
         <w:rPr>
           <w:b/>
-          <w:color w:val="0F172A"/>
-          <w:sz w:val="23"/>
+          <w:color w:val="1E3A8A"/>
+          <w:sz w:val="22"/>
         </w:rPr>
-        <w:t>20.1 Python 3.11</w:t>
+        <w:t>20.1 Python 3.11 Execution Environment</w:t>
         <w:br/>
       </w:r>
       <w:r>
@@ -3744,15 +2926,15 @@
     </w:p>
     <w:p>
       <w:pPr>
-        <w:spacing w:after="120" w:line="276" w:lineRule="auto"/>
+        <w:spacing w:after="100" w:line="276" w:lineRule="auto"/>
       </w:pPr>
       <w:r>
         <w:rPr>
           <w:b/>
-          <w:color w:val="0F172A"/>
-          <w:sz w:val="23"/>
+          <w:color w:val="1E3A8A"/>
+          <w:sz w:val="22"/>
         </w:rPr>
-        <w:t>20.2 Flask WSGI Framework</w:t>
+        <w:t>20.2 Flask WSGI RESTful Framework</w:t>
         <w:br/>
       </w:r>
       <w:r>
@@ -3761,15 +2943,15 @@
     </w:p>
     <w:p>
       <w:pPr>
-        <w:spacing w:after="120" w:line="276" w:lineRule="auto"/>
+        <w:spacing w:after="100" w:line="276" w:lineRule="auto"/>
       </w:pPr>
       <w:r>
         <w:rPr>
           <w:b/>
-          <w:color w:val="0F172A"/>
-          <w:sz w:val="23"/>
+          <w:color w:val="1E3A8A"/>
+          <w:sz w:val="22"/>
         </w:rPr>
-        <w:t>20.3 Gunicorn Web Server</w:t>
+        <w:t>20.3 Gunicorn Production Web Server</w:t>
         <w:br/>
       </w:r>
       <w:r>
@@ -3778,15 +2960,15 @@
     </w:p>
     <w:p>
       <w:pPr>
-        <w:spacing w:after="120" w:line="276" w:lineRule="auto"/>
+        <w:spacing w:after="100" w:line="276" w:lineRule="auto"/>
       </w:pPr>
       <w:r>
         <w:rPr>
           <w:b/>
-          <w:color w:val="0F172A"/>
-          <w:sz w:val="23"/>
+          <w:color w:val="1E3A8A"/>
+          <w:sz w:val="22"/>
         </w:rPr>
-        <w:t>20.4 JWT Authentication and Security Middleware</w:t>
+        <w:t>20.4 JWT Authentication &amp; Security Middleware</w:t>
         <w:br/>
       </w:r>
       <w:r>
@@ -3796,15 +2978,19 @@
     <w:p>
       <w:pPr>
         <w:pStyle w:val="Heading1"/>
-        <w:spacing w:before="280" w:after="120"/>
+        <w:spacing w:before="280" w:after="100"/>
       </w:pPr>
       <w:r>
-        <w:t>21 Database Design</w:t>
+        <w:rPr>
+          <w:rFonts w:ascii="Times New Roman" w:hAnsi="Times New Roman"/>
+          <w:color w:val="0A2540"/>
+        </w:rPr>
+        <w:t>21 Database &amp; Feature Store Design</w:t>
       </w:r>
     </w:p>
     <w:p>
       <w:pPr>
-        <w:spacing w:after="120" w:line="276" w:lineRule="auto"/>
+        <w:spacing w:after="100" w:line="276" w:lineRule="auto"/>
       </w:pPr>
       <w:r>
         <w:t>The application incorporates a hybrid data architecture:</w:t>
@@ -3817,15 +3003,19 @@
     <w:p>
       <w:pPr>
         <w:pStyle w:val="Heading1"/>
-        <w:spacing w:before="280" w:after="120"/>
+        <w:spacing w:before="280" w:after="100"/>
       </w:pPr>
       <w:r>
-        <w:t>22 Detailed Database Schema</w:t>
+        <w:rPr>
+          <w:rFonts w:ascii="Times New Roman" w:hAnsi="Times New Roman"/>
+          <w:color w:val="0A2540"/>
+        </w:rPr>
+        <w:t>22 Detailed Database Schema &amp; Metadata Dictionary</w:t>
       </w:r>
     </w:p>
     <w:p>
       <w:pPr>
-        <w:spacing w:after="120" w:line="276" w:lineRule="auto"/>
+        <w:spacing w:after="100" w:line="276" w:lineRule="auto"/>
       </w:pPr>
       <w:r>
         <w:t>Key Database Entities:</w:t>
@@ -3840,15 +3030,19 @@
     <w:p>
       <w:pPr>
         <w:pStyle w:val="Heading1"/>
-        <w:spacing w:before="280" w:after="120"/>
+        <w:spacing w:before="280" w:after="100"/>
       </w:pPr>
       <w:r>
-        <w:t>23 Database and Data Flow</w:t>
+        <w:rPr>
+          <w:rFonts w:ascii="Times New Roman" w:hAnsi="Times New Roman"/>
+          <w:color w:val="0A2540"/>
+        </w:rPr>
+        <w:t>23 Data Flow &amp; Geospatial ETL Pipeline</w:t>
       </w:r>
     </w:p>
     <w:p>
       <w:pPr>
-        <w:spacing w:after="120" w:line="276" w:lineRule="auto"/>
+        <w:spacing w:after="100" w:line="276" w:lineRule="auto"/>
       </w:pPr>
       <w:r>
         <w:t>The data flow follows a 6-stage lifecycle:</w:t>
@@ -3869,15 +3063,19 @@
     <w:p>
       <w:pPr>
         <w:pStyle w:val="Heading1"/>
-        <w:spacing w:before="280" w:after="120"/>
+        <w:spacing w:before="280" w:after="100"/>
       </w:pPr>
       <w:r>
-        <w:t>24 API Endpoint Reference</w:t>
+        <w:rPr>
+          <w:rFonts w:ascii="Times New Roman" w:hAnsi="Times New Roman"/>
+          <w:color w:val="0A2540"/>
+        </w:rPr>
+        <w:t>24 RESTful API Endpoint Reference</w:t>
       </w:r>
     </w:p>
     <w:p>
       <w:pPr>
-        <w:spacing w:after="120" w:line="276" w:lineRule="auto"/>
+        <w:spacing w:after="100" w:line="276" w:lineRule="auto"/>
       </w:pPr>
       <w:r>
         <w:t>Key API Endpoints:</w:t>
@@ -3896,18 +3094,22 @@
     <w:p>
       <w:pPr>
         <w:pStyle w:val="Heading1"/>
-        <w:spacing w:before="280" w:after="120"/>
+        <w:spacing w:before="280" w:after="100"/>
       </w:pPr>
       <w:r>
-        <w:t>25 Indian Engineering Standards Compliance</w:t>
+        <w:rPr>
+          <w:rFonts w:ascii="Times New Roman" w:hAnsi="Times New Roman"/>
+          <w:color w:val="0A2540"/>
+        </w:rPr>
+        <w:t>25 Indian Engineering Standards Compliance (IS Codes)</w:t>
       </w:r>
     </w:p>
     <w:p>
       <w:pPr>
-        <w:spacing w:after="120" w:line="276" w:lineRule="auto"/>
+        <w:spacing w:after="100" w:line="276" w:lineRule="auto"/>
       </w:pPr>
       <w:r>
-        <w:t>The platform embeds strict compliance rules derived from official Bureau of Indian Standards (BIS) and MoEFCC codes:</w:t>
+        <w:t>the system embeds strict compliance rules derived from official Bureau of Indian Standards (BIS) and MoEFCC codes:</w:t>
         <w:br/>
         <w:t>• IS 1904:1986 / 2021: Code of practice for design and construction of foundations in soils (Safe Bearing Capacity thresholds: &gt;=100 kN/m² for footings, &lt;60 kN/m² for raft/piles).</w:t>
         <w:br/>
@@ -3925,15 +3127,19 @@
     <w:p>
       <w:pPr>
         <w:pStyle w:val="Heading1"/>
-        <w:spacing w:before="280" w:after="120"/>
+        <w:spacing w:before="280" w:after="100"/>
       </w:pPr>
       <w:r>
-        <w:t>26 Mathematical Consistency and Normalization Logic</w:t>
+        <w:rPr>
+          <w:rFonts w:ascii="Times New Roman" w:hAnsi="Times New Roman"/>
+          <w:color w:val="0A2540"/>
+        </w:rPr>
+        <w:t>26 Mathematical Consistency &amp; Normalization Logic</w:t>
       </w:r>
     </w:p>
     <w:p>
       <w:pPr>
-        <w:spacing w:after="120" w:line="276" w:lineRule="auto"/>
+        <w:spacing w:after="100" w:line="276" w:lineRule="auto"/>
       </w:pPr>
       <w:r>
         <w:t>To eliminate arbitrary scoring and guarantee scientific rigor:</w:t>
@@ -3950,23 +3156,27 @@
     <w:p>
       <w:pPr>
         <w:pStyle w:val="Heading1"/>
-        <w:spacing w:before="280" w:after="120"/>
+        <w:spacing w:before="280" w:after="100"/>
       </w:pPr>
       <w:r>
-        <w:t>27 Authentication and Security</w:t>
+        <w:rPr>
+          <w:rFonts w:ascii="Times New Roman" w:hAnsi="Times New Roman"/>
+          <w:color w:val="0A2540"/>
+        </w:rPr>
+        <w:t>27 Authentication, Security &amp; Rate Limiting</w:t>
       </w:r>
     </w:p>
     <w:p>
       <w:pPr>
-        <w:spacing w:after="120" w:line="276" w:lineRule="auto"/>
+        <w:spacing w:after="100" w:line="276" w:lineRule="auto"/>
       </w:pPr>
       <w:r>
         <w:rPr>
           <w:b/>
-          <w:color w:val="0F172A"/>
-          <w:sz w:val="23"/>
+          <w:color w:val="1E3A8A"/>
+          <w:sz w:val="22"/>
         </w:rPr>
-        <w:t>27.1 Security Practices</w:t>
+        <w:t>27.1 Security Best Practices &amp; Data Validation</w:t>
         <w:br/>
       </w:r>
       <w:r>
@@ -3982,15 +3192,19 @@
     <w:p>
       <w:pPr>
         <w:pStyle w:val="Heading1"/>
-        <w:spacing w:before="280" w:after="120"/>
+        <w:spacing w:before="280" w:after="100"/>
       </w:pPr>
       <w:r>
-        <w:t>28 Functional Requirements</w:t>
+        <w:rPr>
+          <w:rFonts w:ascii="Times New Roman" w:hAnsi="Times New Roman"/>
+          <w:color w:val="0A2540"/>
+        </w:rPr>
+        <w:t>28 Functional Requirements Specification</w:t>
       </w:r>
     </w:p>
     <w:p>
       <w:pPr>
-        <w:spacing w:after="120" w:line="276" w:lineRule="auto"/>
+        <w:spacing w:after="100" w:line="276" w:lineRule="auto"/>
       </w:pPr>
       <w:r>
         <w:t>• FR-01: System shall allow geographic coordinate input via interactive map click or coordinate search box.</w:t>
@@ -4011,49 +3225,57 @@
     <w:p>
       <w:pPr>
         <w:pStyle w:val="Heading1"/>
-        <w:spacing w:before="280" w:after="120"/>
+        <w:spacing w:before="280" w:after="100"/>
       </w:pPr>
       <w:r>
-        <w:t>29 Non-Functional Requirements</w:t>
+        <w:rPr>
+          <w:rFonts w:ascii="Times New Roman" w:hAnsi="Times New Roman"/>
+          <w:color w:val="0A2540"/>
+        </w:rPr>
+        <w:t>29 Non-Functional Requirements Specification</w:t>
       </w:r>
     </w:p>
     <w:p>
       <w:pPr>
-        <w:spacing w:after="120" w:line="276" w:lineRule="auto"/>
+        <w:spacing w:after="100" w:line="276" w:lineRule="auto"/>
       </w:pPr>
       <w:r>
         <w:rPr>
           <w:b/>
-          <w:color w:val="0F172A"/>
-          <w:sz w:val="23"/>
+          <w:color w:val="1E3A8A"/>
+          <w:sz w:val="22"/>
         </w:rPr>
-        <w:t>29.1 Usability: Clean, high-contrast dark-mode interface with responsive design across desktop and mobile.</w:t>
+        <w:t>29.1 Usability &amp; Accessibility: Clean, high-contrast dark-mode interface with responsive design across desktop and mobile.</w:t>
         <w:br/>
       </w:r>
       <w:r>
-        <w:t>29.2 Performance: Complete end-to-end analysis turnaround under 3.0 seconds under normal network conditions.</w:t>
+        <w:t>29.2 Performance &amp; Latency: Complete end-to-end analysis turnaround under 3.0 seconds under normal network conditions.</w:t>
         <w:br/>
-        <w:t>29.3 Reliability: Automatic fallback to local spatial KDTrees if external satellite APIs timeout.</w:t>
+        <w:t>29.3 Reliability &amp; Fault Tolerance: Automatic fallback to local spatial KDTrees if external satellite APIs timeout.</w:t>
         <w:br/>
-        <w:t>29.4 Security: Full CSRF, SQL injection, and XSS sanitization.</w:t>
+        <w:t>29.4 Security &amp; Integrity: Full CSRF, SQL injection, and XSS sanitization.</w:t>
         <w:br/>
-        <w:t>29.5 Maintainability: Decoupled frontend templates, modular Python backend services, and clean docstrings.</w:t>
+        <w:t>29.5 Maintainability &amp; Modularity: Decoupled frontend templates, modular Python backend services, and clean docstrings.</w:t>
         <w:br/>
-        <w:t>29.6 Scalability: Stateless WSGI architecture ready for multi-instance container scaling on Render/AWS.</w:t>
+        <w:t>29.6 Scalability &amp; Cloud Readiness: Stateless WSGI architecture ready for multi-instance container scaling on Render/AWS.</w:t>
       </w:r>
     </w:p>
     <w:p>
       <w:pPr>
         <w:pStyle w:val="Heading1"/>
-        <w:spacing w:before="280" w:after="120"/>
+        <w:spacing w:before="280" w:after="100"/>
       </w:pPr>
       <w:r>
+        <w:rPr>
+          <w:rFonts w:ascii="Times New Roman" w:hAnsi="Times New Roman"/>
+          <w:color w:val="0A2540"/>
+        </w:rPr>
         <w:t>30 Hardware Requirements</w:t>
       </w:r>
     </w:p>
     <w:p>
       <w:pPr>
-        <w:spacing w:after="120" w:line="276" w:lineRule="auto"/>
+        <w:spacing w:after="100" w:line="276" w:lineRule="auto"/>
       </w:pPr>
       <w:r>
         <w:t>• Server / Cloud Environment: Minimum 1 vCPU (2.0 GHz+), 1 GB RAM, 2 GB SSD storage (Render Free / Starter tier).</w:t>
@@ -4064,15 +3286,19 @@
     <w:p>
       <w:pPr>
         <w:pStyle w:val="Heading1"/>
-        <w:spacing w:before="280" w:after="120"/>
+        <w:spacing w:before="280" w:after="100"/>
       </w:pPr>
       <w:r>
-        <w:t>31 Software Requirements</w:t>
+        <w:rPr>
+          <w:rFonts w:ascii="Times New Roman" w:hAnsi="Times New Roman"/>
+          <w:color w:val="0A2540"/>
+        </w:rPr>
+        <w:t>31 Software &amp; Dependency Requirements</w:t>
       </w:r>
     </w:p>
     <w:p>
       <w:pPr>
-        <w:spacing w:after="120" w:line="276" w:lineRule="auto"/>
+        <w:spacing w:after="100" w:line="276" w:lineRule="auto"/>
       </w:pPr>
       <w:r>
         <w:t>• Operating System: Windows 10/11, Ubuntu 22.04 LTS, or macOS.</w:t>
@@ -4087,21 +3313,25 @@
     <w:p>
       <w:pPr>
         <w:pStyle w:val="Heading1"/>
-        <w:spacing w:before="280" w:after="120"/>
+        <w:spacing w:before="280" w:after="100"/>
       </w:pPr>
       <w:r>
+        <w:rPr>
+          <w:rFonts w:ascii="Times New Roman" w:hAnsi="Times New Roman"/>
+          <w:color w:val="0A2540"/>
+        </w:rPr>
         <w:t>32 Feasibility Analysis</w:t>
       </w:r>
     </w:p>
     <w:p>
       <w:pPr>
-        <w:spacing w:after="120" w:line="276" w:lineRule="auto"/>
+        <w:spacing w:after="100" w:line="276" w:lineRule="auto"/>
       </w:pPr>
       <w:r>
         <w:rPr>
           <w:b/>
-          <w:color w:val="0F172A"/>
-          <w:sz w:val="23"/>
+          <w:color w:val="1E3A8A"/>
+          <w:sz w:val="22"/>
         </w:rPr>
         <w:t>32.1 Technical Feasibility: The integration of established open APIs, open-source machine learning frameworks, and modern WebGL standards confirms robust technical feasibility without proprietary licensing constraints.</w:t>
         <w:br/>
@@ -4115,23 +3345,27 @@
     <w:p>
       <w:pPr>
         <w:pStyle w:val="Heading1"/>
-        <w:spacing w:before="280" w:after="120"/>
+        <w:spacing w:before="280" w:after="100"/>
       </w:pPr>
       <w:r>
-        <w:t>33 Implementation</w:t>
+        <w:rPr>
+          <w:rFonts w:ascii="Times New Roman" w:hAnsi="Times New Roman"/>
+          <w:color w:val="0A2540"/>
+        </w:rPr>
+        <w:t>33 Implementation &amp; Development Approach</w:t>
       </w:r>
     </w:p>
     <w:p>
       <w:pPr>
-        <w:spacing w:after="120" w:line="276" w:lineRule="auto"/>
+        <w:spacing w:after="100" w:line="276" w:lineRule="auto"/>
       </w:pPr>
       <w:r>
         <w:rPr>
           <w:b/>
-          <w:color w:val="0F172A"/>
-          <w:sz w:val="23"/>
+          <w:color w:val="1E3A8A"/>
+          <w:sz w:val="22"/>
         </w:rPr>
-        <w:t>33.1 Development Approach</w:t>
+        <w:t>33.1 Iterative Agile Engineering Pipeline</w:t>
         <w:br/>
       </w:r>
       <w:r>
@@ -4153,20 +3387,24 @@
     <w:p>
       <w:pPr>
         <w:pStyle w:val="Heading1"/>
-        <w:spacing w:before="280" w:after="120"/>
+        <w:spacing w:before="280" w:after="100"/>
       </w:pPr>
       <w:r>
-        <w:t>34 User Interface and Results</w:t>
+        <w:rPr>
+          <w:rFonts w:ascii="Times New Roman" w:hAnsi="Times New Roman"/>
+          <w:color w:val="0A2540"/>
+        </w:rPr>
+        <w:t>34 User Interface, Dashboard &amp; Visual Results</w:t>
       </w:r>
     </w:p>
     <w:p>
       <w:pPr>
-        <w:spacing w:after="120" w:line="276" w:lineRule="auto"/>
+        <w:spacing w:after="100" w:line="276" w:lineRule="auto"/>
       </w:pPr>
       <w:r>
-        <w:t>The dashboard features a multi-tiered layout:</w:t>
+        <w:t>The the system dashboard features a multi-tiered layout:</w:t>
         <w:br/>
-        <w:t>• Top Navigation: Branding, Status Indicators, and Navigation Tabs.</w:t>
+        <w:t>• Top Navigation: Branding, Hackathon Award Badge, Status Indicators, and Navigation Tabs.</w:t>
         <w:br/>
         <w:t>• Main Layout: Split-screen interface with interactive Leaflet map on the left and structural parameter controls on the right.</w:t>
         <w:br/>
@@ -4178,15 +3416,19 @@
     <w:p>
       <w:pPr>
         <w:pStyle w:val="Heading1"/>
-        <w:spacing w:before="280" w:after="120"/>
+        <w:spacing w:before="280" w:after="100"/>
       </w:pPr>
       <w:r>
-        <w:t>35 Patrol Results and Reporting</w:t>
+        <w:rPr>
+          <w:rFonts w:ascii="Times New Roman" w:hAnsi="Times New Roman"/>
+          <w:color w:val="0A2540"/>
+        </w:rPr>
+        <w:t>35 EIA Evaluation Results &amp; Reporting</w:t>
       </w:r>
     </w:p>
     <w:p>
       <w:pPr>
-        <w:spacing w:after="120" w:line="276" w:lineRule="auto"/>
+        <w:spacing w:after="100" w:line="276" w:lineRule="auto"/>
       </w:pPr>
       <w:r>
         <w:t>The EIA evaluation outputs comprehensive quantitative tables:</w:t>
@@ -4201,83 +3443,93 @@
     <w:p>
       <w:pPr>
         <w:pStyle w:val="Heading1"/>
-        <w:spacing w:before="280" w:after="120"/>
+        <w:spacing w:before="280" w:after="100"/>
       </w:pPr>
       <w:r>
-        <w:t>36 Web Application Flow — Login and Session Handling</w:t>
+        <w:rPr>
+          <w:rFonts w:ascii="Times New Roman" w:hAnsi="Times New Roman"/>
+          <w:color w:val="0A2540"/>
+        </w:rPr>
+        <w:t>36 Web Application Flow — Map Geocoding &amp; Input Handling</w:t>
       </w:r>
     </w:p>
     <w:p>
       <w:pPr>
-        <w:spacing w:after="120" w:line="276" w:lineRule="auto"/>
+        <w:spacing w:after="100" w:line="276" w:lineRule="auto"/>
       </w:pPr>
       <w:r>
         <w:rPr>
           <w:b/>
-          <w:color w:val="0F172A"/>
-          <w:sz w:val="23"/>
+          <w:color w:val="1E3A8A"/>
+          <w:sz w:val="22"/>
         </w:rPr>
-        <w:t>1. User logs into the application using email and password credentials.</w:t>
+        <w:t>1. User enters a location name in the geocoding search bar or clicks on the interactive Leaflet map.</w:t>
         <w:br/>
       </w:r>
       <w:r>
-        <w:t>2. Flask backend verifies password hash using PBKDF2 with SHA-256 and generates a secure JWT access token.</w:t>
+        <w:t>2. Map smoothly pans to coordinates with an animated cyan pulsing marker.</w:t>
         <w:br/>
-        <w:t>3. Access token is stored in client session memory, authorizing subsequent API calls.</w:t>
+        <w:t>3. User selects proposed Building Type (House, Apartment, Hospital, School, Bridge, Factory, Mall) and Storey Height.</w:t>
         <w:br/>
-        <w:t>4. Session state automatically refreshes upon user activity.</w:t>
+        <w:t>4. User clicks 'Run AI &amp; EIA Analysis', initiating the backend evaluation workflow.</w:t>
       </w:r>
     </w:p>
     <w:p>
       <w:pPr>
         <w:pStyle w:val="Heading1"/>
-        <w:spacing w:before="280" w:after="120"/>
+        <w:spacing w:before="280" w:after="100"/>
       </w:pPr>
       <w:r>
-        <w:t>37 Web Application Flow — Dashboard, Reports and Analysis</w:t>
+        <w:rPr>
+          <w:rFonts w:ascii="Times New Roman" w:hAnsi="Times New Roman"/>
+          <w:color w:val="0A2540"/>
+        </w:rPr>
+        <w:t>37 Web Application Flow — Analysis, Reports &amp; PDF Dossier</w:t>
       </w:r>
     </w:p>
     <w:p>
       <w:pPr>
-        <w:spacing w:after="120" w:line="276" w:lineRule="auto"/>
+        <w:spacing w:after="100" w:line="276" w:lineRule="auto"/>
       </w:pPr>
       <w:r>
         <w:rPr>
           <w:b/>
-          <w:color w:val="0F172A"/>
-          <w:sz w:val="23"/>
+          <w:color w:val="1E3A8A"/>
+          <w:sz w:val="22"/>
         </w:rPr>
-        <w:t>1. User enters a location name or clicks on the interactive Leaflet map.</w:t>
+        <w:t>1. Client displays an animated skeleton loading state during computation.</w:t>
         <w:br/>
       </w:r>
       <w:r>
-        <w:t>2. User selects proposed Building Type and Storey Height.</w:t>
+        <w:t>2. Backend processes spatial data and returns verified JSON payload in ~2.5 seconds.</w:t>
         <w:br/>
-        <w:t>3. User clicks 'Run AI &amp; EIA Analysis', initiating the backend evaluation workflow.</w:t>
+        <w:t>3. DOM dynamically populates score cards, domain radars, SHAP contribution charts, and EIA tables.</w:t>
         <w:br/>
-        <w:t>4. DOM dynamically populates score cards, domain radars, SHAP contribution charts, and EIA tables.</w:t>
-        <w:br/>
-        <w:t>5. User clicks '📄 Download Official Report' to trigger server-side ReportLab PDF generation, downloading a complete engineering dossier.</w:t>
+        <w:t>4. User clicks '📄 Download Official Report' to trigger server-side ReportLab PDF generation, downloading a complete engineering dossier.</w:t>
       </w:r>
     </w:p>
     <w:p>
       <w:pPr>
         <w:pStyle w:val="Heading1"/>
-        <w:spacing w:before="280" w:after="120"/>
+        <w:spacing w:before="280" w:after="100"/>
       </w:pPr>
       <w:r>
-        <w:t>38 3D Simulation Flow — Hazard Stress Testing</w:t>
+        <w:rPr>
+          <w:rFonts w:ascii="Times New Roman" w:hAnsi="Times New Roman"/>
+          <w:color w:val="0A2540"/>
+        </w:rPr>
+        <w:t>38 3D Simulation Flow — Interactive Physical Hazard Testing</w:t>
       </w:r>
     </w:p>
     <w:p>
       <w:pPr>
-        <w:spacing w:after="120" w:line="276" w:lineRule="auto"/>
+        <w:spacing w:after="100" w:line="276" w:lineRule="auto"/>
       </w:pPr>
       <w:r>
         <w:rPr>
           <w:b/>
-          <w:color w:val="0F172A"/>
-          <w:sz w:val="23"/>
+          <w:color w:val="1E3A8A"/>
+          <w:sz w:val="22"/>
         </w:rPr>
         <w:t>1. User navigates to `/visualization` or clicks '🎮 Launch 3D Simulation'.</w:t>
         <w:br/>
@@ -4299,15 +3551,19 @@
     <w:p>
       <w:pPr>
         <w:pStyle w:val="Heading1"/>
-        <w:spacing w:before="280" w:after="120"/>
+        <w:spacing w:before="280" w:after="100"/>
       </w:pPr>
       <w:r>
-        <w:t>39 Verification and Validation Flow — Case Studies</w:t>
+        <w:rPr>
+          <w:rFonts w:ascii="Times New Roman" w:hAnsi="Times New Roman"/>
+          <w:color w:val="0A2540"/>
+        </w:rPr>
+        <w:t>39 Verification &amp; Validation Case Studies</w:t>
       </w:r>
     </w:p>
     <w:p>
       <w:pPr>
-        <w:spacing w:after="120" w:line="276" w:lineRule="auto"/>
+        <w:spacing w:after="100" w:line="276" w:lineRule="auto"/>
       </w:pPr>
       <w:r>
         <w:t>Case Study 1: Coastal Beach Location (Chennai — Lat: 12.9340, Lon: 80.2592)</w:t>
@@ -4325,7 +3581,7 @@
     </w:p>
     <w:p>
       <w:pPr>
-        <w:spacing w:after="120" w:line="276" w:lineRule="auto"/>
+        <w:spacing w:after="100" w:line="276" w:lineRule="auto"/>
       </w:pPr>
       <w:r>
         <w:t>Case Study 2: Inland Plateau Location (Bengaluru — Lat: 12.9716, Lon: 77.5946)</w:t>
@@ -4340,15 +3596,19 @@
     <w:p>
       <w:pPr>
         <w:pStyle w:val="Heading1"/>
-        <w:spacing w:before="280" w:after="120"/>
+        <w:spacing w:before="280" w:after="100"/>
       </w:pPr>
       <w:r>
-        <w:t>40 Testing and Test Cases</w:t>
+        <w:rPr>
+          <w:rFonts w:ascii="Times New Roman" w:hAnsi="Times New Roman"/>
+          <w:color w:val="0A2540"/>
+        </w:rPr>
+        <w:t>40 Testing &amp; Verification Test Suite</w:t>
       </w:r>
     </w:p>
     <w:p>
       <w:pPr>
-        <w:spacing w:after="120" w:line="276" w:lineRule="auto"/>
+        <w:spacing w:after="100" w:line="276" w:lineRule="auto"/>
       </w:pPr>
       <w:r>
         <w:t>The system underwent rigorous testing across four testing tiers:</w:t>
@@ -4365,15 +3625,19 @@
     <w:p>
       <w:pPr>
         <w:pStyle w:val="Heading1"/>
-        <w:spacing w:before="280" w:after="120"/>
+        <w:spacing w:before="280" w:after="100"/>
       </w:pPr>
       <w:r>
-        <w:t>41 Detailed Results</w:t>
+        <w:rPr>
+          <w:rFonts w:ascii="Times New Roman" w:hAnsi="Times New Roman"/>
+          <w:color w:val="0A2540"/>
+        </w:rPr>
+        <w:t>41 Detailed Experimental Results &amp; Metrics</w:t>
       </w:r>
     </w:p>
     <w:p>
       <w:pPr>
-        <w:spacing w:after="120" w:line="276" w:lineRule="auto"/>
+        <w:spacing w:after="100" w:line="276" w:lineRule="auto"/>
       </w:pPr>
       <w:r>
         <w:t>Machine Learning Model Comparison Benchmark:</w:t>
@@ -4388,21 +3652,25 @@
         <w:br/>
         <w:t>• Model 5 (Extra Trees Regressor): R² = 0.8910, MAE = 2.25 pts</w:t>
         <w:br/>
-        <w:t>• Model 6 (Stacking Ensemble): R² = 0.9123, MAE = ±1.99 pts (Top Performer)</w:t>
+        <w:t>• Model 6 (the system Stacking Ensemble): R² = 0.9123, MAE = ±1.99 pts (Top Performer)</w:t>
       </w:r>
     </w:p>
     <w:p>
       <w:pPr>
         <w:pStyle w:val="Heading1"/>
-        <w:spacing w:before="280" w:after="120"/>
+        <w:spacing w:before="280" w:after="100"/>
       </w:pPr>
       <w:r>
-        <w:t>42 Result Analysis</w:t>
+        <w:rPr>
+          <w:rFonts w:ascii="Times New Roman" w:hAnsi="Times New Roman"/>
+          <w:color w:val="0A2540"/>
+        </w:rPr>
+        <w:t>42 Result Analysis &amp; SHAP Feature Attribution Insights</w:t>
       </w:r>
     </w:p>
     <w:p>
       <w:pPr>
-        <w:spacing w:after="120" w:line="276" w:lineRule="auto"/>
+        <w:spacing w:after="100" w:line="276" w:lineRule="auto"/>
       </w:pPr>
       <w:r>
         <w:t>Fast TreeSHAP feature attribution reveals key engineering insights:</w:t>
@@ -4417,21 +3685,25 @@
     <w:p>
       <w:pPr>
         <w:pStyle w:val="Heading1"/>
-        <w:spacing w:before="280" w:after="120"/>
+        <w:spacing w:before="280" w:after="100"/>
       </w:pPr>
       <w:r>
+        <w:rPr>
+          <w:rFonts w:ascii="Times New Roman" w:hAnsi="Times New Roman"/>
+          <w:color w:val="0A2540"/>
+        </w:rPr>
         <w:t>43 Advantages, Limitations and Future Scope</w:t>
       </w:r>
     </w:p>
     <w:p>
       <w:pPr>
-        <w:spacing w:after="120" w:line="276" w:lineRule="auto"/>
+        <w:spacing w:after="100" w:line="276" w:lineRule="auto"/>
       </w:pPr>
       <w:r>
         <w:rPr>
           <w:b/>
-          <w:color w:val="0F172A"/>
-          <w:sz w:val="23"/>
+          <w:color w:val="1E3A8A"/>
+          <w:sz w:val="22"/>
         </w:rPr>
         <w:t>43.1 Advantages</w:t>
         <w:br/>
@@ -4447,18 +3719,18 @@
         <w:br/>
         <w:t>• 1-Click publication-ready ReportLab PDF report generation.</w:t>
         <w:br/>
-        <w:t>• Recognized with the Special Mention Award at the state-level TANCAM TNWISE 2026 Hackathon.</w:t>
+        <w:t>• Proven in competition, winning the TNWISE 2026 State-Level Special Mention Award.</w:t>
       </w:r>
     </w:p>
     <w:p>
       <w:pPr>
-        <w:spacing w:after="120" w:line="276" w:lineRule="auto"/>
+        <w:spacing w:after="100" w:line="276" w:lineRule="auto"/>
       </w:pPr>
       <w:r>
         <w:rPr>
           <w:b/>
-          <w:color w:val="0F172A"/>
-          <w:sz w:val="23"/>
+          <w:color w:val="1E3A8A"/>
+          <w:sz w:val="22"/>
         </w:rPr>
         <w:t>43.2 Limitations</w:t>
         <w:br/>
@@ -4471,13 +3743,13 @@
     </w:p>
     <w:p>
       <w:pPr>
-        <w:spacing w:after="120" w:line="276" w:lineRule="auto"/>
+        <w:spacing w:after="100" w:line="276" w:lineRule="auto"/>
       </w:pPr>
       <w:r>
         <w:rPr>
           <w:b/>
-          <w:color w:val="0F172A"/>
-          <w:sz w:val="23"/>
+          <w:color w:val="1E3A8A"/>
+          <w:sz w:val="22"/>
         </w:rPr>
         <w:t>43.3 Future Scope</w:t>
         <w:br/>
@@ -4493,15 +3765,19 @@
     <w:p>
       <w:pPr>
         <w:pStyle w:val="Heading1"/>
-        <w:spacing w:before="280" w:after="120"/>
+        <w:spacing w:before="280" w:after="100"/>
       </w:pPr>
       <w:r>
-        <w:t>44 Development Methodology and Timeline</w:t>
+        <w:rPr>
+          <w:rFonts w:ascii="Times New Roman" w:hAnsi="Times New Roman"/>
+          <w:color w:val="0A2540"/>
+        </w:rPr>
+        <w:t>44 Development Methodology, Hackathon Journey &amp; Timeline</w:t>
       </w:r>
     </w:p>
     <w:p>
       <w:pPr>
-        <w:spacing w:after="120" w:line="276" w:lineRule="auto"/>
+        <w:spacing w:after="100" w:line="276" w:lineRule="auto"/>
       </w:pPr>
       <w:r>
         <w:t>Development Timeline:</w:t>
@@ -4510,7 +3786,7 @@
         <w:br/>
         <w:t>• Phase 2 (ETL &amp; ML Training): Built satellite connectors and trained Stacking Ensemble model.</w:t>
         <w:br/>
-        <w:t>• Phase 3 (TNWISE 2026 Hackathon): Competed at Kumaraguru College of Technology / TANCAM, successfully demonstrated live system to jury, and received the Special Mention Award.</w:t>
+        <w:t>• Phase 3 (TNWISE 2026 Hackathon): Competed at Kumaraguru College of Technology / TANCAM, successfully demonstrated live system to jury, and won the Special Mention Award.</w:t>
         <w:br/>
         <w:t>• Phase 4 (EIA Mathematical Refinement): Standardized all 5 EIA methods per IS codes and reviewer feedback.</w:t>
         <w:br/>
@@ -4520,15 +3796,19 @@
     <w:p>
       <w:pPr>
         <w:pStyle w:val="Heading1"/>
-        <w:spacing w:before="280" w:after="120"/>
+        <w:spacing w:before="280" w:after="100"/>
       </w:pPr>
       <w:r>
-        <w:t>45 Risk Analysis and Mitigation</w:t>
+        <w:rPr>
+          <w:rFonts w:ascii="Times New Roman" w:hAnsi="Times New Roman"/>
+          <w:color w:val="0A2540"/>
+        </w:rPr>
+        <w:t>45 Risk Analysis and Mitigation Strategy</w:t>
       </w:r>
     </w:p>
     <w:p>
       <w:pPr>
-        <w:spacing w:after="120" w:line="276" w:lineRule="auto"/>
+        <w:spacing w:after="100" w:line="276" w:lineRule="auto"/>
       </w:pPr>
       <w:r>
         <w:t>• Risk 1 (External Satellite API Outages): Mitigated by in-memory spatial KDTrees and historical offline fallback datasets.</w:t>
@@ -4541,21 +3821,25 @@
     <w:p>
       <w:pPr>
         <w:pStyle w:val="Heading1"/>
-        <w:spacing w:before="280" w:after="120"/>
+        <w:spacing w:before="280" w:after="100"/>
       </w:pPr>
       <w:r>
-        <w:t>46 References</w:t>
+        <w:rPr>
+          <w:rFonts w:ascii="Times New Roman" w:hAnsi="Times New Roman"/>
+          <w:color w:val="0A2540"/>
+        </w:rPr>
+        <w:t>46 References &amp; Statutory Standards</w:t>
       </w:r>
     </w:p>
     <w:p>
       <w:pPr>
-        <w:spacing w:after="120" w:line="276" w:lineRule="auto"/>
+        <w:spacing w:after="100" w:line="276" w:lineRule="auto"/>
       </w:pPr>
       <w:r>
         <w:rPr>
           <w:b/>
-          <w:color w:val="0F172A"/>
-          <w:sz w:val="23"/>
+          <w:color w:val="1E3A8A"/>
+          <w:sz w:val="22"/>
         </w:rPr>
         <w:t>1. Bureau of Indian Standards (BIS). IS 1904:1986 (Reaffirmed 2021) — Code of Practice for Design and Construction of Foundations in Soils.</w:t>
         <w:br/>
@@ -4583,21 +3867,25 @@
     <w:p>
       <w:pPr>
         <w:pStyle w:val="Heading1"/>
-        <w:spacing w:before="280" w:after="120"/>
+        <w:spacing w:before="280" w:after="100"/>
       </w:pPr>
       <w:r>
+        <w:rPr>
+          <w:rFonts w:ascii="Times New Roman" w:hAnsi="Times New Roman"/>
+          <w:color w:val="0A2540"/>
+        </w:rPr>
         <w:t>47 Feedback and Conclusion</w:t>
       </w:r>
     </w:p>
     <w:p>
       <w:pPr>
-        <w:spacing w:after="120" w:line="276" w:lineRule="auto"/>
+        <w:spacing w:after="100" w:line="276" w:lineRule="auto"/>
       </w:pPr>
       <w:r>
         <w:rPr>
           <w:b/>
-          <w:color w:val="0F172A"/>
-          <w:sz w:val="23"/>
+          <w:color w:val="1E3A8A"/>
+          <w:sz w:val="22"/>
         </w:rPr>
         <w:t>47.1 Feedback</w:t>
         <w:br/>
@@ -4618,13 +3906,13 @@
     </w:p>
     <w:p>
       <w:pPr>
-        <w:spacing w:after="120" w:line="276" w:lineRule="auto"/>
+        <w:spacing w:after="100" w:line="276" w:lineRule="auto"/>
       </w:pPr>
       <w:r>
         <w:rPr>
           <w:b/>
-          <w:color w:val="0F172A"/>
-          <w:sz w:val="23"/>
+          <w:color w:val="1E3A8A"/>
+          <w:sz w:val="22"/>
         </w:rPr>
         <w:t>47.2 Conclusion</w:t>
         <w:br/>
@@ -4636,15 +3924,19 @@
     <w:p>
       <w:pPr>
         <w:pStyle w:val="Heading1"/>
-        <w:spacing w:before="280" w:after="120"/>
+        <w:spacing w:before="280" w:after="100"/>
       </w:pPr>
       <w:r>
+        <w:rPr>
+          <w:rFonts w:ascii="Times New Roman" w:hAnsi="Times New Roman"/>
+          <w:color w:val="0A2540"/>
+        </w:rPr>
         <w:t>48 Sample API Request and Response</w:t>
       </w:r>
     </w:p>
     <w:p>
       <w:pPr>
-        <w:spacing w:after="120" w:line="276" w:lineRule="auto"/>
+        <w:spacing w:after="100" w:line="276" w:lineRule="auto"/>
       </w:pPr>
       <w:r>
         <w:t>Sample API Request:</w:t>
@@ -4656,7 +3948,7 @@
     </w:p>
     <w:p>
       <w:pPr>
-        <w:spacing w:after="120" w:line="276" w:lineRule="auto"/>
+        <w:spacing w:after="100" w:line="276" w:lineRule="auto"/>
       </w:pPr>
       <w:r>
         <w:t>{</w:t>
@@ -4674,7 +3966,7 @@
     </w:p>
     <w:p>
       <w:pPr>
-        <w:spacing w:after="120" w:line="276" w:lineRule="auto"/>
+        <w:spacing w:after="100" w:line="276" w:lineRule="auto"/>
       </w:pPr>
       <w:r>
         <w:t>Sample API Response:</w:t>
@@ -4743,15 +4035,19 @@
     <w:p>
       <w:pPr>
         <w:pStyle w:val="Heading1"/>
-        <w:spacing w:before="280" w:after="120"/>
+        <w:spacing w:before="280" w:after="100"/>
       </w:pPr>
       <w:r>
+        <w:rPr>
+          <w:rFonts w:ascii="Times New Roman" w:hAnsi="Times New Roman"/>
+          <w:color w:val="0A2540"/>
+        </w:rPr>
         <w:t>49 Glossary of Terms</w:t>
       </w:r>
     </w:p>
     <w:p>
       <w:pPr>
-        <w:spacing w:after="120" w:line="276" w:lineRule="auto"/>
+        <w:spacing w:after="100" w:line="276" w:lineRule="auto"/>
       </w:pPr>
       <w:r>
         <w:t>• Bearing Capacity (kN/m²): The maximum contact pressure between the foundation substructure and supporting subsoil without shear failure or excessive settlement (IS 1904).</w:t>
@@ -4774,28 +4070,24 @@
     <w:p>
       <w:pPr>
         <w:pStyle w:val="Heading1"/>
-        <w:spacing w:before="280" w:after="120"/>
       </w:pPr>
       <w:r>
+        <w:rPr>
+          <w:color w:val="0A2540"/>
+        </w:rPr>
         <w:t>50 Certificate of Completion / Project Certificates</w:t>
       </w:r>
     </w:p>
     <w:p>
-      <w:pPr>
-        <w:spacing w:after="120" w:line="276" w:lineRule="auto"/>
-      </w:pPr>
       <w:r>
-        <w:t>This section documents the official certificate of achievement and recognition received by the project team.</w:t>
-      </w:r>
-    </w:p>
-    <w:p>
-      <w:pPr>
-        <w:spacing w:after="120" w:line="276" w:lineRule="auto"/>
-      </w:pPr>
-      <w:r>
+        <w:rPr>
+          <w:b/>
+        </w:rPr>
         <w:t>Figure 1: TNWISE 2026 Special Mention Award Certificate</w:t>
         <w:br/>
-        <w:t>Description: Official Certificate of Appreciation awarded to Vaira Selvi S &amp; Team from Kamaraj College of Engineering and Technology for achieving the Special Mention Award in TANCAM's Hackathon for Tamil Nadu Women in Science and Engineering (TNWISE 2026) organized by Tamil Nadu Centre of Excellence for Advanced Manufacturing (TANCAM), Chennai in association with Dassault Systèmes, TIDCO, and Kumaraguru College of Technology, Coimbatore on 12th March 2026.</w:t>
+      </w:r>
+      <w:r>
+        <w:t>Description: Official Certificate of Appreciation awarded to Vaira Selvi S &amp; Team from Kamaraj College of Engineering and Technology for achieving the Special Mention Award in TANCAM's Hackathon for Tamil Nadu Women in Science and Engineering (TNWISE 2026).</w:t>
       </w:r>
     </w:p>
     <w:p>
@@ -4836,44 +4128,35 @@
     </w:p>
     <w:p>
       <w:pPr>
-        <w:spacing w:after="200"/>
+        <w:spacing w:after="240"/>
       </w:pPr>
+    </w:p>
+    <w:p>
+      <w:r>
+        <w:br w:type="page"/>
+      </w:r>
     </w:p>
     <w:p>
       <w:pPr>
         <w:pStyle w:val="Heading1"/>
-        <w:spacing w:before="280" w:after="120"/>
       </w:pPr>
       <w:r>
+        <w:rPr>
+          <w:color w:val="0A2540"/>
+        </w:rPr>
         <w:t>51 Project Photographs</w:t>
       </w:r>
     </w:p>
     <w:p>
-      <w:pPr>
-        <w:spacing w:after="120" w:line="276" w:lineRule="auto"/>
-      </w:pPr>
       <w:r>
-        <w:t>This section documents the project demonstration, stage felicitation, and institutional review sessions.</w:t>
-      </w:r>
-    </w:p>
-    <w:p>
-      <w:pPr>
-        <w:spacing w:after="120" w:line="276" w:lineRule="auto"/>
-      </w:pPr>
-      <w:r>
+        <w:rPr>
+          <w:b/>
+        </w:rPr>
         <w:t>Figure 2: Award Felicitation on Main Stage at TNWISE 2026 Hackathon</w:t>
         <w:br/>
-        <w:t>Description: Team members Vaira Selvi S, Vishali S, and Mohana Priya K receiving the Special Mention Award on the main stage at Kumaraguru College of Technology from dignitaries representing TANCAM and Dassault Systèmes.</w:t>
       </w:r>
-    </w:p>
-    <w:p>
-      <w:pPr>
-        <w:spacing w:after="120" w:line="276" w:lineRule="auto"/>
-      </w:pPr>
       <w:r>
-        <w:t>Figure 3: Institutional Presentation and Certificate Review</w:t>
-        <w:br/>
-        <w:t>Description: Project team presenting the award certificate and demonstrating the software system to the Principal and faculty at Kamaraj College of Engineering and Technology.</w:t>
+        <w:t>Description: Team members Vaira Selvi S, Vishali S, and Mohana Priya K receiving the Special Mention Award on the main stage at Kumaraguru College of Technology.</w:t>
       </w:r>
     </w:p>
     <w:p>
@@ -4919,6 +4202,18 @@
     </w:p>
     <w:p>
       <w:r>
+        <w:rPr>
+          <w:b/>
+        </w:rPr>
+        <w:t>Figure 3: Institutional Review and Certificate Presentation</w:t>
+        <w:br/>
+      </w:r>
+      <w:r>
+        <w:t>Description: Project team presenting the award certificate and demonstrating the software system to the Principal and faculty at Kamaraj College of Engineering and Technology.</w:t>
+      </w:r>
+    </w:p>
+    <w:p>
+      <w:r>
         <w:drawing>
           <wp:inline xmlns:a="http://schemas.openxmlformats.org/drawingml/2006/main" xmlns:pic="http://schemas.openxmlformats.org/drawingml/2006/picture">
             <wp:extent cx="5120640" cy="6323057"/>
@@ -4955,33 +4250,34 @@
     </w:p>
     <w:p>
       <w:pPr>
-        <w:spacing w:after="160"/>
+        <w:spacing w:after="240"/>
       </w:pPr>
+    </w:p>
+    <w:p>
+      <w:r>
+        <w:br w:type="page"/>
+      </w:r>
     </w:p>
     <w:p>
       <w:pPr>
         <w:pStyle w:val="Heading1"/>
-        <w:spacing w:before="280" w:after="120"/>
       </w:pPr>
       <w:r>
+        <w:rPr>
+          <w:color w:val="0A2540"/>
+        </w:rPr>
         <w:t>52 GEOTAGGED PHOTOGRAPHS</w:t>
       </w:r>
     </w:p>
     <w:p>
-      <w:pPr>
-        <w:spacing w:after="120" w:line="276" w:lineRule="auto"/>
-      </w:pPr>
       <w:r>
-        <w:t>This section presents geotagged photographic documentation verifying project demonstration and live evaluation during the hackathon.</w:t>
+        <w:rPr>
+          <w:b/>
+        </w:rPr>
+        <w:t>Figure 4: Live Jury Demonstration and Software Evaluation (Geotagged)</w:t>
+        <w:br/>
       </w:r>
-    </w:p>
-    <w:p>
-      <w:pPr>
-        <w:spacing w:after="120" w:line="276" w:lineRule="auto"/>
-      </w:pPr>
       <w:r>
-        <w:t>Figure 4: Live Jury Demonstration and Software Evaluation</w:t>
-        <w:br/>
         <w:t>Description: Geotagged photograph documenting live project demonstration to the evaluation jury during the hackathon (Location: Kamaraj College of Engineering and Technology / Hackathon Venue, Tamil Nadu, India — Lat: 9.672813° N, Long: 77.96493° E).</w:t>
       </w:r>
     </w:p>
@@ -5023,7 +4319,7 @@
     </w:p>
     <w:p>
       <w:pPr>
-        <w:spacing w:after="200"/>
+        <w:spacing w:after="240"/>
       </w:pPr>
     </w:p>
     <w:sectPr>
@@ -5415,9 +4711,9 @@
     <w:qFormat/>
     <w:rsid w:val="00FC693F"/>
     <w:rPr>
-      <w:rFonts w:ascii="Calibri" w:hAnsi="Calibri"/>
+      <w:rFonts w:ascii="Times New Roman" w:hAnsi="Times New Roman"/>
       <w:color w:val="1E293B"/>
-      <w:sz w:val="22"/>
+      <w:sz w:val="21"/>
     </w:rPr>
   </w:style>
   <w:style w:type="paragraph" w:styleId="Header">
@@ -5435,8 +4731,9 @@
       <w:spacing w:after="0" w:line="240" w:lineRule="auto"/>
     </w:pPr>
     <w:rPr>
-      <w:rFonts w:ascii="Calibri" w:hAnsi="Calibri"/>
-      <w:color w:val="64748B"/>
+      <w:rFonts w:ascii="Times New Roman" w:hAnsi="Times New Roman"/>
+      <w:b/>
+      <w:color w:val="0A2540"/>
       <w:sz w:val="17"/>
     </w:rPr>
   </w:style>

</xml_diff>

<commit_message>
feat(report): update PDF and DOCX with exact full-bleed cover bands and academic reference template styling
</commit_message>
<xml_diff>
--- a/TERRA_AI_PROJECT_REPORT.docx
+++ b/TERRA_AI_PROJECT_REPORT.docx
@@ -4,62 +4,183 @@
   <w:body>
     <w:p>
       <w:pPr>
-        <w:spacing w:before="1200" w:after="240"/>
+        <w:spacing w:before="1600" w:after="240"/>
+        <w:jc w:val="center"/>
       </w:pPr>
       <w:r>
         <w:rPr>
           <w:rFonts w:ascii="Times New Roman" w:hAnsi="Times New Roman"/>
           <w:b/>
-          <w:color w:val="0A2540"/>
-          <w:sz w:val="42"/>
+          <w:color w:val="0D3B66"/>
+          <w:sz w:val="48"/>
         </w:rPr>
-        <w:t>CONSTRUCTION SITE VIABILITY AND</w:t>
+        <w:t>Construction Site Viability and</w:t>
         <w:br/>
-        <w:t>LIFESPAN PREDICTION SYSTEM</w:t>
+        <w:t>Lifespan Prediction System</w:t>
       </w:r>
     </w:p>
     <w:p>
       <w:pPr>
-        <w:spacing w:after="2800"/>
+        <w:spacing w:after="1200"/>
+        <w:jc w:val="center"/>
       </w:pPr>
       <w:r>
         <w:rPr>
-          <w:color w:val="334155"/>
-          <w:sz w:val="23"/>
+          <w:rFonts w:ascii="Times New Roman" w:hAnsi="Times New Roman"/>
+          <w:i/>
+          <w:color w:val="2563EB"/>
+          <w:sz w:val="24"/>
         </w:rPr>
-        <w:t>A Multi-Source Geospatial Machine Learning Platform for Foundation Engineering, Hazard Risk Assessment, and Environmental Impact Evaluation</w:t>
+        <w:t>A Multi-Source Geospatial Machine Learning Platform for Foundation Engineering,</w:t>
+        <w:br/>
+        <w:t>Hazard Risk Assessment, and Environmental Impact Evaluation</w:t>
       </w:r>
     </w:p>
-    <w:p>
-      <w:r>
-        <w:rPr>
-          <w:b/>
-          <w:color w:val="0A2540"/>
-          <w:sz w:val="23"/>
-        </w:rPr>
-        <w:t>Project Details</w:t>
-        <w:br/>
-      </w:r>
-      <w:r>
-        <w:rPr>
-          <w:b/>
-        </w:rPr>
-        <w:t>Submitted by: Vaira Selvi S, Vishali S and Mohana Priya K</w:t>
-        <w:br/>
-      </w:r>
-      <w:r>
-        <w:t>Department: Department of Computer Science and Engineering</w:t>
-        <w:br/>
-      </w:r>
-      <w:r>
-        <w:t>Institution: Kamaraj College of Engineering and Technology</w:t>
-        <w:br/>
-      </w:r>
-      <w:r>
-        <w:t>Academic Year: 2025–2026</w:t>
-        <w:br/>
-      </w:r>
-    </w:p>
+    <w:tbl>
+      <w:tblPr>
+        <w:tblW w:type="auto" w:w="0"/>
+        <w:jc w:val="center"/>
+        <w:tblLook w:firstColumn="1" w:firstRow="1" w:lastColumn="0" w:lastRow="0" w:noHBand="0" w:noVBand="1" w:val="04A0"/>
+      </w:tblPr>
+      <w:tblGrid>
+        <w:gridCol w:w="9360"/>
+      </w:tblGrid>
+      <w:tr>
+        <w:tc>
+          <w:tcPr>
+            <w:tcW w:type="dxa" w:w="9360"/>
+            <w:shd w:fill="FBFBFA"/>
+            <w:tcBorders>
+              <w:top w:val="single" w:sz="6" w:space="0" w:color="C5A059"/>
+              <w:left w:val="single" w:sz="6" w:space="0" w:color="C5A059"/>
+              <w:bottom w:val="single" w:sz="6" w:space="0" w:color="C5A059"/>
+              <w:right w:val="single" w:sz="6" w:space="0" w:color="C5A059"/>
+            </w:tcBorders>
+          </w:tcPr>
+          <w:p>
+            <w:pPr>
+              <w:jc w:val="center"/>
+            </w:pPr>
+            <w:r>
+              <w:rPr>
+                <w:b/>
+                <w:color w:val="0D3B66"/>
+                <w:sz w:val="20"/>
+              </w:rPr>
+              <w:t>Project Details</w:t>
+            </w:r>
+          </w:p>
+        </w:tc>
+      </w:tr>
+      <w:tr>
+        <w:tc>
+          <w:tcPr>
+            <w:tcW w:type="dxa" w:w="9360"/>
+            <w:shd w:fill="FBFBFA"/>
+            <w:tcBorders>
+              <w:top w:val="single" w:sz="6" w:space="0" w:color="C5A059"/>
+              <w:left w:val="single" w:sz="6" w:space="0" w:color="C5A059"/>
+              <w:bottom w:val="single" w:sz="6" w:space="0" w:color="C5A059"/>
+              <w:right w:val="single" w:sz="6" w:space="0" w:color="C5A059"/>
+            </w:tcBorders>
+          </w:tcPr>
+          <w:p>
+            <w:pPr>
+              <w:jc w:val="center"/>
+            </w:pPr>
+            <w:r>
+              <w:rPr>
+                <w:b/>
+                <w:color w:val="1E293B"/>
+                <w:sz w:val="20"/>
+              </w:rPr>
+              <w:t>Submitted by: Vaira Selvi S, Vishali S and Mohana Priya K</w:t>
+            </w:r>
+          </w:p>
+        </w:tc>
+      </w:tr>
+      <w:tr>
+        <w:tc>
+          <w:tcPr>
+            <w:tcW w:type="dxa" w:w="9360"/>
+            <w:shd w:fill="FBFBFA"/>
+            <w:tcBorders>
+              <w:top w:val="single" w:sz="6" w:space="0" w:color="C5A059"/>
+              <w:left w:val="single" w:sz="6" w:space="0" w:color="C5A059"/>
+              <w:bottom w:val="single" w:sz="6" w:space="0" w:color="C5A059"/>
+              <w:right w:val="single" w:sz="6" w:space="0" w:color="C5A059"/>
+            </w:tcBorders>
+          </w:tcPr>
+          <w:p>
+            <w:pPr>
+              <w:jc w:val="center"/>
+            </w:pPr>
+            <w:r>
+              <w:rPr>
+                <w:b w:val="0"/>
+                <w:color w:val="1E293B"/>
+                <w:sz w:val="20"/>
+              </w:rPr>
+              <w:t>Department: Department of Computer Science and Engineering</w:t>
+            </w:r>
+          </w:p>
+        </w:tc>
+      </w:tr>
+      <w:tr>
+        <w:tc>
+          <w:tcPr>
+            <w:tcW w:type="dxa" w:w="9360"/>
+            <w:shd w:fill="FBFBFA"/>
+            <w:tcBorders>
+              <w:top w:val="single" w:sz="6" w:space="0" w:color="C5A059"/>
+              <w:left w:val="single" w:sz="6" w:space="0" w:color="C5A059"/>
+              <w:bottom w:val="single" w:sz="6" w:space="0" w:color="C5A059"/>
+              <w:right w:val="single" w:sz="6" w:space="0" w:color="C5A059"/>
+            </w:tcBorders>
+          </w:tcPr>
+          <w:p>
+            <w:pPr>
+              <w:jc w:val="center"/>
+            </w:pPr>
+            <w:r>
+              <w:rPr>
+                <w:b w:val="0"/>
+                <w:color w:val="1E293B"/>
+                <w:sz w:val="20"/>
+              </w:rPr>
+              <w:t>Institution: Kamaraj College of Engineering and Technology</w:t>
+            </w:r>
+          </w:p>
+        </w:tc>
+      </w:tr>
+      <w:tr>
+        <w:tc>
+          <w:tcPr>
+            <w:tcW w:type="dxa" w:w="9360"/>
+            <w:shd w:fill="FBFBFA"/>
+            <w:tcBorders>
+              <w:top w:val="single" w:sz="6" w:space="0" w:color="C5A059"/>
+              <w:left w:val="single" w:sz="6" w:space="0" w:color="C5A059"/>
+              <w:bottom w:val="single" w:sz="6" w:space="0" w:color="C5A059"/>
+              <w:right w:val="single" w:sz="6" w:space="0" w:color="C5A059"/>
+            </w:tcBorders>
+          </w:tcPr>
+          <w:p>
+            <w:pPr>
+              <w:jc w:val="center"/>
+            </w:pPr>
+            <w:r>
+              <w:rPr>
+                <w:b w:val="0"/>
+                <w:color w:val="1E293B"/>
+                <w:sz w:val="20"/>
+              </w:rPr>
+              <w:t>Academic Year: 2025–2026</w:t>
+            </w:r>
+          </w:p>
+        </w:tc>
+      </w:tr>
+    </w:tbl>
     <w:p>
       <w:r>
         <w:br w:type="page"/>
@@ -94,7 +215,7 @@
             <w:r>
               <w:rPr>
                 <w:b/>
-                <w:color w:val="0A2540"/>
+                <w:color w:val="0D3B66"/>
               </w:rPr>
               <w:t>1</w:t>
             </w:r>
@@ -133,7 +254,7 @@
             <w:r>
               <w:rPr>
                 <w:b/>
-                <w:color w:val="0A2540"/>
+                <w:color w:val="0D3B66"/>
               </w:rPr>
               <w:t>2</w:t>
             </w:r>
@@ -172,7 +293,7 @@
             <w:r>
               <w:rPr>
                 <w:b/>
-                <w:color w:val="0A2540"/>
+                <w:color w:val="0D3B66"/>
               </w:rPr>
               <w:t>3</w:t>
             </w:r>
@@ -211,7 +332,7 @@
             <w:r>
               <w:rPr>
                 <w:b/>
-                <w:color w:val="0A2540"/>
+                <w:color w:val="0D3B66"/>
               </w:rPr>
               <w:t>4</w:t>
             </w:r>
@@ -250,7 +371,7 @@
             <w:r>
               <w:rPr>
                 <w:b/>
-                <w:color w:val="0A2540"/>
+                <w:color w:val="0D3B66"/>
               </w:rPr>
               <w:t>5</w:t>
             </w:r>
@@ -289,7 +410,7 @@
             <w:r>
               <w:rPr>
                 <w:b/>
-                <w:color w:val="0A2540"/>
+                <w:color w:val="0D3B66"/>
               </w:rPr>
               <w:t>6</w:t>
             </w:r>
@@ -328,7 +449,7 @@
             <w:r>
               <w:rPr>
                 <w:b/>
-                <w:color w:val="0A2540"/>
+                <w:color w:val="0D3B66"/>
               </w:rPr>
               <w:t>7</w:t>
             </w:r>
@@ -367,7 +488,7 @@
             <w:r>
               <w:rPr>
                 <w:b/>
-                <w:color w:val="0A2540"/>
+                <w:color w:val="0D3B66"/>
               </w:rPr>
               <w:t>8</w:t>
             </w:r>
@@ -406,7 +527,7 @@
             <w:r>
               <w:rPr>
                 <w:b/>
-                <w:color w:val="0A2540"/>
+                <w:color w:val="0D3B66"/>
               </w:rPr>
               <w:t>9</w:t>
             </w:r>
@@ -445,7 +566,7 @@
             <w:r>
               <w:rPr>
                 <w:b/>
-                <w:color w:val="0A2540"/>
+                <w:color w:val="0D3B66"/>
               </w:rPr>
               <w:t>10</w:t>
             </w:r>
@@ -484,7 +605,7 @@
             <w:r>
               <w:rPr>
                 <w:b/>
-                <w:color w:val="0A2540"/>
+                <w:color w:val="0D3B66"/>
               </w:rPr>
               <w:t>11</w:t>
             </w:r>
@@ -496,7 +617,7 @@
           </w:tcPr>
           <w:p>
             <w:r>
-              <w:t>Proposed the system System</w:t>
+              <w:t>Proposed Platform Architecture and Methodology</w:t>
             </w:r>
           </w:p>
         </w:tc>
@@ -523,7 +644,7 @@
             <w:r>
               <w:rPr>
                 <w:b/>
-                <w:color w:val="0A2540"/>
+                <w:color w:val="0D3B66"/>
               </w:rPr>
               <w:t>12</w:t>
             </w:r>
@@ -562,7 +683,7 @@
             <w:r>
               <w:rPr>
                 <w:b/>
-                <w:color w:val="0A2540"/>
+                <w:color w:val="0D3B66"/>
               </w:rPr>
               <w:t>13</w:t>
             </w:r>
@@ -601,7 +722,7 @@
             <w:r>
               <w:rPr>
                 <w:b/>
-                <w:color w:val="0A2540"/>
+                <w:color w:val="0D3B66"/>
               </w:rPr>
               <w:t>14</w:t>
             </w:r>
@@ -640,7 +761,7 @@
             <w:r>
               <w:rPr>
                 <w:b/>
-                <w:color w:val="0A2540"/>
+                <w:color w:val="0D3B66"/>
               </w:rPr>
               <w:t>15</w:t>
             </w:r>
@@ -679,7 +800,7 @@
             <w:r>
               <w:rPr>
                 <w:b/>
-                <w:color w:val="0A2540"/>
+                <w:color w:val="0D3B66"/>
               </w:rPr>
               <w:t>16</w:t>
             </w:r>
@@ -718,7 +839,7 @@
             <w:r>
               <w:rPr>
                 <w:b/>
-                <w:color w:val="0A2540"/>
+                <w:color w:val="0D3B66"/>
               </w:rPr>
               <w:t>17</w:t>
             </w:r>
@@ -757,7 +878,7 @@
             <w:r>
               <w:rPr>
                 <w:b/>
-                <w:color w:val="0A2540"/>
+                <w:color w:val="0D3B66"/>
               </w:rPr>
               <w:t>18</w:t>
             </w:r>
@@ -796,7 +917,7 @@
             <w:r>
               <w:rPr>
                 <w:b/>
-                <w:color w:val="0A2540"/>
+                <w:color w:val="0D3B66"/>
               </w:rPr>
               <w:t>19</w:t>
             </w:r>
@@ -835,7 +956,7 @@
             <w:r>
               <w:rPr>
                 <w:b/>
-                <w:color w:val="0A2540"/>
+                <w:color w:val="0D3B66"/>
               </w:rPr>
               <w:t>20</w:t>
             </w:r>
@@ -874,7 +995,7 @@
             <w:r>
               <w:rPr>
                 <w:b/>
-                <w:color w:val="0A2540"/>
+                <w:color w:val="0D3B66"/>
               </w:rPr>
               <w:t>21</w:t>
             </w:r>
@@ -913,7 +1034,7 @@
             <w:r>
               <w:rPr>
                 <w:b/>
-                <w:color w:val="0A2540"/>
+                <w:color w:val="0D3B66"/>
               </w:rPr>
               <w:t>22</w:t>
             </w:r>
@@ -952,7 +1073,7 @@
             <w:r>
               <w:rPr>
                 <w:b/>
-                <w:color w:val="0A2540"/>
+                <w:color w:val="0D3B66"/>
               </w:rPr>
               <w:t>23</w:t>
             </w:r>
@@ -991,7 +1112,7 @@
             <w:r>
               <w:rPr>
                 <w:b/>
-                <w:color w:val="0A2540"/>
+                <w:color w:val="0D3B66"/>
               </w:rPr>
               <w:t>24</w:t>
             </w:r>
@@ -1030,7 +1151,7 @@
             <w:r>
               <w:rPr>
                 <w:b/>
-                <w:color w:val="0A2540"/>
+                <w:color w:val="0D3B66"/>
               </w:rPr>
               <w:t>25</w:t>
             </w:r>
@@ -1069,7 +1190,7 @@
             <w:r>
               <w:rPr>
                 <w:b/>
-                <w:color w:val="0A2540"/>
+                <w:color w:val="0D3B66"/>
               </w:rPr>
               <w:t>26</w:t>
             </w:r>
@@ -1108,7 +1229,7 @@
             <w:r>
               <w:rPr>
                 <w:b/>
-                <w:color w:val="0A2540"/>
+                <w:color w:val="0D3B66"/>
               </w:rPr>
               <w:t>27</w:t>
             </w:r>
@@ -1147,7 +1268,7 @@
             <w:r>
               <w:rPr>
                 <w:b/>
-                <w:color w:val="0A2540"/>
+                <w:color w:val="0D3B66"/>
               </w:rPr>
               <w:t>28</w:t>
             </w:r>
@@ -1186,7 +1307,7 @@
             <w:r>
               <w:rPr>
                 <w:b/>
-                <w:color w:val="0A2540"/>
+                <w:color w:val="0D3B66"/>
               </w:rPr>
               <w:t>29</w:t>
             </w:r>
@@ -1225,7 +1346,7 @@
             <w:r>
               <w:rPr>
                 <w:b/>
-                <w:color w:val="0A2540"/>
+                <w:color w:val="0D3B66"/>
               </w:rPr>
               <w:t>30</w:t>
             </w:r>
@@ -1264,7 +1385,7 @@
             <w:r>
               <w:rPr>
                 <w:b/>
-                <w:color w:val="0A2540"/>
+                <w:color w:val="0D3B66"/>
               </w:rPr>
               <w:t>31</w:t>
             </w:r>
@@ -1303,7 +1424,7 @@
             <w:r>
               <w:rPr>
                 <w:b/>
-                <w:color w:val="0A2540"/>
+                <w:color w:val="0D3B66"/>
               </w:rPr>
               <w:t>32</w:t>
             </w:r>
@@ -1342,7 +1463,7 @@
             <w:r>
               <w:rPr>
                 <w:b/>
-                <w:color w:val="0A2540"/>
+                <w:color w:val="0D3B66"/>
               </w:rPr>
               <w:t>33</w:t>
             </w:r>
@@ -1381,7 +1502,7 @@
             <w:r>
               <w:rPr>
                 <w:b/>
-                <w:color w:val="0A2540"/>
+                <w:color w:val="0D3B66"/>
               </w:rPr>
               <w:t>34</w:t>
             </w:r>
@@ -1420,7 +1541,7 @@
             <w:r>
               <w:rPr>
                 <w:b/>
-                <w:color w:val="0A2540"/>
+                <w:color w:val="0D3B66"/>
               </w:rPr>
               <w:t>35</w:t>
             </w:r>
@@ -1459,7 +1580,7 @@
             <w:r>
               <w:rPr>
                 <w:b/>
-                <w:color w:val="0A2540"/>
+                <w:color w:val="0D3B66"/>
               </w:rPr>
               <w:t>36</w:t>
             </w:r>
@@ -1498,7 +1619,7 @@
             <w:r>
               <w:rPr>
                 <w:b/>
-                <w:color w:val="0A2540"/>
+                <w:color w:val="0D3B66"/>
               </w:rPr>
               <w:t>37</w:t>
             </w:r>
@@ -1537,7 +1658,7 @@
             <w:r>
               <w:rPr>
                 <w:b/>
-                <w:color w:val="0A2540"/>
+                <w:color w:val="0D3B66"/>
               </w:rPr>
               <w:t>38</w:t>
             </w:r>
@@ -1576,7 +1697,7 @@
             <w:r>
               <w:rPr>
                 <w:b/>
-                <w:color w:val="0A2540"/>
+                <w:color w:val="0D3B66"/>
               </w:rPr>
               <w:t>39</w:t>
             </w:r>
@@ -1615,7 +1736,7 @@
             <w:r>
               <w:rPr>
                 <w:b/>
-                <w:color w:val="0A2540"/>
+                <w:color w:val="0D3B66"/>
               </w:rPr>
               <w:t>40</w:t>
             </w:r>
@@ -1654,7 +1775,7 @@
             <w:r>
               <w:rPr>
                 <w:b/>
-                <w:color w:val="0A2540"/>
+                <w:color w:val="0D3B66"/>
               </w:rPr>
               <w:t>41</w:t>
             </w:r>
@@ -1693,7 +1814,7 @@
             <w:r>
               <w:rPr>
                 <w:b/>
-                <w:color w:val="0A2540"/>
+                <w:color w:val="0D3B66"/>
               </w:rPr>
               <w:t>42</w:t>
             </w:r>
@@ -1732,7 +1853,7 @@
             <w:r>
               <w:rPr>
                 <w:b/>
-                <w:color w:val="0A2540"/>
+                <w:color w:val="0D3B66"/>
               </w:rPr>
               <w:t>43</w:t>
             </w:r>
@@ -1771,7 +1892,7 @@
             <w:r>
               <w:rPr>
                 <w:b/>
-                <w:color w:val="0A2540"/>
+                <w:color w:val="0D3B66"/>
               </w:rPr>
               <w:t>44</w:t>
             </w:r>
@@ -1810,7 +1931,7 @@
             <w:r>
               <w:rPr>
                 <w:b/>
-                <w:color w:val="0A2540"/>
+                <w:color w:val="0D3B66"/>
               </w:rPr>
               <w:t>45</w:t>
             </w:r>
@@ -1849,7 +1970,7 @@
             <w:r>
               <w:rPr>
                 <w:b/>
-                <w:color w:val="0A2540"/>
+                <w:color w:val="0D3B66"/>
               </w:rPr>
               <w:t>46</w:t>
             </w:r>
@@ -1888,7 +2009,7 @@
             <w:r>
               <w:rPr>
                 <w:b/>
-                <w:color w:val="0A2540"/>
+                <w:color w:val="0D3B66"/>
               </w:rPr>
               <w:t>47</w:t>
             </w:r>
@@ -1927,7 +2048,7 @@
             <w:r>
               <w:rPr>
                 <w:b/>
-                <w:color w:val="0A2540"/>
+                <w:color w:val="0D3B66"/>
               </w:rPr>
               <w:t>48</w:t>
             </w:r>
@@ -1966,7 +2087,7 @@
             <w:r>
               <w:rPr>
                 <w:b/>
-                <w:color w:val="0A2540"/>
+                <w:color w:val="0D3B66"/>
               </w:rPr>
               <w:t>49</w:t>
             </w:r>
@@ -2005,7 +2126,7 @@
             <w:r>
               <w:rPr>
                 <w:b/>
-                <w:color w:val="0A2540"/>
+                <w:color w:val="0D3B66"/>
               </w:rPr>
               <w:t>50</w:t>
             </w:r>
@@ -2044,7 +2165,7 @@
             <w:r>
               <w:rPr>
                 <w:b/>
-                <w:color w:val="0A2540"/>
+                <w:color w:val="0D3B66"/>
               </w:rPr>
               <w:t>51</w:t>
             </w:r>
@@ -2083,7 +2204,7 @@
             <w:r>
               <w:rPr>
                 <w:b/>
-                <w:color w:val="0A2540"/>
+                <w:color w:val="0D3B66"/>
               </w:rPr>
               <w:t>52</w:t>
             </w:r>
@@ -2159,7 +2280,7 @@
       <w:r>
         <w:rPr>
           <w:rFonts w:ascii="Times New Roman" w:hAnsi="Times New Roman"/>
-          <w:color w:val="0A2540"/>
+          <w:color w:val="0D3B66"/>
         </w:rPr>
         <w:t>1 Abstract</w:t>
       </w:r>
@@ -2171,14 +2292,14 @@
       <w:r>
         <w:rPr>
           <w:b/>
-          <w:color w:val="1E3A8A"/>
+          <w:color w:val="2563EB"/>
           <w:sz w:val="22"/>
         </w:rPr>
         <w:t>1.1 Overview</w:t>
         <w:br/>
       </w:r>
       <w:r>
-        <w:t>The the system platform is an autonomous, cloud-based geotechnical and environmental decision support system engineered to revolutionize preliminary construction site selection, environmental impact assessment (EIA), and structural risk mitigation across India. Conventional civil engineering preliminary site selection is an inherently fragmented, time-intensive, and error-prone process. It frequently relies on scattered government maps, isolated soil sampling boreholes, offline climate historical averages, and subjective consultant assessments. These traditional approaches introduce substantial delays—often taking several weeks to months—and fail to capture complex, multi-domain interactions such as high water table saturation, cyclic seismic vulnerability, soil corrosivity, and statutory eco-sensitive buffer restrictions prior to capital investment.</w:t>
+        <w:t>The platform is an autonomous, cloud-based geotechnical and environmental decision support system engineered to revolutionize preliminary construction site selection, environmental impact assessment (EIA), and structural risk mitigation across India. Conventional civil engineering preliminary site selection is an inherently fragmented, time-intensive, and error-prone process. It frequently relies on scattered government maps, isolated soil sampling boreholes, offline climate historical averages, and subjective consultant assessments. These traditional approaches introduce substantial delays—often taking several weeks to months—and fail to capture complex, multi-domain interactions such as high water table saturation, cyclic seismic vulnerability, soil corrosivity, and statutory eco-sensitive buffer restrictions prior to capital investment.</w:t>
       </w:r>
     </w:p>
     <w:p>
@@ -2186,7 +2307,7 @@
         <w:spacing w:after="100" w:line="276" w:lineRule="auto"/>
       </w:pPr>
       <w:r>
-        <w:t>the system resolves this foundational bottleneck by establishing an automated, multimodal data ingestion and machine learning evaluation pipeline. By inputting any geographic coordinates or selecting a location on an interactive GIS map within India, the system queries global and national satellite earth observation databases—including ISRIC SoilGrids for 3D soil mechanics, NASA POWER for 30-day meteorological indices, OpenStreetMap for drainage and waterways, BMTPC Vulnerability Atlas for hazard classifications, and GBIF/MoEFCC databases for protected wildlife sanctuaries. The platform integrates a Stacking Ensemble Machine Learning model (Random Forest, XGBoost, and Extra Trees feeding a Ridge Meta-Regressor) yielding verified feasibility scores (R² = 0.9123, MAE = ±1.99 points), structural lifespan projections, and preliminary foundation recommendations strictly compliant with Indian Standards (IS 1904:1986/2021, IS 1893:2016, IS 2911:2010, and IS 13920:2016).</w:t>
+        <w:t>the platform resolves this foundational bottleneck by establishing an automated, multimodal data ingestion and machine learning evaluation pipeline. By inputting any geographic coordinates or selecting a location on an interactive GIS map within India, the system queries global and national satellite earth observation databases—including ISRIC SoilGrids for 3D soil mechanics, NASA POWER for 30-day meteorological indices, OpenStreetMap for drainage and waterways, BMTPC Vulnerability Atlas for hazard classifications, and GBIF/MoEFCC databases for protected wildlife sanctuaries. The platform integrates a Stacking Ensemble Machine Learning model (Random Forest, XGBoost, and Extra Trees feeding a Ridge Meta-Regressor) yielding verified feasibility scores (R² = 0.9123, MAE = ±1.99 points), structural lifespan projections, and preliminary foundation recommendations strictly compliant with Indian Standards (IS 1904:1986/2021, IS 1893:2016, IS 2911:2010, and IS 13920:2016).</w:t>
       </w:r>
     </w:p>
     <w:p>
@@ -2196,14 +2317,14 @@
       <w:r>
         <w:rPr>
           <w:b/>
-          <w:color w:val="1E3A8A"/>
+          <w:color w:val="2563EB"/>
           <w:sz w:val="22"/>
         </w:rPr>
         <w:t>1.2 Purpose &amp; Motivation</w:t>
         <w:br/>
       </w:r>
       <w:r>
-        <w:t>The primary purpose of the system is to provide civil engineers, urban planners, government regulatory authorities, infrastructure developers, and academic researchers with an instant, scientifically rigorous Stage-0/1 preliminary screening tool. Furthermore, the platform implements all five academic Environmental Impact Assessment (EIA) methodologies—Statutory Weighted Checklist, Leopold 2D Interaction Matrix, Sorensen Cause-Condition-Effect Network, McHarg Multi-Criteria Spatial Overlay, and Predictive AI Modeling—accompanied by real-time Three.js 3D structural hazard reaction simulations and automated, publication-ready PDF engineering dossiers.</w:t>
+        <w:t>The primary purpose of the platform is to provide civil engineers, urban planners, government regulatory authorities, infrastructure developers, and academic researchers with an instant, scientifically rigorous Stage-0/1 preliminary screening tool. Furthermore, the platform implements all five academic Environmental Impact Assessment (EIA) methodologies—Statutory Weighted Checklist, Leopold 2D Interaction Matrix, Sorensen Cause-Condition-Effect Network, McHarg Multi-Criteria Spatial Overlay, and Predictive AI Modeling—accompanied by real-time Three.js 3D structural hazard reaction simulations and automated, publication-ready PDF engineering dossiers.</w:t>
       </w:r>
     </w:p>
     <w:p>
@@ -2214,7 +2335,7 @@
       <w:r>
         <w:rPr>
           <w:rFonts w:ascii="Times New Roman" w:hAnsi="Times New Roman"/>
-          <w:color w:val="0A2540"/>
+          <w:color w:val="0D3B66"/>
         </w:rPr>
         <w:t>2 Abstract — Extended Discussion</w:t>
       </w:r>
@@ -2226,7 +2347,7 @@
       <w:r>
         <w:rPr>
           <w:b/>
-          <w:color w:val="1E3A8A"/>
+          <w:color w:val="2563EB"/>
           <w:sz w:val="22"/>
         </w:rPr>
         <w:t>2.1 Problem and Solution</w:t>
@@ -2241,7 +2362,7 @@
         <w:spacing w:after="100" w:line="276" w:lineRule="auto"/>
       </w:pPr>
       <w:r>
-        <w:t>the system delivers a scalable, automated computational solution. The system orchestrates 64 distinct geospatial and geotechnical features across four interconnected domains: Geotechnical Soil Mechanics, Climate &amp; Meteorological Stress, Natural Hazards &amp; Inundation, and Ecological &amp; Wildlife Sensitivity. The predictive core evaluates load-bearing capacity against building structural categories (Houses, Apartments, Hospitals, Schools, Bridges, Industrial Warehouses, and Malls) and dynamic storey heights, generating transparent, mathematically derived risk indexes.</w:t>
+        <w:t>the platform delivers a scalable, automated computational solution. The system orchestrates 64 distinct geospatial and geotechnical features across four interconnected domains: Geotechnical Soil Mechanics, Climate &amp; Meteorological Stress, Natural Hazards &amp; Inundation, and Ecological &amp; Wildlife Sensitivity. The predictive core evaluates load-bearing capacity against building structural categories (Houses, Apartments, Hospitals, Schools, Bridges, Industrial Warehouses, and Malls) and dynamic storey heights, generating transparent, mathematically derived risk indexes.</w:t>
       </w:r>
     </w:p>
     <w:p>
@@ -2251,14 +2372,14 @@
       <w:r>
         <w:rPr>
           <w:b/>
-          <w:color w:val="1E3A8A"/>
+          <w:color w:val="2563EB"/>
           <w:sz w:val="22"/>
         </w:rPr>
         <w:t>2.2 Expected Impact &amp; Societal Value</w:t>
         <w:br/>
       </w:r>
       <w:r>
-        <w:t>By digitizing and automating Stage-0/1 site screening, the system reduces preliminary evaluation timelines from 3–4 weeks down to under 3 seconds while reducing preliminary surveying expenditures by over 80%. It prevents unviable developments in hazard-prone floodplains, coastal inundation zones, and protected wildlife corridors. The system was recognized with the Special Mention Award at the state-level TANCAM TNWISE 2026 Hackathon for its contribution to sustainable smart infrastructure and environmental preservation in Tamil Nadu and across India.</w:t>
+        <w:t>By digitizing and automating Stage-0/1 site screening, the platform reduces preliminary evaluation timelines from 3–4 weeks down to under 3 seconds while reducing preliminary surveying expenditures by over 80%. It prevents unviable developments in hazard-prone floodplains, coastal inundation zones, and protected wildlife corridors. The system was recognized with the Special Mention Award at the state-level TANCAM TNWISE 2026 Hackathon for its contribution to sustainable smart infrastructure and environmental preservation in Tamil Nadu and across India.</w:t>
       </w:r>
     </w:p>
     <w:p>
@@ -2269,7 +2390,7 @@
       <w:r>
         <w:rPr>
           <w:rFonts w:ascii="Times New Roman" w:hAnsi="Times New Roman"/>
-          <w:color w:val="0A2540"/>
+          <w:color w:val="0D3B66"/>
         </w:rPr>
         <w:t>3 Introduction</w:t>
       </w:r>
@@ -2287,7 +2408,7 @@
         <w:spacing w:after="100" w:line="276" w:lineRule="auto"/>
       </w:pPr>
       <w:r>
-        <w:t>Historically, civil engineering relied on localized field surveys and historical municipal registers. However, with accelerating urbanization, climate change-induced extreme weather events, and stringent statutory environmental clearance mandates (such as the MoEFCC EIA Notification 2006), traditional manual site evaluation methods have proven inadequate. the system addresses this modern challenge by deploying an intelligent, end-to-end Geospatial Artificial Intelligence (GeoAI) platform. The system operates autonomously: users interact with a modern web dashboard or programmatic REST API, selecting coordinates anywhere across India to trigger an automated cascade of spatial data retrieval, ML inference, multi-criteria EIA calculations, and 3D physical hazard simulations.</w:t>
+        <w:t>Historically, civil engineering relied on localized field surveys and historical municipal registers. However, with accelerating urbanization, climate change-induced extreme weather events, and stringent statutory environmental clearance mandates (such as the MoEFCC EIA Notification 2006), traditional manual site evaluation methods have proven inadequate. the platform addresses this modern challenge by deploying an intelligent, end-to-end Geospatial Artificial Intelligence (GeoAI) platform. The system operates autonomously: users interact with a modern web dashboard or programmatic REST API, selecting coordinates anywhere across India to trigger an automated cascade of spatial data retrieval, ML inference, multi-criteria EIA calculations, and 3D physical hazard simulations.</w:t>
       </w:r>
     </w:p>
     <w:p>
@@ -2298,7 +2419,7 @@
       <w:r>
         <w:rPr>
           <w:rFonts w:ascii="Times New Roman" w:hAnsi="Times New Roman"/>
-          <w:color w:val="0A2540"/>
+          <w:color w:val="0D3B66"/>
         </w:rPr>
         <w:t>4 Background and Motivation</w:t>
       </w:r>
@@ -2310,7 +2431,7 @@
       <w:r>
         <w:rPr>
           <w:b/>
-          <w:color w:val="1E3A8A"/>
+          <w:color w:val="2563EB"/>
           <w:sz w:val="22"/>
         </w:rPr>
         <w:t>4.1 Need for Automated Geotechnical Screening</w:t>
@@ -2327,7 +2448,7 @@
       <w:r>
         <w:rPr>
           <w:b/>
-          <w:color w:val="1E3A8A"/>
+          <w:color w:val="2563EB"/>
           <w:sz w:val="22"/>
         </w:rPr>
         <w:t>4.2 Remote Geospatial Sensing &amp; Earth Observation</w:t>
@@ -2344,14 +2465,14 @@
       <w:r>
         <w:rPr>
           <w:b/>
-          <w:color w:val="1E3A8A"/>
+          <w:color w:val="2563EB"/>
           <w:sz w:val="22"/>
         </w:rPr>
         <w:t>4.3 Digital Record Keeping &amp; Decision Traceability</w:t>
         <w:br/>
       </w:r>
       <w:r>
-        <w:t>Municipal authorities, banking institutions, and insurance underwriters require transparent, auditable records justifying site selection decisions. the system replaces handwritten notes and disconnected spreadsheets with a unified digital repository, automated PDF generation, and SHAP-based feature importance explainability.</w:t>
+        <w:t>Municipal authorities, banking institutions, and insurance underwriters require transparent, auditable records justifying site selection decisions. the platform replaces handwritten notes and disconnected spreadsheets with a unified digital repository, automated PDF generation, and SHAP-based feature importance explainability.</w:t>
       </w:r>
     </w:p>
     <w:p>
@@ -2362,7 +2483,7 @@
       <w:r>
         <w:rPr>
           <w:rFonts w:ascii="Times New Roman" w:hAnsi="Times New Roman"/>
-          <w:color w:val="0A2540"/>
+          <w:color w:val="0D3B66"/>
         </w:rPr>
         <w:t>5 Problem Statement &amp; Research Questions</w:t>
       </w:r>
@@ -2401,7 +2522,7 @@
       <w:r>
         <w:rPr>
           <w:rFonts w:ascii="Times New Roman" w:hAnsi="Times New Roman"/>
-          <w:color w:val="0A2540"/>
+          <w:color w:val="0D3B66"/>
         </w:rPr>
         <w:t>6 Project Objectives</w:t>
       </w:r>
@@ -2411,7 +2532,7 @@
         <w:spacing w:after="100" w:line="276" w:lineRule="auto"/>
       </w:pPr>
       <w:r>
-        <w:t>The primary engineering objectives of the the system project are:</w:t>
+        <w:t>The primary engineering objectives of the the platform project are:</w:t>
         <w:br/>
         <w:t>1. To develop an autonomous geospatial ETL pipeline ingesting live soil, climate, hazard, and biodiversity data across India.</w:t>
         <w:br/>
@@ -2436,7 +2557,7 @@
       <w:r>
         <w:rPr>
           <w:rFonts w:ascii="Times New Roman" w:hAnsi="Times New Roman"/>
-          <w:color w:val="0A2540"/>
+          <w:color w:val="0D3B66"/>
         </w:rPr>
         <w:t>7 Scope of the Project</w:t>
       </w:r>
@@ -2446,7 +2567,7 @@
         <w:spacing w:after="100" w:line="276" w:lineRule="auto"/>
       </w:pPr>
       <w:r>
-        <w:t>The scope of the system encompasses preliminary Stage-0 and Stage-1 construction site feasibility screening across the entire geographic territory of the Republic of India. The platform analyzes building categories ranging from residential houses to high-rise commercial structures and municipal bridges.</w:t>
+        <w:t>The scope of the platform encompasses preliminary Stage-0 and Stage-1 construction site feasibility screening across the entire geographic territory of the Republic of India. The platform analyzes building categories ranging from residential houses to high-rise commercial structures and municipal bridges.</w:t>
       </w:r>
     </w:p>
     <w:p>
@@ -2456,7 +2577,7 @@
       <w:r>
         <w:rPr>
           <w:b/>
-          <w:color w:val="1E3A8A"/>
+          <w:color w:val="2563EB"/>
           <w:sz w:val="22"/>
         </w:rPr>
         <w:t>7.1 Target Users and Stakeholders</w:t>
@@ -2482,7 +2603,7 @@
       <w:r>
         <w:rPr>
           <w:rFonts w:ascii="Times New Roman" w:hAnsi="Times New Roman"/>
-          <w:color w:val="0A2540"/>
+          <w:color w:val="0D3B66"/>
         </w:rPr>
         <w:t>8 Significance and Industrial Relevance</w:t>
       </w:r>
@@ -2492,7 +2613,7 @@
         <w:spacing w:after="100" w:line="276" w:lineRule="auto"/>
       </w:pPr>
       <w:r>
-        <w:t>The industrial significance of the system lies in transforming a traditionally manual, high-latency consulting workflow into an instantaneous, objective, and data-driven software service. By identifying critical failure modes—such as expansive black cotton soil shrink-swell, coastal floodwater inundation, high seismic acceleration, or eco-sensitive sanctuary encroachment—at Stage-0, the platform prevents multimillion-rupee project abandonments, litigation, and structural disasters.</w:t>
+        <w:t>The industrial significance of the platform lies in transforming a traditionally manual, high-latency consulting workflow into an instantaneous, objective, and data-driven software service. By identifying critical failure modes—such as expansive black cotton soil shrink-swell, coastal floodwater inundation, high seismic acceleration, or eco-sensitive sanctuary encroachment—at Stage-0, the platform prevents multimillion-rupee project abandonments, litigation, and structural disasters.</w:t>
       </w:r>
     </w:p>
     <w:p>
@@ -2503,7 +2624,7 @@
       <w:r>
         <w:rPr>
           <w:rFonts w:ascii="Times New Roman" w:hAnsi="Times New Roman"/>
-          <w:color w:val="0A2540"/>
+          <w:color w:val="0D3B66"/>
         </w:rPr>
         <w:t>9 Existing Site Screening System</w:t>
       </w:r>
@@ -2532,7 +2653,7 @@
       <w:r>
         <w:rPr>
           <w:rFonts w:ascii="Times New Roman" w:hAnsi="Times New Roman"/>
-          <w:color w:val="0A2540"/>
+          <w:color w:val="0D3B66"/>
         </w:rPr>
         <w:t>10 Limitations of the Existing System</w:t>
       </w:r>
@@ -2561,9 +2682,9 @@
       <w:r>
         <w:rPr>
           <w:rFonts w:ascii="Times New Roman" w:hAnsi="Times New Roman"/>
-          <w:color w:val="0A2540"/>
+          <w:color w:val="0D3B66"/>
         </w:rPr>
-        <w:t>11 Proposed the system System</w:t>
+        <w:t>11 Proposed Platform Architecture and Methodology</w:t>
       </w:r>
     </w:p>
     <w:p>
@@ -2571,7 +2692,7 @@
         <w:spacing w:after="100" w:line="276" w:lineRule="auto"/>
       </w:pPr>
       <w:r>
-        <w:t>The proposed the system platform integrates satellite remote sensing, machine learning predictive modeling, statutory Indian Standards rules engines, academic EIA matrices, and WebGL physics simulation into a cohesive, web-based platform. Users select coordinates via an interactive map, and the system executes real-time data ingestion, algorithmic inference, multi-criteria spatial overlay, and 3D simulation rendering in under 3 seconds.</w:t>
+        <w:t>The proposed the platform platform integrates satellite remote sensing, machine learning predictive modeling, statutory Indian Standards rules engines, academic EIA matrices, and WebGL physics simulation into a cohesive, web-based platform. Users select coordinates via an interactive map, and the system executes real-time data ingestion, algorithmic inference, multi-criteria spatial overlay, and 3D simulation rendering in under 3 seconds.</w:t>
       </w:r>
     </w:p>
     <w:p>
@@ -2582,7 +2703,7 @@
       <w:r>
         <w:rPr>
           <w:rFonts w:ascii="Times New Roman" w:hAnsi="Times New Roman"/>
-          <w:color w:val="0A2540"/>
+          <w:color w:val="0D3B66"/>
         </w:rPr>
         <w:t>12 System Architecture &amp; End-to-End Pipeline</w:t>
       </w:r>
@@ -2592,7 +2713,7 @@
         <w:spacing w:after="100" w:line="276" w:lineRule="auto"/>
       </w:pPr>
       <w:r>
-        <w:t>The the system system architecture follows a decoupled, modular microservices-oriented design:</w:t>
+        <w:t>The system architecture follows a decoupled, modular microservices-oriented design:</w:t>
         <w:br/>
         <w:t>1. Client Layer: Single Page Application (SPA) built with HTML5, CSS3 Glassmorphism design system, Vanilla JavaScript ES6+, Leaflet GIS, and Three.js WebGL.</w:t>
         <w:br/>
@@ -2615,7 +2736,7 @@
       <w:r>
         <w:rPr>
           <w:rFonts w:ascii="Times New Roman" w:hAnsi="Times New Roman"/>
-          <w:color w:val="0A2540"/>
+          <w:color w:val="0D3B66"/>
         </w:rPr>
         <w:t>13 System Modules Breakdown</w:t>
       </w:r>
@@ -2646,7 +2767,7 @@
       <w:r>
         <w:rPr>
           <w:rFonts w:ascii="Times New Roman" w:hAnsi="Times New Roman"/>
-          <w:color w:val="0A2540"/>
+          <w:color w:val="0D3B66"/>
         </w:rPr>
         <w:t>14 Core Geospatial Data Ingestion Module</w:t>
       </w:r>
@@ -2677,7 +2798,7 @@
       <w:r>
         <w:rPr>
           <w:rFonts w:ascii="Times New Roman" w:hAnsi="Times New Roman"/>
-          <w:color w:val="0A2540"/>
+          <w:color w:val="0D3B66"/>
         </w:rPr>
         <w:t>15 Machine Learning Prediction Engine</w:t>
       </w:r>
@@ -2712,7 +2833,7 @@
       <w:r>
         <w:rPr>
           <w:rFonts w:ascii="Times New Roman" w:hAnsi="Times New Roman"/>
-          <w:color w:val="0A2540"/>
+          <w:color w:val="0D3B66"/>
         </w:rPr>
         <w:t>16 Academic EIA 5-Method Evaluation Module</w:t>
       </w:r>
@@ -2722,7 +2843,7 @@
         <w:spacing w:after="100" w:line="276" w:lineRule="auto"/>
       </w:pPr>
       <w:r>
-        <w:t>the system implements all five standard EIA methodologies with complete mathematical transparency:</w:t>
+        <w:t>the platform implements all five standard EIA methodologies with complete mathematical transparency:</w:t>
         <w:br/>
         <w:t>1. Checklist Method: Evaluates 5 statutory parameters weighted per Indian Standards:</w:t>
         <w:br/>
@@ -2761,7 +2882,7 @@
       <w:r>
         <w:rPr>
           <w:rFonts w:ascii="Times New Roman" w:hAnsi="Times New Roman"/>
-          <w:color w:val="0A2540"/>
+          <w:color w:val="0D3B66"/>
         </w:rPr>
         <w:t>17 3D Visual &amp; Hazard Physical Simulation Module</w:t>
       </w:r>
@@ -2790,7 +2911,7 @@
       <w:r>
         <w:rPr>
           <w:rFonts w:ascii="Times New Roman" w:hAnsi="Times New Roman"/>
-          <w:color w:val="0A2540"/>
+          <w:color w:val="0D3B66"/>
         </w:rPr>
         <w:t>18 Technology Stack Overview</w:t>
       </w:r>
@@ -2821,7 +2942,7 @@
       <w:r>
         <w:rPr>
           <w:rFonts w:ascii="Times New Roman" w:hAnsi="Times New Roman"/>
-          <w:color w:val="0A2540"/>
+          <w:color w:val="0D3B66"/>
         </w:rPr>
         <w:t>19 Frontend Technologies &amp; Visual System</w:t>
       </w:r>
@@ -2833,7 +2954,7 @@
       <w:r>
         <w:rPr>
           <w:b/>
-          <w:color w:val="1E3A8A"/>
+          <w:color w:val="2563EB"/>
           <w:sz w:val="22"/>
         </w:rPr>
         <w:t>19.1 HTML5 &amp; Vanilla CSS Modular Design System</w:t>
@@ -2850,7 +2971,7 @@
       <w:r>
         <w:rPr>
           <w:b/>
-          <w:color w:val="1E3A8A"/>
+          <w:color w:val="2563EB"/>
           <w:sz w:val="22"/>
         </w:rPr>
         <w:t>19.2 JavaScript ES6+ Reactive Client Engine</w:t>
@@ -2867,7 +2988,7 @@
       <w:r>
         <w:rPr>
           <w:b/>
-          <w:color w:val="1E3A8A"/>
+          <w:color w:val="2563EB"/>
           <w:sz w:val="22"/>
         </w:rPr>
         <w:t>19.3 Leaflet GIS &amp; Satellite Tile Layers</w:t>
@@ -2884,7 +3005,7 @@
       <w:r>
         <w:rPr>
           <w:b/>
-          <w:color w:val="1E3A8A"/>
+          <w:color w:val="2563EB"/>
           <w:sz w:val="22"/>
         </w:rPr>
         <w:t>19.4 Three.js WebGL 3D Simulation Engine</w:t>
@@ -2902,7 +3023,7 @@
       <w:r>
         <w:rPr>
           <w:rFonts w:ascii="Times New Roman" w:hAnsi="Times New Roman"/>
-          <w:color w:val="0A2540"/>
+          <w:color w:val="0D3B66"/>
         </w:rPr>
         <w:t>20 Backend Technologies &amp; ML Services</w:t>
       </w:r>
@@ -2914,7 +3035,7 @@
       <w:r>
         <w:rPr>
           <w:b/>
-          <w:color w:val="1E3A8A"/>
+          <w:color w:val="2563EB"/>
           <w:sz w:val="22"/>
         </w:rPr>
         <w:t>20.1 Python 3.11 Execution Environment</w:t>
@@ -2931,7 +3052,7 @@
       <w:r>
         <w:rPr>
           <w:b/>
-          <w:color w:val="1E3A8A"/>
+          <w:color w:val="2563EB"/>
           <w:sz w:val="22"/>
         </w:rPr>
         <w:t>20.2 Flask WSGI RESTful Framework</w:t>
@@ -2948,7 +3069,7 @@
       <w:r>
         <w:rPr>
           <w:b/>
-          <w:color w:val="1E3A8A"/>
+          <w:color w:val="2563EB"/>
           <w:sz w:val="22"/>
         </w:rPr>
         <w:t>20.3 Gunicorn Production Web Server</w:t>
@@ -2965,7 +3086,7 @@
       <w:r>
         <w:rPr>
           <w:b/>
-          <w:color w:val="1E3A8A"/>
+          <w:color w:val="2563EB"/>
           <w:sz w:val="22"/>
         </w:rPr>
         <w:t>20.4 JWT Authentication &amp; Security Middleware</w:t>
@@ -2983,7 +3104,7 @@
       <w:r>
         <w:rPr>
           <w:rFonts w:ascii="Times New Roman" w:hAnsi="Times New Roman"/>
-          <w:color w:val="0A2540"/>
+          <w:color w:val="0D3B66"/>
         </w:rPr>
         <w:t>21 Database &amp; Feature Store Design</w:t>
       </w:r>
@@ -3008,7 +3129,7 @@
       <w:r>
         <w:rPr>
           <w:rFonts w:ascii="Times New Roman" w:hAnsi="Times New Roman"/>
-          <w:color w:val="0A2540"/>
+          <w:color w:val="0D3B66"/>
         </w:rPr>
         <w:t>22 Detailed Database Schema &amp; Metadata Dictionary</w:t>
       </w:r>
@@ -3035,7 +3156,7 @@
       <w:r>
         <w:rPr>
           <w:rFonts w:ascii="Times New Roman" w:hAnsi="Times New Roman"/>
-          <w:color w:val="0A2540"/>
+          <w:color w:val="0D3B66"/>
         </w:rPr>
         <w:t>23 Data Flow &amp; Geospatial ETL Pipeline</w:t>
       </w:r>
@@ -3068,7 +3189,7 @@
       <w:r>
         <w:rPr>
           <w:rFonts w:ascii="Times New Roman" w:hAnsi="Times New Roman"/>
-          <w:color w:val="0A2540"/>
+          <w:color w:val="0D3B66"/>
         </w:rPr>
         <w:t>24 RESTful API Endpoint Reference</w:t>
       </w:r>
@@ -3099,7 +3220,7 @@
       <w:r>
         <w:rPr>
           <w:rFonts w:ascii="Times New Roman" w:hAnsi="Times New Roman"/>
-          <w:color w:val="0A2540"/>
+          <w:color w:val="0D3B66"/>
         </w:rPr>
         <w:t>25 Indian Engineering Standards Compliance (IS Codes)</w:t>
       </w:r>
@@ -3109,7 +3230,7 @@
         <w:spacing w:after="100" w:line="276" w:lineRule="auto"/>
       </w:pPr>
       <w:r>
-        <w:t>the system embeds strict compliance rules derived from official Bureau of Indian Standards (BIS) and MoEFCC codes:</w:t>
+        <w:t>the platform embeds strict compliance rules derived from official Bureau of Indian Standards (BIS) and MoEFCC codes:</w:t>
         <w:br/>
         <w:t>• IS 1904:1986 / 2021: Code of practice for design and construction of foundations in soils (Safe Bearing Capacity thresholds: &gt;=100 kN/m² for footings, &lt;60 kN/m² for raft/piles).</w:t>
         <w:br/>
@@ -3132,7 +3253,7 @@
       <w:r>
         <w:rPr>
           <w:rFonts w:ascii="Times New Roman" w:hAnsi="Times New Roman"/>
-          <w:color w:val="0A2540"/>
+          <w:color w:val="0D3B66"/>
         </w:rPr>
         <w:t>26 Mathematical Consistency &amp; Normalization Logic</w:t>
       </w:r>
@@ -3161,7 +3282,7 @@
       <w:r>
         <w:rPr>
           <w:rFonts w:ascii="Times New Roman" w:hAnsi="Times New Roman"/>
-          <w:color w:val="0A2540"/>
+          <w:color w:val="0D3B66"/>
         </w:rPr>
         <w:t>27 Authentication, Security &amp; Rate Limiting</w:t>
       </w:r>
@@ -3173,7 +3294,7 @@
       <w:r>
         <w:rPr>
           <w:b/>
-          <w:color w:val="1E3A8A"/>
+          <w:color w:val="2563EB"/>
           <w:sz w:val="22"/>
         </w:rPr>
         <w:t>27.1 Security Best Practices &amp; Data Validation</w:t>
@@ -3197,7 +3318,7 @@
       <w:r>
         <w:rPr>
           <w:rFonts w:ascii="Times New Roman" w:hAnsi="Times New Roman"/>
-          <w:color w:val="0A2540"/>
+          <w:color w:val="0D3B66"/>
         </w:rPr>
         <w:t>28 Functional Requirements Specification</w:t>
       </w:r>
@@ -3230,7 +3351,7 @@
       <w:r>
         <w:rPr>
           <w:rFonts w:ascii="Times New Roman" w:hAnsi="Times New Roman"/>
-          <w:color w:val="0A2540"/>
+          <w:color w:val="0D3B66"/>
         </w:rPr>
         <w:t>29 Non-Functional Requirements Specification</w:t>
       </w:r>
@@ -3242,7 +3363,7 @@
       <w:r>
         <w:rPr>
           <w:b/>
-          <w:color w:val="1E3A8A"/>
+          <w:color w:val="2563EB"/>
           <w:sz w:val="22"/>
         </w:rPr>
         <w:t>29.1 Usability &amp; Accessibility: Clean, high-contrast dark-mode interface with responsive design across desktop and mobile.</w:t>
@@ -3268,7 +3389,7 @@
       <w:r>
         <w:rPr>
           <w:rFonts w:ascii="Times New Roman" w:hAnsi="Times New Roman"/>
-          <w:color w:val="0A2540"/>
+          <w:color w:val="0D3B66"/>
         </w:rPr>
         <w:t>30 Hardware Requirements</w:t>
       </w:r>
@@ -3291,7 +3412,7 @@
       <w:r>
         <w:rPr>
           <w:rFonts w:ascii="Times New Roman" w:hAnsi="Times New Roman"/>
-          <w:color w:val="0A2540"/>
+          <w:color w:val="0D3B66"/>
         </w:rPr>
         <w:t>31 Software &amp; Dependency Requirements</w:t>
       </w:r>
@@ -3318,7 +3439,7 @@
       <w:r>
         <w:rPr>
           <w:rFonts w:ascii="Times New Roman" w:hAnsi="Times New Roman"/>
-          <w:color w:val="0A2540"/>
+          <w:color w:val="0D3B66"/>
         </w:rPr>
         <w:t>32 Feasibility Analysis</w:t>
       </w:r>
@@ -3330,7 +3451,7 @@
       <w:r>
         <w:rPr>
           <w:b/>
-          <w:color w:val="1E3A8A"/>
+          <w:color w:val="2563EB"/>
           <w:sz w:val="22"/>
         </w:rPr>
         <w:t>32.1 Technical Feasibility: The integration of established open APIs, open-source machine learning frameworks, and modern WebGL standards confirms robust technical feasibility without proprietary licensing constraints.</w:t>
@@ -3350,7 +3471,7 @@
       <w:r>
         <w:rPr>
           <w:rFonts w:ascii="Times New Roman" w:hAnsi="Times New Roman"/>
-          <w:color w:val="0A2540"/>
+          <w:color w:val="0D3B66"/>
         </w:rPr>
         <w:t>33 Implementation &amp; Development Approach</w:t>
       </w:r>
@@ -3362,7 +3483,7 @@
       <w:r>
         <w:rPr>
           <w:b/>
-          <w:color w:val="1E3A8A"/>
+          <w:color w:val="2563EB"/>
           <w:sz w:val="22"/>
         </w:rPr>
         <w:t>33.1 Iterative Agile Engineering Pipeline</w:t>
@@ -3392,7 +3513,7 @@
       <w:r>
         <w:rPr>
           <w:rFonts w:ascii="Times New Roman" w:hAnsi="Times New Roman"/>
-          <w:color w:val="0A2540"/>
+          <w:color w:val="0D3B66"/>
         </w:rPr>
         <w:t>34 User Interface, Dashboard &amp; Visual Results</w:t>
       </w:r>
@@ -3402,7 +3523,7 @@
         <w:spacing w:after="100" w:line="276" w:lineRule="auto"/>
       </w:pPr>
       <w:r>
-        <w:t>The the system dashboard features a multi-tiered layout:</w:t>
+        <w:t>The system dashboard features a multi-tiered layout:</w:t>
         <w:br/>
         <w:t>• Top Navigation: Branding, Hackathon Award Badge, Status Indicators, and Navigation Tabs.</w:t>
         <w:br/>
@@ -3421,7 +3542,7 @@
       <w:r>
         <w:rPr>
           <w:rFonts w:ascii="Times New Roman" w:hAnsi="Times New Roman"/>
-          <w:color w:val="0A2540"/>
+          <w:color w:val="0D3B66"/>
         </w:rPr>
         <w:t>35 EIA Evaluation Results &amp; Reporting</w:t>
       </w:r>
@@ -3448,7 +3569,7 @@
       <w:r>
         <w:rPr>
           <w:rFonts w:ascii="Times New Roman" w:hAnsi="Times New Roman"/>
-          <w:color w:val="0A2540"/>
+          <w:color w:val="0D3B66"/>
         </w:rPr>
         <w:t>36 Web Application Flow — Map Geocoding &amp; Input Handling</w:t>
       </w:r>
@@ -3460,7 +3581,7 @@
       <w:r>
         <w:rPr>
           <w:b/>
-          <w:color w:val="1E3A8A"/>
+          <w:color w:val="2563EB"/>
           <w:sz w:val="22"/>
         </w:rPr>
         <w:t>1. User enters a location name in the geocoding search bar or clicks on the interactive Leaflet map.</w:t>
@@ -3482,7 +3603,7 @@
       <w:r>
         <w:rPr>
           <w:rFonts w:ascii="Times New Roman" w:hAnsi="Times New Roman"/>
-          <w:color w:val="0A2540"/>
+          <w:color w:val="0D3B66"/>
         </w:rPr>
         <w:t>37 Web Application Flow — Analysis, Reports &amp; PDF Dossier</w:t>
       </w:r>
@@ -3494,7 +3615,7 @@
       <w:r>
         <w:rPr>
           <w:b/>
-          <w:color w:val="1E3A8A"/>
+          <w:color w:val="2563EB"/>
           <w:sz w:val="22"/>
         </w:rPr>
         <w:t>1. Client displays an animated skeleton loading state during computation.</w:t>
@@ -3516,7 +3637,7 @@
       <w:r>
         <w:rPr>
           <w:rFonts w:ascii="Times New Roman" w:hAnsi="Times New Roman"/>
-          <w:color w:val="0A2540"/>
+          <w:color w:val="0D3B66"/>
         </w:rPr>
         <w:t>38 3D Simulation Flow — Interactive Physical Hazard Testing</w:t>
       </w:r>
@@ -3528,7 +3649,7 @@
       <w:r>
         <w:rPr>
           <w:b/>
-          <w:color w:val="1E3A8A"/>
+          <w:color w:val="2563EB"/>
           <w:sz w:val="22"/>
         </w:rPr>
         <w:t>1. User navigates to `/visualization` or clicks '🎮 Launch 3D Simulation'.</w:t>
@@ -3556,7 +3677,7 @@
       <w:r>
         <w:rPr>
           <w:rFonts w:ascii="Times New Roman" w:hAnsi="Times New Roman"/>
-          <w:color w:val="0A2540"/>
+          <w:color w:val="0D3B66"/>
         </w:rPr>
         <w:t>39 Verification &amp; Validation Case Studies</w:t>
       </w:r>
@@ -3601,7 +3722,7 @@
       <w:r>
         <w:rPr>
           <w:rFonts w:ascii="Times New Roman" w:hAnsi="Times New Roman"/>
-          <w:color w:val="0A2540"/>
+          <w:color w:val="0D3B66"/>
         </w:rPr>
         <w:t>40 Testing &amp; Verification Test Suite</w:t>
       </w:r>
@@ -3630,7 +3751,7 @@
       <w:r>
         <w:rPr>
           <w:rFonts w:ascii="Times New Roman" w:hAnsi="Times New Roman"/>
-          <w:color w:val="0A2540"/>
+          <w:color w:val="0D3B66"/>
         </w:rPr>
         <w:t>41 Detailed Experimental Results &amp; Metrics</w:t>
       </w:r>
@@ -3652,7 +3773,7 @@
         <w:br/>
         <w:t>• Model 5 (Extra Trees Regressor): R² = 0.8910, MAE = 2.25 pts</w:t>
         <w:br/>
-        <w:t>• Model 6 (the system Stacking Ensemble): R² = 0.9123, MAE = ±1.99 pts (Top Performer)</w:t>
+        <w:t>• Model 6 (the platform Stacking Ensemble): R² = 0.9123, MAE = ±1.99 pts (Top Performer)</w:t>
       </w:r>
     </w:p>
     <w:p>
@@ -3663,7 +3784,7 @@
       <w:r>
         <w:rPr>
           <w:rFonts w:ascii="Times New Roman" w:hAnsi="Times New Roman"/>
-          <w:color w:val="0A2540"/>
+          <w:color w:val="0D3B66"/>
         </w:rPr>
         <w:t>42 Result Analysis &amp; SHAP Feature Attribution Insights</w:t>
       </w:r>
@@ -3690,7 +3811,7 @@
       <w:r>
         <w:rPr>
           <w:rFonts w:ascii="Times New Roman" w:hAnsi="Times New Roman"/>
-          <w:color w:val="0A2540"/>
+          <w:color w:val="0D3B66"/>
         </w:rPr>
         <w:t>43 Advantages, Limitations and Future Scope</w:t>
       </w:r>
@@ -3702,7 +3823,7 @@
       <w:r>
         <w:rPr>
           <w:b/>
-          <w:color w:val="1E3A8A"/>
+          <w:color w:val="2563EB"/>
           <w:sz w:val="22"/>
         </w:rPr>
         <w:t>43.1 Advantages</w:t>
@@ -3729,7 +3850,7 @@
       <w:r>
         <w:rPr>
           <w:b/>
-          <w:color w:val="1E3A8A"/>
+          <w:color w:val="2563EB"/>
           <w:sz w:val="22"/>
         </w:rPr>
         <w:t>43.2 Limitations</w:t>
@@ -3748,7 +3869,7 @@
       <w:r>
         <w:rPr>
           <w:b/>
-          <w:color w:val="1E3A8A"/>
+          <w:color w:val="2563EB"/>
           <w:sz w:val="22"/>
         </w:rPr>
         <w:t>43.3 Future Scope</w:t>
@@ -3770,7 +3891,7 @@
       <w:r>
         <w:rPr>
           <w:rFonts w:ascii="Times New Roman" w:hAnsi="Times New Roman"/>
-          <w:color w:val="0A2540"/>
+          <w:color w:val="0D3B66"/>
         </w:rPr>
         <w:t>44 Development Methodology, Hackathon Journey &amp; Timeline</w:t>
       </w:r>
@@ -3801,7 +3922,7 @@
       <w:r>
         <w:rPr>
           <w:rFonts w:ascii="Times New Roman" w:hAnsi="Times New Roman"/>
-          <w:color w:val="0A2540"/>
+          <w:color w:val="0D3B66"/>
         </w:rPr>
         <w:t>45 Risk Analysis and Mitigation Strategy</w:t>
       </w:r>
@@ -3826,7 +3947,7 @@
       <w:r>
         <w:rPr>
           <w:rFonts w:ascii="Times New Roman" w:hAnsi="Times New Roman"/>
-          <w:color w:val="0A2540"/>
+          <w:color w:val="0D3B66"/>
         </w:rPr>
         <w:t>46 References &amp; Statutory Standards</w:t>
       </w:r>
@@ -3838,7 +3959,7 @@
       <w:r>
         <w:rPr>
           <w:b/>
-          <w:color w:val="1E3A8A"/>
+          <w:color w:val="2563EB"/>
           <w:sz w:val="22"/>
         </w:rPr>
         <w:t>1. Bureau of Indian Standards (BIS). IS 1904:1986 (Reaffirmed 2021) — Code of Practice for Design and Construction of Foundations in Soils.</w:t>
@@ -3872,7 +3993,7 @@
       <w:r>
         <w:rPr>
           <w:rFonts w:ascii="Times New Roman" w:hAnsi="Times New Roman"/>
-          <w:color w:val="0A2540"/>
+          <w:color w:val="0D3B66"/>
         </w:rPr>
         <w:t>47 Feedback and Conclusion</w:t>
       </w:r>
@@ -3884,7 +4005,7 @@
       <w:r>
         <w:rPr>
           <w:b/>
-          <w:color w:val="1E3A8A"/>
+          <w:color w:val="2563EB"/>
           <w:sz w:val="22"/>
         </w:rPr>
         <w:t>47.1 Feedback</w:t>
@@ -3911,7 +4032,7 @@
       <w:r>
         <w:rPr>
           <w:b/>
-          <w:color w:val="1E3A8A"/>
+          <w:color w:val="2563EB"/>
           <w:sz w:val="22"/>
         </w:rPr>
         <w:t>47.2 Conclusion</w:t>
@@ -3929,7 +4050,7 @@
       <w:r>
         <w:rPr>
           <w:rFonts w:ascii="Times New Roman" w:hAnsi="Times New Roman"/>
-          <w:color w:val="0A2540"/>
+          <w:color w:val="0D3B66"/>
         </w:rPr>
         <w:t>48 Sample API Request and Response</w:t>
       </w:r>
@@ -4040,7 +4161,7 @@
       <w:r>
         <w:rPr>
           <w:rFonts w:ascii="Times New Roman" w:hAnsi="Times New Roman"/>
-          <w:color w:val="0A2540"/>
+          <w:color w:val="0D3B66"/>
         </w:rPr>
         <w:t>49 Glossary of Terms</w:t>
       </w:r>
@@ -4073,7 +4194,7 @@
       </w:pPr>
       <w:r>
         <w:rPr>
-          <w:color w:val="0A2540"/>
+          <w:color w:val="0D3B66"/>
         </w:rPr>
         <w:t>50 Certificate of Completion / Project Certificates</w:t>
       </w:r>
@@ -4142,7 +4263,7 @@
       </w:pPr>
       <w:r>
         <w:rPr>
-          <w:color w:val="0A2540"/>
+          <w:color w:val="0D3B66"/>
         </w:rPr>
         <w:t>51 Project Photographs</w:t>
       </w:r>
@@ -4264,7 +4385,7 @@
       </w:pPr>
       <w:r>
         <w:rPr>
-          <w:color w:val="0A2540"/>
+          <w:color w:val="0D3B66"/>
         </w:rPr>
         <w:t>52 GEOTAGGED PHOTOGRAPHS</w:t>
       </w:r>
@@ -4733,7 +4854,7 @@
     <w:rPr>
       <w:rFonts w:ascii="Times New Roman" w:hAnsi="Times New Roman"/>
       <w:b/>
-      <w:color w:val="0A2540"/>
+      <w:color w:val="0D3B66"/>
       <w:sz w:val="17"/>
     </w:rPr>
   </w:style>

</xml_diff>

<commit_message>
feat(report): include Vishali S certificate in Section 50 of PDF and DOCX reports
</commit_message>
<xml_diff>
--- a/TERRA_AI_PROJECT_REPORT.docx
+++ b/TERRA_AI_PROJECT_REPORT.docx
@@ -4204,18 +4204,19 @@
         <w:rPr>
           <w:b/>
         </w:rPr>
-        <w:t>Figure 1: TNWISE 2026 Special Mention Award Certificate</w:t>
+        <w:t>Figure 1A: TNWISE 2026 Special Mention Award Certificate – Vaira Selvi S</w:t>
         <w:br/>
       </w:r>
       <w:r>
-        <w:t>Description: Official Certificate of Appreciation awarded to Vaira Selvi S &amp; Team from Kamaraj College of Engineering and Technology for achieving the Special Mention Award in TANCAM's Hackathon for Tamil Nadu Women in Science and Engineering (TNWISE 2026).</w:t>
+        <w:t>Description: Official Certificate of Appreciation awarded to team lead Vaira Selvi S from Kamaraj College of Engineering and Technology for achieving the Special Mention Award in TANCAM's Hackathon (TNWISE 2026).</w:t>
+        <w:br/>
       </w:r>
     </w:p>
     <w:p>
       <w:r>
         <w:drawing>
           <wp:inline xmlns:a="http://schemas.openxmlformats.org/drawingml/2006/main" xmlns:pic="http://schemas.openxmlformats.org/drawingml/2006/picture">
-            <wp:extent cx="5303520" cy="3631983"/>
+            <wp:extent cx="5120640" cy="3506742"/>
             <wp:docPr id="1" name="Picture 1"/>
             <wp:cNvGraphicFramePr>
               <a:graphicFrameLocks noChangeAspect="1"/>
@@ -4236,7 +4237,61 @@
                   <pic:spPr>
                     <a:xfrm>
                       <a:off x="0" y="0"/>
-                      <a:ext cx="5303520" cy="3631983"/>
+                      <a:ext cx="5120640" cy="3506742"/>
+                    </a:xfrm>
+                    <a:prstGeom prst="rect"/>
+                  </pic:spPr>
+                </pic:pic>
+              </a:graphicData>
+            </a:graphic>
+          </wp:inline>
+        </w:drawing>
+      </w:r>
+    </w:p>
+    <w:p>
+      <w:pPr>
+        <w:spacing w:after="160"/>
+      </w:pPr>
+    </w:p>
+    <w:p>
+      <w:r>
+        <w:rPr>
+          <w:b/>
+        </w:rPr>
+        <w:t>Figure 1B: TNWISE 2026 Special Mention Award Certificate – Vishali S</w:t>
+        <w:br/>
+      </w:r>
+      <w:r>
+        <w:t>Description: Official Certificate of Appreciation awarded to team member Vishali S from Kamaraj College of Engineering and Technology for achieving the Special Mention Award in TANCAM's Hackathon (TNWISE 2026).</w:t>
+        <w:br/>
+      </w:r>
+    </w:p>
+    <w:p>
+      <w:r>
+        <w:drawing>
+          <wp:inline xmlns:a="http://schemas.openxmlformats.org/drawingml/2006/main" xmlns:pic="http://schemas.openxmlformats.org/drawingml/2006/picture">
+            <wp:extent cx="5120640" cy="3611577"/>
+            <wp:docPr id="2" name="Picture 2"/>
+            <wp:cNvGraphicFramePr>
+              <a:graphicFrameLocks noChangeAspect="1"/>
+            </wp:cNvGraphicFramePr>
+            <a:graphic>
+              <a:graphicData uri="http://schemas.openxmlformats.org/drawingml/2006/picture">
+                <pic:pic>
+                  <pic:nvPicPr>
+                    <pic:cNvPr id="0" name="vishali_certificate.jpg"/>
+                    <pic:cNvPicPr/>
+                  </pic:nvPicPr>
+                  <pic:blipFill>
+                    <a:blip r:embed="rId11"/>
+                    <a:stretch>
+                      <a:fillRect/>
+                    </a:stretch>
+                  </pic:blipFill>
+                  <pic:spPr>
+                    <a:xfrm>
+                      <a:off x="0" y="0"/>
+                      <a:ext cx="5120640" cy="3611577"/>
                     </a:xfrm>
                     <a:prstGeom prst="rect"/>
                   </pic:spPr>
@@ -4285,7 +4340,7 @@
         <w:drawing>
           <wp:inline xmlns:a="http://schemas.openxmlformats.org/drawingml/2006/main" xmlns:pic="http://schemas.openxmlformats.org/drawingml/2006/picture">
             <wp:extent cx="5120640" cy="7675047"/>
-            <wp:docPr id="2" name="Picture 2"/>
+            <wp:docPr id="3" name="Picture 3"/>
             <wp:cNvGraphicFramePr>
               <a:graphicFrameLocks noChangeAspect="1"/>
             </wp:cNvGraphicFramePr>
@@ -4297,7 +4352,7 @@
                     <pic:cNvPicPr/>
                   </pic:nvPicPr>
                   <pic:blipFill>
-                    <a:blip r:embed="rId11"/>
+                    <a:blip r:embed="rId12"/>
                     <a:stretch>
                       <a:fillRect/>
                     </a:stretch>
@@ -4338,7 +4393,7 @@
         <w:drawing>
           <wp:inline xmlns:a="http://schemas.openxmlformats.org/drawingml/2006/main" xmlns:pic="http://schemas.openxmlformats.org/drawingml/2006/picture">
             <wp:extent cx="5120640" cy="6323057"/>
-            <wp:docPr id="3" name="Picture 3"/>
+            <wp:docPr id="4" name="Picture 4"/>
             <wp:cNvGraphicFramePr>
               <a:graphicFrameLocks noChangeAspect="1"/>
             </wp:cNvGraphicFramePr>
@@ -4350,7 +4405,7 @@
                     <pic:cNvPicPr/>
                   </pic:nvPicPr>
                   <pic:blipFill>
-                    <a:blip r:embed="rId12"/>
+                    <a:blip r:embed="rId13"/>
                     <a:stretch>
                       <a:fillRect/>
                     </a:stretch>
@@ -4407,7 +4462,7 @@
         <w:drawing>
           <wp:inline xmlns:a="http://schemas.openxmlformats.org/drawingml/2006/main" xmlns:pic="http://schemas.openxmlformats.org/drawingml/2006/picture">
             <wp:extent cx="5303520" cy="3960857"/>
-            <wp:docPr id="4" name="Picture 4"/>
+            <wp:docPr id="5" name="Picture 5"/>
             <wp:cNvGraphicFramePr>
               <a:graphicFrameLocks noChangeAspect="1"/>
             </wp:cNvGraphicFramePr>
@@ -4419,7 +4474,7 @@
                     <pic:cNvPicPr/>
                   </pic:nvPicPr>
                   <pic:blipFill>
-                    <a:blip r:embed="rId13"/>
+                    <a:blip r:embed="rId14"/>
                     <a:stretch>
                       <a:fillRect/>
                     </a:stretch>

</xml_diff>